<commit_message>
chore: remove temporary document file and update project metadata
</commit_message>
<xml_diff>
--- a/Task E Testing Document Template.docx
+++ b/Task E Testing Document Template.docx
@@ -1,6 +1,6 @@
 
 <file path=word/document.xml><?xml version="1.0" encoding="utf-8"?>
-<w:document xmlns:ve="http://schemas.openxmlformats.org/markup-compatibility/2006" xmlns:o="urn:schemas-microsoft-com:office:office" xmlns:r="http://schemas.openxmlformats.org/officeDocument/2006/relationships" xmlns:m="http://schemas.openxmlformats.org/officeDocument/2006/math" xmlns:v="urn:schemas-microsoft-com:vml" xmlns:wp="http://schemas.openxmlformats.org/drawingml/2006/wordprocessingDrawing" xmlns:w10="urn:schemas-microsoft-com:office:word" xmlns:w="http://schemas.openxmlformats.org/wordprocessingml/2006/main" xmlns:wne="http://schemas.microsoft.com/office/word/2006/wordml">
+<w:document xmlns:wpc="http://schemas.microsoft.com/office/word/2010/wordprocessingCanvas" xmlns:cx="http://schemas.microsoft.com/office/drawing/2014/chartex" xmlns:cx1="http://schemas.microsoft.com/office/drawing/2015/9/8/chartex" xmlns:cx2="http://schemas.microsoft.com/office/drawing/2015/10/21/chartex" xmlns:cx3="http://schemas.microsoft.com/office/drawing/2016/5/9/chartex" xmlns:cx4="http://schemas.microsoft.com/office/drawing/2016/5/10/chartex" xmlns:cx5="http://schemas.microsoft.com/office/drawing/2016/5/11/chartex" xmlns:cx6="http://schemas.microsoft.com/office/drawing/2016/5/12/chartex" xmlns:cx7="http://schemas.microsoft.com/office/drawing/2016/5/13/chartex" xmlns:cx8="http://schemas.microsoft.com/office/drawing/2016/5/14/chartex" xmlns:mc="http://schemas.openxmlformats.org/markup-compatibility/2006" xmlns:aink="http://schemas.microsoft.com/office/drawing/2016/ink" xmlns:am3d="http://schemas.microsoft.com/office/drawing/2017/model3d" xmlns:o="urn:schemas-microsoft-com:office:office" xmlns:oel="http://schemas.microsoft.com/office/2019/extlst" xmlns:r="http://schemas.openxmlformats.org/officeDocument/2006/relationships" xmlns:m="http://schemas.openxmlformats.org/officeDocument/2006/math" xmlns:v="urn:schemas-microsoft-com:vml" xmlns:wp14="http://schemas.microsoft.com/office/word/2010/wordprocessingDrawing" xmlns:wp="http://schemas.openxmlformats.org/drawingml/2006/wordprocessingDrawing" xmlns:w10="urn:schemas-microsoft-com:office:word" xmlns:w="http://schemas.openxmlformats.org/wordprocessingml/2006/main" xmlns:w14="http://schemas.microsoft.com/office/word/2010/wordml" xmlns:w15="http://schemas.microsoft.com/office/word/2012/wordml" xmlns:w16cex="http://schemas.microsoft.com/office/word/2018/wordml/cex" xmlns:w16cid="http://schemas.microsoft.com/office/word/2016/wordml/cid" xmlns:w16="http://schemas.microsoft.com/office/word/2018/wordml" xmlns:w16du="http://schemas.microsoft.com/office/word/2023/wordml/word16du" xmlns:w16sdtdh="http://schemas.microsoft.com/office/word/2020/wordml/sdtdatahash" xmlns:w16sdtfl="http://schemas.microsoft.com/office/word/2024/wordml/sdtformatlock" xmlns:w16se="http://schemas.microsoft.com/office/word/2015/wordml/symex" xmlns:wpg="http://schemas.microsoft.com/office/word/2010/wordprocessingGroup" xmlns:wpi="http://schemas.microsoft.com/office/word/2010/wordprocessingInk" xmlns:wne="http://schemas.microsoft.com/office/word/2006/wordml" xmlns:wps="http://schemas.microsoft.com/office/word/2010/wordprocessingShape" mc:Ignorable="w14 w15 w16se w16cid w16 w16cex w16sdtdh w16sdtfl w16du wp14">
   <w:body>
     <w:p>
       <w:pPr>
@@ -25,7 +25,7 @@
           <w:lang w:eastAsia="en-US"/>
         </w:rPr>
         <w:drawing>
-          <wp:inline distT="0" distB="0" distL="0" distR="0">
+          <wp:inline distT="0" distB="0" distL="0" distR="0" wp14:anchorId="1CEF9200" wp14:editId="2DC0DBE6">
             <wp:extent cx="5486400" cy="3657600"/>
             <wp:effectExtent l="0" t="0" r="0" b="0"/>
             <wp:docPr id="1" name="Picture 2"/>
@@ -42,7 +42,7 @@
                     </pic:cNvPicPr>
                   </pic:nvPicPr>
                   <pic:blipFill>
-                    <a:blip r:embed="rId12"/>
+                    <a:blip r:embed="rId11"/>
                     <a:stretch>
                       <a:fillRect/>
                     </a:stretch>
@@ -313,10 +313,7 @@
       </w:r>
       <w:bookmarkStart w:id="0" w:name="_Toc84508551"/>
       <w:r>
-        <w:t xml:space="preserve">Website </w:t>
-      </w:r>
-      <w:r>
-        <w:t>Testing</w:t>
+        <w:t>Website Testing</w:t>
       </w:r>
       <w:bookmarkEnd w:id="0"/>
     </w:p>
@@ -329,108 +326,6 @@
         <w:t>Functionality testing</w:t>
       </w:r>
       <w:bookmarkEnd w:id="1"/>
-    </w:p>
-    <w:p>
-      <w:pPr>
-        <w:pStyle w:val="RTOWorksBodyText"/>
-        <w:rPr>
-          <w:rFonts w:asciiTheme="minorHAnsi" w:hAnsiTheme="minorHAnsi" w:cstheme="minorBidi"/>
-          <w:iCs/>
-          <w:color w:val="5F5F5F" w:themeColor="text2" w:themeTint="BF"/>
-          <w:sz w:val="24"/>
-          <w:szCs w:val="24"/>
-          <w:lang w:val="en-US" w:eastAsia="ja-JP"/>
-        </w:rPr>
-      </w:pPr>
-      <w:r>
-        <w:rPr>
-          <w:rFonts w:asciiTheme="minorHAnsi" w:hAnsiTheme="minorHAnsi" w:cstheme="minorBidi"/>
-          <w:i/>
-          <w:iCs/>
-          <w:color w:val="5F5F5F" w:themeColor="text2" w:themeTint="BF"/>
-          <w:sz w:val="24"/>
-          <w:szCs w:val="24"/>
-          <w:lang w:val="en-US" w:eastAsia="ja-JP"/>
-        </w:rPr>
-        <w:t>Instruction: You are to test the website in order to:</w:t>
-      </w:r>
-    </w:p>
-    <w:p>
-      <w:pPr>
-        <w:pStyle w:val="RTOWorksBodyText"/>
-        <w:rPr>
-          <w:rFonts w:asciiTheme="minorHAnsi" w:hAnsiTheme="minorHAnsi" w:cstheme="minorBidi"/>
-          <w:iCs/>
-          <w:color w:val="5F5F5F" w:themeColor="text2" w:themeTint="BF"/>
-          <w:sz w:val="24"/>
-          <w:szCs w:val="24"/>
-          <w:lang w:val="en-US" w:eastAsia="ja-JP"/>
-        </w:rPr>
-      </w:pPr>
-      <w:r>
-        <w:rPr>
-          <w:rFonts w:asciiTheme="minorHAnsi" w:hAnsiTheme="minorHAnsi" w:cstheme="minorBidi"/>
-          <w:i/>
-          <w:iCs/>
-          <w:color w:val="5F5F5F" w:themeColor="text2" w:themeTint="BF"/>
-          <w:sz w:val="24"/>
-          <w:szCs w:val="24"/>
-          <w:lang w:val="en-US" w:eastAsia="ja-JP"/>
-        </w:rPr>
-        <w:t>Determine that the website performs all the required functionality</w:t>
-      </w:r>
-    </w:p>
-    <w:p>
-      <w:pPr>
-        <w:pStyle w:val="RTOWorksBodyText"/>
-        <w:rPr>
-          <w:rFonts w:asciiTheme="minorHAnsi" w:hAnsiTheme="minorHAnsi" w:cstheme="minorBidi"/>
-          <w:iCs/>
-          <w:color w:val="5F5F5F" w:themeColor="text2" w:themeTint="BF"/>
-          <w:sz w:val="24"/>
-          <w:szCs w:val="24"/>
-          <w:lang w:val="en-US" w:eastAsia="ja-JP"/>
-        </w:rPr>
-      </w:pPr>
-      <w:r>
-        <w:rPr>
-          <w:rFonts w:asciiTheme="minorHAnsi" w:hAnsiTheme="minorHAnsi" w:cstheme="minorBidi"/>
-          <w:i/>
-          <w:iCs/>
-          <w:color w:val="5F5F5F" w:themeColor="text2" w:themeTint="BF"/>
-          <w:sz w:val="24"/>
-          <w:szCs w:val="24"/>
-          <w:lang w:val="en-US" w:eastAsia="ja-JP"/>
-        </w:rPr>
-        <w:t>Check that the website is secure and bug free</w:t>
-      </w:r>
-    </w:p>
-    <w:p>
-      <w:pPr>
-        <w:pStyle w:val="RTOWorksBodyText"/>
-        <w:rPr>
-          <w:rFonts w:asciiTheme="minorHAnsi" w:hAnsiTheme="minorHAnsi" w:cstheme="minorBidi"/>
-          <w:iCs/>
-          <w:color w:val="5F5F5F" w:themeColor="text2" w:themeTint="BF"/>
-          <w:sz w:val="24"/>
-          <w:szCs w:val="24"/>
-          <w:lang w:val="en-US" w:eastAsia="ja-JP"/>
-        </w:rPr>
-      </w:pPr>
-    </w:p>
-    <w:p>
-      <w:pPr>
-        <w:pStyle w:val="RTOWorksBodyText"/>
-        <w:rPr>
-          <w:rFonts w:asciiTheme="minorHAnsi" w:hAnsiTheme="minorHAnsi" w:cstheme="minorBidi"/>
-          <w:i/>
-          <w:iCs/>
-          <w:color w:val="5F5F5F" w:themeColor="text2" w:themeTint="BF"/>
-          <w:sz w:val="24"/>
-          <w:szCs w:val="24"/>
-          <w:lang w:val="en-US" w:eastAsia="ja-JP"/>
-        </w:rPr>
-      </w:pPr>
     </w:p>
     <w:tbl>
       <w:tblPr>
@@ -443,33 +338,35 @@
           <w:bottom w:w="360" w:type="dxa"/>
           <w:right w:w="0" w:type="dxa"/>
         </w:tblCellMar>
-        <w:tblLook w:val="04A0"/>
+        <w:tblLook w:val="04A0" w:firstRow="1" w:lastRow="0" w:firstColumn="1" w:lastColumn="0" w:noHBand="0" w:noVBand="1"/>
       </w:tblPr>
       <w:tblGrid>
+        <w:gridCol w:w="4149"/>
         <w:gridCol w:w="4148"/>
-        <w:gridCol w:w="4149"/>
       </w:tblGrid>
       <w:tr>
         <w:trPr>
-          <w:cnfStyle w:val="100000000000"/>
+          <w:cnfStyle w:val="100000000000" w:firstRow="1" w:lastRow="0" w:firstColumn="0" w:lastColumn="0" w:oddVBand="0" w:evenVBand="0" w:oddHBand="0" w:evenHBand="0" w:firstRowFirstColumn="0" w:firstRowLastColumn="0" w:lastRowFirstColumn="0" w:lastRowLastColumn="0"/>
         </w:trPr>
         <w:tc>
           <w:tcPr>
-            <w:cnfStyle w:val="001000000100"/>
-            <w:tcW w:w="4148" w:type="dxa"/>
+            <w:cnfStyle w:val="001000000100" w:firstRow="0" w:lastRow="0" w:firstColumn="1" w:lastColumn="0" w:oddVBand="0" w:evenVBand="0" w:oddHBand="0" w:evenHBand="0" w:firstRowFirstColumn="1" w:firstRowLastColumn="0" w:lastRowFirstColumn="0" w:lastRowLastColumn="0"/>
+            <w:tcW w:w="4149" w:type="dxa"/>
             <w:tcBorders>
               <w:top w:val="single" w:sz="4" w:space="0" w:color="000000"/>
               <w:left w:val="single" w:sz="4" w:space="0" w:color="000000"/>
               <w:bottom w:val="single" w:sz="4" w:space="0" w:color="000000"/>
             </w:tcBorders>
+            <w:vAlign w:val="center"/>
           </w:tcPr>
           <w:p>
             <w:pPr>
               <w:pStyle w:val="RTOWorksBodyText"/>
               <w:widowControl w:val="0"/>
+              <w:jc w:val="center"/>
               <w:rPr>
                 <w:rFonts w:asciiTheme="minorHAnsi" w:hAnsiTheme="minorHAnsi" w:cstheme="minorBidi"/>
-                <w:b w:val="0"/>
+                <w:bCs/>
                 <w:i/>
                 <w:iCs/>
                 <w:caps w:val="0"/>
@@ -482,7 +379,7 @@
             <w:r>
               <w:rPr>
                 <w:rFonts w:asciiTheme="minorHAnsi" w:hAnsiTheme="minorHAnsi" w:cstheme="minorBidi"/>
-                <w:b w:val="0"/>
+                <w:bCs/>
                 <w:i/>
                 <w:iCs/>
                 <w:caps w:val="0"/>
@@ -503,15 +400,17 @@
               <w:bottom w:val="single" w:sz="4" w:space="0" w:color="000000"/>
               <w:right w:val="single" w:sz="4" w:space="0" w:color="000000"/>
             </w:tcBorders>
+            <w:vAlign w:val="center"/>
           </w:tcPr>
           <w:p>
             <w:pPr>
               <w:pStyle w:val="RTOWorksBodyText"/>
               <w:widowControl w:val="0"/>
-              <w:cnfStyle w:val="100000000000"/>
+              <w:jc w:val="center"/>
+              <w:cnfStyle w:val="100000000000" w:firstRow="1" w:lastRow="0" w:firstColumn="0" w:lastColumn="0" w:oddVBand="0" w:evenVBand="0" w:oddHBand="0" w:evenHBand="0" w:firstRowFirstColumn="0" w:firstRowLastColumn="0" w:lastRowFirstColumn="0" w:lastRowLastColumn="0"/>
               <w:rPr>
                 <w:rFonts w:asciiTheme="minorHAnsi" w:hAnsiTheme="minorHAnsi" w:cstheme="minorBidi"/>
-                <w:b w:val="0"/>
+                <w:bCs/>
                 <w:i/>
                 <w:iCs/>
                 <w:caps w:val="0"/>
@@ -524,7 +423,7 @@
             <w:r>
               <w:rPr>
                 <w:rFonts w:asciiTheme="minorHAnsi" w:hAnsiTheme="minorHAnsi" w:cstheme="minorBidi"/>
-                <w:b w:val="0"/>
+                <w:bCs/>
                 <w:i/>
                 <w:iCs/>
                 <w:caps w:val="0"/>
@@ -540,12 +439,12 @@
       </w:tr>
       <w:tr>
         <w:trPr>
-          <w:cnfStyle w:val="000000100000"/>
+          <w:cnfStyle w:val="000000100000" w:firstRow="0" w:lastRow="0" w:firstColumn="0" w:lastColumn="0" w:oddVBand="0" w:evenVBand="0" w:oddHBand="1" w:evenHBand="0" w:firstRowFirstColumn="0" w:firstRowLastColumn="0" w:lastRowFirstColumn="0" w:lastRowLastColumn="0"/>
         </w:trPr>
         <w:tc>
           <w:tcPr>
-            <w:cnfStyle w:val="001000000000"/>
-            <w:tcW w:w="4148" w:type="dxa"/>
+            <w:cnfStyle w:val="001000000000" w:firstRow="0" w:lastRow="0" w:firstColumn="1" w:lastColumn="0" w:oddVBand="0" w:evenVBand="0" w:oddHBand="0" w:evenHBand="0" w:firstRowFirstColumn="0" w:firstRowLastColumn="0" w:lastRowFirstColumn="0" w:lastRowLastColumn="0"/>
+            <w:tcW w:w="4149" w:type="dxa"/>
             <w:tcBorders>
               <w:left w:val="single" w:sz="4" w:space="0" w:color="000000"/>
               <w:right w:val="single" w:sz="4" w:space="0" w:color="000000"/>
@@ -553,9 +452,38 @@
           </w:tcPr>
           <w:p>
             <w:pPr>
+              <w:spacing w:after="0" w:line="240" w:lineRule="auto"/>
+              <w:ind w:left="720"/>
+              <w:rPr>
+                <w:rFonts w:ascii="Arial" w:hAnsi="Arial" w:cs="Arial"/>
+                <w:sz w:val="21"/>
+                <w:szCs w:val="21"/>
+              </w:rPr>
+            </w:pPr>
+            <w:r>
+              <w:rPr>
+                <w:rStyle w:val="Strong"/>
+                <w:rFonts w:ascii="Arial" w:hAnsi="Arial" w:cs="Arial"/>
+                <w:b/>
+                <w:bCs w:val="0"/>
+                <w:sz w:val="21"/>
+                <w:szCs w:val="21"/>
+              </w:rPr>
+              <w:t>Functional Requirement 1:</w:t>
+            </w:r>
+            <w:r>
+              <w:rPr>
+                <w:rFonts w:ascii="Arial" w:hAnsi="Arial" w:cs="Arial"/>
+                <w:sz w:val="21"/>
+                <w:szCs w:val="21"/>
+              </w:rPr>
+              <w:t xml:space="preserve"> Navigation links successfully route to the correct HTML pages (About, Menu, Contact).</w:t>
+            </w:r>
+          </w:p>
+          <w:p>
+            <w:pPr>
               <w:pStyle w:val="RTOWorksBodyText"/>
               <w:widowControl w:val="0"/>
-              <w:jc w:val="right"/>
               <w:rPr>
                 <w:rFonts w:asciiTheme="minorHAnsi" w:hAnsiTheme="minorHAnsi" w:cstheme="minorBidi"/>
                 <w:b w:val="0"/>
@@ -584,7 +512,7 @@
             <w:pPr>
               <w:pStyle w:val="RTOWorksBodyText"/>
               <w:widowControl w:val="0"/>
-              <w:cnfStyle w:val="000000100000"/>
+              <w:cnfStyle w:val="000000100000" w:firstRow="0" w:lastRow="0" w:firstColumn="0" w:lastColumn="0" w:oddVBand="0" w:evenVBand="0" w:oddHBand="1" w:evenHBand="0" w:firstRowFirstColumn="0" w:firstRowLastColumn="0" w:lastRowFirstColumn="0" w:lastRowLastColumn="0"/>
               <w:rPr>
                 <w:rFonts w:asciiTheme="minorHAnsi" w:hAnsiTheme="minorHAnsi" w:cstheme="minorBidi"/>
                 <w:b/>
@@ -597,17 +525,65 @@
                 <w:lang w:val="en-US" w:eastAsia="ja-JP"/>
               </w:rPr>
             </w:pPr>
+            <w:r>
+              <w:rPr>
+                <w:rFonts w:asciiTheme="minorHAnsi" w:hAnsiTheme="minorHAnsi" w:cstheme="minorBidi"/>
+                <w:b/>
+                <w:i/>
+                <w:iCs/>
+                <w:caps/>
+                <w:color w:val="5F5F5F" w:themeColor="text2" w:themeTint="BF"/>
+                <w:sz w:val="22"/>
+                <w:szCs w:val="22"/>
+                <w:lang w:val="en-US" w:eastAsia="ja-JP"/>
+              </w:rPr>
+              <w:drawing>
+                <wp:inline distT="0" distB="0" distL="0" distR="0" wp14:anchorId="1274BB94" wp14:editId="234CE200">
+                  <wp:extent cx="2314575" cy="1131570"/>
+                  <wp:effectExtent l="0" t="0" r="0" b="0"/>
+                  <wp:docPr id="650303540" name="Picture 1"/>
+                  <wp:cNvGraphicFramePr>
+                    <a:graphicFrameLocks xmlns:a="http://schemas.openxmlformats.org/drawingml/2006/main" noChangeAspect="1"/>
+                  </wp:cNvGraphicFramePr>
+                  <a:graphic xmlns:a="http://schemas.openxmlformats.org/drawingml/2006/main">
+                    <a:graphicData uri="http://schemas.openxmlformats.org/drawingml/2006/picture">
+                      <pic:pic xmlns:pic="http://schemas.openxmlformats.org/drawingml/2006/picture">
+                        <pic:nvPicPr>
+                          <pic:cNvPr id="650303540" name=""/>
+                          <pic:cNvPicPr/>
+                        </pic:nvPicPr>
+                        <pic:blipFill>
+                          <a:blip r:embed="rId12"/>
+                          <a:stretch>
+                            <a:fillRect/>
+                          </a:stretch>
+                        </pic:blipFill>
+                        <pic:spPr>
+                          <a:xfrm>
+                            <a:off x="0" y="0"/>
+                            <a:ext cx="2314575" cy="1131570"/>
+                          </a:xfrm>
+                          <a:prstGeom prst="rect">
+                            <a:avLst/>
+                          </a:prstGeom>
+                        </pic:spPr>
+                      </pic:pic>
+                    </a:graphicData>
+                  </a:graphic>
+                </wp:inline>
+              </w:drawing>
+            </w:r>
           </w:p>
         </w:tc>
       </w:tr>
       <w:tr>
         <w:trPr>
-          <w:cnfStyle w:val="000000010000"/>
+          <w:cnfStyle w:val="000000010000" w:firstRow="0" w:lastRow="0" w:firstColumn="0" w:lastColumn="0" w:oddVBand="0" w:evenVBand="0" w:oddHBand="0" w:evenHBand="1" w:firstRowFirstColumn="0" w:firstRowLastColumn="0" w:lastRowFirstColumn="0" w:lastRowLastColumn="0"/>
         </w:trPr>
         <w:tc>
           <w:tcPr>
-            <w:cnfStyle w:val="001000000000"/>
-            <w:tcW w:w="4148" w:type="dxa"/>
+            <w:cnfStyle w:val="001000000000" w:firstRow="0" w:lastRow="0" w:firstColumn="1" w:lastColumn="0" w:oddVBand="0" w:evenVBand="0" w:oddHBand="0" w:evenHBand="0" w:firstRowFirstColumn="0" w:firstRowLastColumn="0" w:lastRowFirstColumn="0" w:lastRowLastColumn="0"/>
+            <w:tcW w:w="4149" w:type="dxa"/>
             <w:tcBorders>
               <w:left w:val="single" w:sz="4" w:space="0" w:color="000000"/>
               <w:right w:val="single" w:sz="4" w:space="0" w:color="000000"/>
@@ -615,19 +591,45 @@
           </w:tcPr>
           <w:p>
             <w:pPr>
-              <w:pStyle w:val="RTOWorksBodyText"/>
-              <w:widowControl w:val="0"/>
-              <w:jc w:val="right"/>
+              <w:spacing w:after="0" w:line="240" w:lineRule="auto"/>
+              <w:ind w:left="720"/>
               <w:rPr>
-                <w:rFonts w:asciiTheme="minorHAnsi" w:hAnsiTheme="minorHAnsi" w:cstheme="minorBidi"/>
-                <w:b w:val="0"/>
-                <w:i/>
-                <w:iCs/>
-                <w:caps/>
-                <w:color w:val="5F5F5F" w:themeColor="text2" w:themeTint="BF"/>
-                <w:sz w:val="22"/>
-                <w:szCs w:val="22"/>
-                <w:lang w:val="en-US" w:eastAsia="ja-JP"/>
+                <w:rFonts w:ascii="Arial" w:hAnsi="Arial" w:cs="Arial"/>
+                <w:sz w:val="21"/>
+                <w:szCs w:val="21"/>
+              </w:rPr>
+            </w:pPr>
+            <w:r>
+              <w:rPr>
+                <w:rStyle w:val="Strong"/>
+                <w:rFonts w:ascii="Arial" w:hAnsi="Arial" w:cs="Arial"/>
+                <w:b/>
+                <w:bCs w:val="0"/>
+                <w:sz w:val="21"/>
+                <w:szCs w:val="21"/>
+              </w:rPr>
+              <w:t>Functional Requirement 2:</w:t>
+            </w:r>
+            <w:r>
+              <w:rPr>
+                <w:rFonts w:ascii="Arial" w:hAnsi="Arial" w:cs="Arial"/>
+                <w:sz w:val="21"/>
+                <w:szCs w:val="21"/>
+              </w:rPr>
+              <w:t xml:space="preserve"> The footer dynamically displays the current year using JavaScript.</w:t>
+            </w:r>
+          </w:p>
+          <w:p>
+            <w:pPr>
+              <w:spacing w:after="0" w:line="240" w:lineRule="auto"/>
+              <w:ind w:left="720"/>
+              <w:rPr>
+                <w:rStyle w:val="Strong"/>
+                <w:rFonts w:ascii="Arial" w:hAnsi="Arial" w:cs="Arial"/>
+                <w:b/>
+                <w:bCs w:val="0"/>
+                <w:sz w:val="21"/>
+                <w:szCs w:val="21"/>
               </w:rPr>
             </w:pPr>
           </w:p>
@@ -646,51 +648,133 @@
             <w:pPr>
               <w:pStyle w:val="RTOWorksBodyText"/>
               <w:widowControl w:val="0"/>
-              <w:cnfStyle w:val="000000010000"/>
+              <w:cnfStyle w:val="000000010000" w:firstRow="0" w:lastRow="0" w:firstColumn="0" w:lastColumn="0" w:oddVBand="0" w:evenVBand="0" w:oddHBand="0" w:evenHBand="1" w:firstRowFirstColumn="0" w:firstRowLastColumn="0" w:lastRowFirstColumn="0" w:lastRowLastColumn="0"/>
               <w:rPr>
                 <w:rFonts w:asciiTheme="minorHAnsi" w:hAnsiTheme="minorHAnsi" w:cstheme="minorBidi"/>
                 <w:b/>
                 <w:i/>
                 <w:iCs/>
                 <w:caps/>
+                <w:noProof/>
                 <w:color w:val="5F5F5F" w:themeColor="text2" w:themeTint="BF"/>
                 <w:sz w:val="22"/>
                 <w:szCs w:val="22"/>
                 <w:lang w:val="en-US" w:eastAsia="ja-JP"/>
               </w:rPr>
             </w:pPr>
+            <w:r>
+              <w:rPr>
+                <w:rFonts w:asciiTheme="minorHAnsi" w:hAnsiTheme="minorHAnsi" w:cstheme="minorBidi"/>
+                <w:b/>
+                <w:i/>
+                <w:iCs/>
+                <w:caps/>
+                <w:noProof/>
+                <w:color w:val="5F5F5F" w:themeColor="text2" w:themeTint="BF"/>
+                <w:sz w:val="22"/>
+                <w:szCs w:val="22"/>
+                <w:lang w:val="en-US" w:eastAsia="ja-JP"/>
+              </w:rPr>
+              <w:drawing>
+                <wp:inline distT="0" distB="0" distL="0" distR="0" wp14:anchorId="4CF6F688" wp14:editId="1D82F789">
+                  <wp:extent cx="2314575" cy="356235"/>
+                  <wp:effectExtent l="0" t="0" r="0" b="0"/>
+                  <wp:docPr id="647605900" name="Picture 1"/>
+                  <wp:cNvGraphicFramePr>
+                    <a:graphicFrameLocks xmlns:a="http://schemas.openxmlformats.org/drawingml/2006/main" noChangeAspect="1"/>
+                  </wp:cNvGraphicFramePr>
+                  <a:graphic xmlns:a="http://schemas.openxmlformats.org/drawingml/2006/main">
+                    <a:graphicData uri="http://schemas.openxmlformats.org/drawingml/2006/picture">
+                      <pic:pic xmlns:pic="http://schemas.openxmlformats.org/drawingml/2006/picture">
+                        <pic:nvPicPr>
+                          <pic:cNvPr id="647605900" name="Picture 647605900"/>
+                          <pic:cNvPicPr/>
+                        </pic:nvPicPr>
+                        <pic:blipFill>
+                          <a:blip r:embed="rId13" cstate="print">
+                            <a:extLst>
+                              <a:ext uri="{28A0092B-C50C-407E-A947-70E740481C1C}">
+                                <a14:useLocalDpi xmlns:a14="http://schemas.microsoft.com/office/drawing/2010/main" val="0"/>
+                              </a:ext>
+                            </a:extLst>
+                          </a:blip>
+                          <a:stretch>
+                            <a:fillRect/>
+                          </a:stretch>
+                        </pic:blipFill>
+                        <pic:spPr>
+                          <a:xfrm>
+                            <a:off x="0" y="0"/>
+                            <a:ext cx="2314575" cy="356235"/>
+                          </a:xfrm>
+                          <a:prstGeom prst="rect">
+                            <a:avLst/>
+                          </a:prstGeom>
+                        </pic:spPr>
+                      </pic:pic>
+                    </a:graphicData>
+                  </a:graphic>
+                </wp:inline>
+              </w:drawing>
+            </w:r>
           </w:p>
         </w:tc>
       </w:tr>
       <w:tr>
         <w:trPr>
-          <w:cnfStyle w:val="000000100000"/>
+          <w:cnfStyle w:val="000000100000" w:firstRow="0" w:lastRow="0" w:firstColumn="0" w:lastColumn="0" w:oddVBand="0" w:evenVBand="0" w:oddHBand="1" w:evenHBand="0" w:firstRowFirstColumn="0" w:firstRowLastColumn="0" w:lastRowFirstColumn="0" w:lastRowLastColumn="0"/>
         </w:trPr>
         <w:tc>
           <w:tcPr>
-            <w:cnfStyle w:val="001000000000"/>
-            <w:tcW w:w="4148" w:type="dxa"/>
+            <w:cnfStyle w:val="001000000000" w:firstRow="0" w:lastRow="0" w:firstColumn="1" w:lastColumn="0" w:oddVBand="0" w:evenVBand="0" w:oddHBand="0" w:evenHBand="0" w:firstRowFirstColumn="0" w:firstRowLastColumn="0" w:lastRowFirstColumn="0" w:lastRowLastColumn="0"/>
+            <w:tcW w:w="4149" w:type="dxa"/>
             <w:tcBorders>
               <w:left w:val="single" w:sz="4" w:space="0" w:color="000000"/>
-              <w:bottom w:val="single" w:sz="4" w:space="0" w:color="000000"/>
               <w:right w:val="single" w:sz="4" w:space="0" w:color="000000"/>
             </w:tcBorders>
           </w:tcPr>
           <w:p>
             <w:pPr>
-              <w:pStyle w:val="RTOWorksBodyText"/>
-              <w:widowControl w:val="0"/>
-              <w:jc w:val="right"/>
+              <w:spacing w:after="0" w:line="240" w:lineRule="auto"/>
+              <w:ind w:left="720"/>
               <w:rPr>
-                <w:rFonts w:asciiTheme="minorHAnsi" w:hAnsiTheme="minorHAnsi" w:cstheme="minorBidi"/>
-                <w:b w:val="0"/>
-                <w:i/>
-                <w:iCs/>
-                <w:caps/>
-                <w:color w:val="5F5F5F" w:themeColor="text2" w:themeTint="BF"/>
-                <w:sz w:val="22"/>
-                <w:szCs w:val="22"/>
-                <w:lang w:val="en-US" w:eastAsia="ja-JP"/>
+                <w:rFonts w:ascii="Arial" w:hAnsi="Arial" w:cs="Arial"/>
+                <w:sz w:val="21"/>
+                <w:szCs w:val="21"/>
+              </w:rPr>
+            </w:pPr>
+            <w:r>
+              <w:rPr>
+                <w:rStyle w:val="Strong"/>
+                <w:rFonts w:ascii="Arial" w:hAnsi="Arial" w:cs="Arial"/>
+                <w:b/>
+                <w:bCs w:val="0"/>
+                <w:sz w:val="21"/>
+                <w:szCs w:val="21"/>
+              </w:rPr>
+              <w:lastRenderedPageBreak/>
+              <w:t>Functional Requirement 3:</w:t>
+            </w:r>
+            <w:r>
+              <w:rPr>
+                <w:rFonts w:ascii="Arial" w:hAnsi="Arial" w:cs="Arial"/>
+                <w:sz w:val="21"/>
+                <w:szCs w:val="21"/>
+              </w:rPr>
+              <w:t xml:space="preserve"> The contact form displays a notification message when the user clicks submit.</w:t>
+            </w:r>
+          </w:p>
+          <w:p>
+            <w:pPr>
+              <w:spacing w:after="0" w:line="240" w:lineRule="auto"/>
+              <w:ind w:left="720"/>
+              <w:rPr>
+                <w:rStyle w:val="Strong"/>
+                <w:rFonts w:ascii="Arial" w:hAnsi="Arial" w:cs="Arial"/>
+                <w:b/>
+                <w:bCs w:val="0"/>
+                <w:sz w:val="21"/>
+                <w:szCs w:val="21"/>
               </w:rPr>
             </w:pPr>
           </w:p>
@@ -709,19 +793,75 @@
             <w:pPr>
               <w:pStyle w:val="RTOWorksBodyText"/>
               <w:widowControl w:val="0"/>
-              <w:cnfStyle w:val="000000100000"/>
+              <w:cnfStyle w:val="000000100000" w:firstRow="0" w:lastRow="0" w:firstColumn="0" w:lastColumn="0" w:oddVBand="0" w:evenVBand="0" w:oddHBand="1" w:evenHBand="0" w:firstRowFirstColumn="0" w:firstRowLastColumn="0" w:lastRowFirstColumn="0" w:lastRowLastColumn="0"/>
               <w:rPr>
                 <w:rFonts w:asciiTheme="minorHAnsi" w:hAnsiTheme="minorHAnsi" w:cstheme="minorBidi"/>
                 <w:b/>
                 <w:i/>
                 <w:iCs/>
                 <w:caps/>
+                <w:noProof/>
                 <w:color w:val="5F5F5F" w:themeColor="text2" w:themeTint="BF"/>
                 <w:sz w:val="22"/>
                 <w:szCs w:val="22"/>
                 <w:lang w:val="en-US" w:eastAsia="ja-JP"/>
               </w:rPr>
             </w:pPr>
+            <w:r>
+              <w:rPr>
+                <w:rFonts w:asciiTheme="minorHAnsi" w:hAnsiTheme="minorHAnsi" w:cstheme="minorBidi"/>
+                <w:b/>
+                <w:i/>
+                <w:iCs/>
+                <w:caps/>
+                <w:noProof/>
+                <w:color w:val="5F5F5F" w:themeColor="text2" w:themeTint="BF"/>
+                <w:sz w:val="22"/>
+                <w:szCs w:val="22"/>
+                <w:lang w:val="en-US" w:eastAsia="ja-JP"/>
+              </w:rPr>
+              <w:drawing>
+                <wp:inline distT="0" distB="0" distL="0" distR="0" wp14:anchorId="30A6A210" wp14:editId="08E6E8F0">
+                  <wp:extent cx="2313940" cy="2840355"/>
+                  <wp:effectExtent l="0" t="0" r="0" b="0"/>
+                  <wp:docPr id="639366281" name="Picture 2"/>
+                  <wp:cNvGraphicFramePr>
+                    <a:graphicFrameLocks xmlns:a="http://schemas.openxmlformats.org/drawingml/2006/main" noChangeAspect="1"/>
+                  </wp:cNvGraphicFramePr>
+                  <a:graphic xmlns:a="http://schemas.openxmlformats.org/drawingml/2006/main">
+                    <a:graphicData uri="http://schemas.openxmlformats.org/drawingml/2006/picture">
+                      <pic:pic xmlns:pic="http://schemas.openxmlformats.org/drawingml/2006/picture">
+                        <pic:nvPicPr>
+                          <pic:cNvPr id="639366281" name="Picture 639366281"/>
+                          <pic:cNvPicPr/>
+                        </pic:nvPicPr>
+                        <pic:blipFill>
+                          <a:blip r:embed="rId14" cstate="print">
+                            <a:extLst>
+                              <a:ext uri="{28A0092B-C50C-407E-A947-70E740481C1C}">
+                                <a14:useLocalDpi xmlns:a14="http://schemas.microsoft.com/office/drawing/2010/main" val="0"/>
+                              </a:ext>
+                            </a:extLst>
+                          </a:blip>
+                          <a:stretch>
+                            <a:fillRect/>
+                          </a:stretch>
+                        </pic:blipFill>
+                        <pic:spPr>
+                          <a:xfrm>
+                            <a:off x="0" y="0"/>
+                            <a:ext cx="2313940" cy="2840355"/>
+                          </a:xfrm>
+                          <a:prstGeom prst="rect">
+                            <a:avLst/>
+                          </a:prstGeom>
+                        </pic:spPr>
+                      </pic:pic>
+                    </a:graphicData>
+                  </a:graphic>
+                </wp:inline>
+              </w:drawing>
+            </w:r>
           </w:p>
         </w:tc>
       </w:tr>
@@ -750,12 +890,663 @@
       </w:pPr>
       <w:bookmarkStart w:id="2" w:name="_Toc84508553"/>
       <w:r>
-        <w:t xml:space="preserve">Test </w:t>
+        <w:t>Test description</w:t>
+      </w:r>
+      <w:bookmarkEnd w:id="2"/>
+    </w:p>
+    <w:p>
+      <w:pPr>
+        <w:pStyle w:val="ListParagraph"/>
+        <w:numPr>
+          <w:ilvl w:val="0"/>
+          <w:numId w:val="7"/>
+        </w:numPr>
+        <w:suppressAutoHyphens w:val="0"/>
+        <w:spacing w:after="0" w:line="240" w:lineRule="auto"/>
+        <w:rPr>
+          <w:rFonts w:ascii="Arial" w:eastAsia="Times New Roman" w:hAnsi="Arial" w:cs="Arial"/>
+          <w:i w:val="0"/>
+          <w:iCs/>
+          <w:color w:val="auto"/>
+          <w:sz w:val="21"/>
+          <w:szCs w:val="21"/>
+          <w:lang w:val="en-AU" w:eastAsia="en-GB"/>
+        </w:rPr>
+      </w:pPr>
+      <w:r>
+        <w:rPr>
+          <w:rFonts w:ascii="Arial" w:eastAsia="Times New Roman" w:hAnsi="Arial" w:cs="Arial"/>
+          <w:b/>
+          <w:bCs/>
+          <w:i w:val="0"/>
+          <w:iCs/>
+          <w:color w:val="auto"/>
+          <w:sz w:val="21"/>
+          <w:szCs w:val="21"/>
+          <w:lang w:val="en-AU" w:eastAsia="en-GB"/>
+        </w:rPr>
+        <w:t>Website Functionality:</w:t>
       </w:r>
       <w:r>
-        <w:t>description</w:t>
+        <w:rPr>
+          <w:rFonts w:ascii="Arial" w:eastAsia="Times New Roman" w:hAnsi="Arial" w:cs="Arial"/>
+          <w:i w:val="0"/>
+          <w:iCs/>
+          <w:color w:val="auto"/>
+          <w:sz w:val="21"/>
+          <w:szCs w:val="21"/>
+          <w:lang w:val="en-AU" w:eastAsia="en-GB"/>
+        </w:rPr>
+        <w:t xml:space="preserve"> I systematically tested the website by clicking all navigation links to ensure there were no broken pages. I also verified that the JavaScript fetch API successfully loaded the XML data by inspecting the Network tab in Chrome Developer Tools, ensuring the tables populated correctly on the Menu and Contact pages.</w:t>
       </w:r>
-      <w:bookmarkEnd w:id="2"/>
+    </w:p>
+    <w:p>
+      <w:pPr>
+        <w:numPr>
+          <w:ilvl w:val="0"/>
+          <w:numId w:val="6"/>
+        </w:numPr>
+        <w:suppressAutoHyphens w:val="0"/>
+        <w:spacing w:before="100" w:beforeAutospacing="1" w:after="100" w:afterAutospacing="1" w:line="240" w:lineRule="auto"/>
+        <w:rPr>
+          <w:rFonts w:ascii="Arial" w:eastAsia="Times New Roman" w:hAnsi="Arial" w:cs="Arial"/>
+          <w:iCs/>
+          <w:color w:val="auto"/>
+          <w:sz w:val="21"/>
+          <w:szCs w:val="21"/>
+          <w:lang w:val="en-AU" w:eastAsia="en-GB"/>
+        </w:rPr>
+      </w:pPr>
+      <w:r>
+        <w:rPr>
+          <w:rFonts w:ascii="Arial" w:eastAsia="Times New Roman" w:hAnsi="Arial" w:cs="Arial"/>
+          <w:b/>
+          <w:bCs/>
+          <w:iCs/>
+          <w:color w:val="auto"/>
+          <w:sz w:val="21"/>
+          <w:szCs w:val="21"/>
+          <w:lang w:val="en-AU" w:eastAsia="en-GB"/>
+        </w:rPr>
+        <w:t>Functionality After Change:</w:t>
+      </w:r>
+      <w:r>
+        <w:rPr>
+          <w:rFonts w:ascii="Arial" w:eastAsia="Times New Roman" w:hAnsi="Arial" w:cs="Arial"/>
+          <w:iCs/>
+          <w:color w:val="auto"/>
+          <w:sz w:val="21"/>
+          <w:szCs w:val="21"/>
+          <w:lang w:val="en-AU" w:eastAsia="en-GB"/>
+        </w:rPr>
+        <w:t xml:space="preserve"> After adding CSS media queries to make the site responsive, I re-tested the layout by resizing the browser window. I verified that the navigation collapsed into a hamburger menu (if applicable) and that the table columns stacked vertically on smaller screens without overlapping or breaking the functionality.</w:t>
+      </w:r>
+      <w:r>
+        <w:rPr>
+          <w:rFonts w:ascii="Arial" w:eastAsia="Times New Roman" w:hAnsi="Arial" w:cs="Arial"/>
+          <w:iCs/>
+          <w:color w:val="auto"/>
+          <w:sz w:val="21"/>
+          <w:szCs w:val="21"/>
+          <w:lang w:val="en-AU" w:eastAsia="en-GB"/>
+        </w:rPr>
+        <w:br/>
+      </w:r>
+    </w:p>
+    <w:p>
+      <w:pPr>
+        <w:numPr>
+          <w:ilvl w:val="0"/>
+          <w:numId w:val="6"/>
+        </w:numPr>
+        <w:suppressAutoHyphens w:val="0"/>
+        <w:spacing w:before="100" w:beforeAutospacing="1" w:after="100" w:afterAutospacing="1" w:line="240" w:lineRule="auto"/>
+        <w:rPr>
+          <w:rFonts w:ascii="Arial" w:eastAsia="Times New Roman" w:hAnsi="Arial" w:cs="Arial"/>
+          <w:iCs/>
+          <w:color w:val="auto"/>
+          <w:sz w:val="21"/>
+          <w:szCs w:val="21"/>
+          <w:lang w:val="en-AU" w:eastAsia="en-GB"/>
+        </w:rPr>
+      </w:pPr>
+      <w:r>
+        <w:rPr>
+          <w:rFonts w:ascii="Arial" w:eastAsia="Times New Roman" w:hAnsi="Arial" w:cs="Arial"/>
+          <w:b/>
+          <w:bCs/>
+          <w:iCs/>
+          <w:color w:val="auto"/>
+          <w:sz w:val="21"/>
+          <w:szCs w:val="21"/>
+          <w:lang w:val="en-AU" w:eastAsia="en-GB"/>
+        </w:rPr>
+        <w:t>Cyber Security Procedures:</w:t>
+      </w:r>
+      <w:r>
+        <w:rPr>
+          <w:rFonts w:ascii="Arial" w:eastAsia="Times New Roman" w:hAnsi="Arial" w:cs="Arial"/>
+          <w:iCs/>
+          <w:color w:val="auto"/>
+          <w:sz w:val="21"/>
+          <w:szCs w:val="21"/>
+          <w:lang w:val="en-AU" w:eastAsia="en-GB"/>
+        </w:rPr>
+        <w:t xml:space="preserve"> To comply with security procedures, I enforced strict client-side validation on the Contact page's enquiry form. I used HTML5 attributes (like </w:t>
+      </w:r>
+      <w:r>
+        <w:rPr>
+          <w:rFonts w:ascii="Courier New" w:eastAsia="Times New Roman" w:hAnsi="Courier New" w:cs="Courier New"/>
+          <w:iCs/>
+          <w:color w:val="auto"/>
+          <w:sz w:val="20"/>
+          <w:szCs w:val="20"/>
+          <w:shd w:val="clear" w:color="auto" w:fill="F5F5F5"/>
+          <w:lang w:val="en-AU" w:eastAsia="en-GB"/>
+        </w:rPr>
+        <w:t>required</w:t>
+      </w:r>
+      <w:r>
+        <w:rPr>
+          <w:rFonts w:ascii="Arial" w:eastAsia="Times New Roman" w:hAnsi="Arial" w:cs="Arial"/>
+          <w:iCs/>
+          <w:color w:val="auto"/>
+          <w:sz w:val="21"/>
+          <w:szCs w:val="21"/>
+          <w:lang w:val="en-AU" w:eastAsia="en-GB"/>
+        </w:rPr>
+        <w:t xml:space="preserve"> and </w:t>
+      </w:r>
+      <w:r>
+        <w:rPr>
+          <w:rFonts w:ascii="Courier New" w:eastAsia="Times New Roman" w:hAnsi="Courier New" w:cs="Courier New"/>
+          <w:iCs/>
+          <w:color w:val="auto"/>
+          <w:sz w:val="20"/>
+          <w:szCs w:val="20"/>
+          <w:shd w:val="clear" w:color="auto" w:fill="F5F5F5"/>
+          <w:lang w:val="en-AU" w:eastAsia="en-GB"/>
+        </w:rPr>
+        <w:t>type="email"</w:t>
+      </w:r>
+      <w:r>
+        <w:rPr>
+          <w:rFonts w:ascii="Arial" w:eastAsia="Times New Roman" w:hAnsi="Arial" w:cs="Arial"/>
+          <w:iCs/>
+          <w:color w:val="auto"/>
+          <w:sz w:val="21"/>
+          <w:szCs w:val="21"/>
+          <w:lang w:val="en-AU" w:eastAsia="en-GB"/>
+        </w:rPr>
+        <w:t>) to ensure no empty or malformed data could be submitted. Furthermore, I ensured no sensitive server-side paths or API keys were exposed within the client-side JavaScript or XML files.</w:t>
+      </w:r>
+    </w:p>
+    <w:p>
+      <w:pPr>
+        <w:rPr>
+          <w:rFonts w:asciiTheme="majorHAnsi" w:eastAsiaTheme="majorEastAsia" w:hAnsiTheme="majorHAnsi" w:cstheme="majorBidi"/>
+          <w:b/>
+          <w:caps/>
+          <w:color w:val="2A2A2A" w:themeColor="text2"/>
+          <w:sz w:val="90"/>
+          <w:szCs w:val="32"/>
+        </w:rPr>
+      </w:pPr>
+      <w:r>
+        <w:br w:type="page"/>
+      </w:r>
+    </w:p>
+    <w:p>
+      <w:pPr>
+        <w:pStyle w:val="Heading1"/>
+      </w:pPr>
+      <w:bookmarkStart w:id="3" w:name="_Toc84508554"/>
+      <w:r>
+        <w:lastRenderedPageBreak/>
+        <w:t>XML document Testing</w:t>
+      </w:r>
+      <w:bookmarkEnd w:id="3"/>
+    </w:p>
+    <w:p>
+      <w:pPr>
+        <w:pStyle w:val="Heading2"/>
+      </w:pPr>
+      <w:bookmarkStart w:id="4" w:name="_Toc84508555"/>
+      <w:r>
+        <w:t>Offline testing</w:t>
+      </w:r>
+      <w:bookmarkEnd w:id="4"/>
+    </w:p>
+    <w:p>
+      <w:pPr>
+        <w:numPr>
+          <w:ilvl w:val="0"/>
+          <w:numId w:val="8"/>
+        </w:numPr>
+        <w:suppressAutoHyphens w:val="0"/>
+        <w:spacing w:before="100" w:beforeAutospacing="1" w:after="100" w:afterAutospacing="1" w:line="240" w:lineRule="auto"/>
+        <w:rPr>
+          <w:rFonts w:ascii="Arial" w:eastAsia="Times New Roman" w:hAnsi="Arial" w:cs="Arial"/>
+          <w:color w:val="auto"/>
+          <w:sz w:val="21"/>
+          <w:szCs w:val="21"/>
+          <w:lang w:val="en-AU" w:eastAsia="en-GB"/>
+        </w:rPr>
+      </w:pPr>
+      <w:r>
+        <w:rPr>
+          <w:rFonts w:ascii="Arial" w:eastAsia="Times New Roman" w:hAnsi="Arial" w:cs="Arial"/>
+          <w:b/>
+          <w:bCs/>
+          <w:color w:val="auto"/>
+          <w:sz w:val="21"/>
+          <w:szCs w:val="21"/>
+          <w:lang w:val="en-AU" w:eastAsia="en-GB"/>
+        </w:rPr>
+        <w:t>Browsers Used:</w:t>
+      </w:r>
+      <w:r>
+        <w:rPr>
+          <w:rFonts w:ascii="Arial" w:eastAsia="Times New Roman" w:hAnsi="Arial" w:cs="Arial"/>
+          <w:color w:val="auto"/>
+          <w:sz w:val="21"/>
+          <w:szCs w:val="21"/>
+          <w:lang w:val="en-AU" w:eastAsia="en-GB"/>
+        </w:rPr>
+        <w:t xml:space="preserve"> Google Chrome and Apple Safari.</w:t>
+      </w:r>
+    </w:p>
+    <w:p>
+      <w:pPr>
+        <w:numPr>
+          <w:ilvl w:val="0"/>
+          <w:numId w:val="8"/>
+        </w:numPr>
+        <w:suppressAutoHyphens w:val="0"/>
+        <w:spacing w:before="100" w:beforeAutospacing="1" w:after="100" w:afterAutospacing="1" w:line="240" w:lineRule="auto"/>
+        <w:rPr>
+          <w:rFonts w:ascii="Arial" w:eastAsia="Times New Roman" w:hAnsi="Arial" w:cs="Arial"/>
+          <w:color w:val="auto"/>
+          <w:sz w:val="21"/>
+          <w:szCs w:val="21"/>
+          <w:lang w:val="en-AU" w:eastAsia="en-GB"/>
+        </w:rPr>
+      </w:pPr>
+      <w:r>
+        <w:rPr>
+          <w:rFonts w:ascii="Arial" w:eastAsia="Times New Roman" w:hAnsi="Arial" w:cs="Arial"/>
+          <w:b/>
+          <w:bCs/>
+          <w:color w:val="auto"/>
+          <w:sz w:val="21"/>
+          <w:szCs w:val="21"/>
+          <w:lang w:val="en-AU" w:eastAsia="en-GB"/>
+        </w:rPr>
+        <w:t>Testing Process:</w:t>
+      </w:r>
+      <w:r>
+        <w:rPr>
+          <w:rFonts w:ascii="Arial" w:eastAsia="Times New Roman" w:hAnsi="Arial" w:cs="Arial"/>
+          <w:color w:val="auto"/>
+          <w:sz w:val="21"/>
+          <w:szCs w:val="21"/>
+          <w:lang w:val="en-AU" w:eastAsia="en-GB"/>
+        </w:rPr>
+        <w:t xml:space="preserve"> I opened the raw </w:t>
+      </w:r>
+      <w:r>
+        <w:rPr>
+          <w:rFonts w:ascii="Courier New" w:eastAsia="Times New Roman" w:hAnsi="Courier New" w:cs="Courier New"/>
+          <w:color w:val="auto"/>
+          <w:sz w:val="20"/>
+          <w:szCs w:val="20"/>
+          <w:shd w:val="clear" w:color="auto" w:fill="F5F5F5"/>
+          <w:lang w:val="en-AU" w:eastAsia="en-GB"/>
+        </w:rPr>
+        <w:t>menu.xml</w:t>
+      </w:r>
+      <w:r>
+        <w:rPr>
+          <w:rFonts w:ascii="Arial" w:eastAsia="Times New Roman" w:hAnsi="Arial" w:cs="Arial"/>
+          <w:color w:val="auto"/>
+          <w:sz w:val="21"/>
+          <w:szCs w:val="21"/>
+          <w:lang w:val="en-AU" w:eastAsia="en-GB"/>
+        </w:rPr>
+        <w:t xml:space="preserve"> and </w:t>
+      </w:r>
+      <w:r>
+        <w:rPr>
+          <w:rFonts w:ascii="Courier New" w:eastAsia="Times New Roman" w:hAnsi="Courier New" w:cs="Courier New"/>
+          <w:color w:val="auto"/>
+          <w:sz w:val="20"/>
+          <w:szCs w:val="20"/>
+          <w:shd w:val="clear" w:color="auto" w:fill="F5F5F5"/>
+          <w:lang w:val="en-AU" w:eastAsia="en-GB"/>
+        </w:rPr>
+        <w:t>branches.xml</w:t>
+      </w:r>
+      <w:r>
+        <w:rPr>
+          <w:rFonts w:ascii="Arial" w:eastAsia="Times New Roman" w:hAnsi="Arial" w:cs="Arial"/>
+          <w:color w:val="auto"/>
+          <w:sz w:val="21"/>
+          <w:szCs w:val="21"/>
+          <w:lang w:val="en-AU" w:eastAsia="en-GB"/>
+        </w:rPr>
+        <w:t xml:space="preserve"> files directly from my local hard drive into both browsers. This was done to verify that the browsers' built-in XML parsers could read the files without throwing any "well-formedness" syntax errors, confirming the document structure was valid before attempting to fetch it with JavaScript.</w:t>
+      </w:r>
+    </w:p>
+    <w:p>
+      <w:pPr>
+        <w:pStyle w:val="RTOWorksBullet1"/>
+        <w:tabs>
+          <w:tab w:val="clear" w:pos="0"/>
+        </w:tabs>
+        <w:rPr>
+          <w:rFonts w:asciiTheme="majorHAnsi" w:hAnsiTheme="majorHAnsi" w:cstheme="majorBidi"/>
+          <w:b/>
+          <w:i/>
+          <w:caps/>
+          <w:color w:val="2A2A2A" w:themeColor="text2"/>
+          <w:sz w:val="28"/>
+          <w:szCs w:val="26"/>
+          <w:lang w:eastAsia="ja-JP"/>
+        </w:rPr>
+      </w:pPr>
+      <w:r>
+        <w:rPr>
+          <w:rFonts w:asciiTheme="majorHAnsi" w:hAnsiTheme="majorHAnsi" w:cstheme="majorBidi"/>
+          <w:b/>
+          <w:i/>
+          <w:caps/>
+          <w:noProof/>
+          <w:color w:val="2A2A2A" w:themeColor="text2"/>
+          <w:sz w:val="28"/>
+          <w:szCs w:val="26"/>
+          <w:lang w:eastAsia="ja-JP"/>
+        </w:rPr>
+        <w:drawing>
+          <wp:inline distT="0" distB="0" distL="0" distR="0" wp14:anchorId="7FF09535" wp14:editId="1846A019">
+            <wp:extent cx="3844344" cy="2943659"/>
+            <wp:effectExtent l="0" t="0" r="0" b="0"/>
+            <wp:docPr id="250339937" name="Picture 3"/>
+            <wp:cNvGraphicFramePr>
+              <a:graphicFrameLocks xmlns:a="http://schemas.openxmlformats.org/drawingml/2006/main" noChangeAspect="1"/>
+            </wp:cNvGraphicFramePr>
+            <a:graphic xmlns:a="http://schemas.openxmlformats.org/drawingml/2006/main">
+              <a:graphicData uri="http://schemas.openxmlformats.org/drawingml/2006/picture">
+                <pic:pic xmlns:pic="http://schemas.openxmlformats.org/drawingml/2006/picture">
+                  <pic:nvPicPr>
+                    <pic:cNvPr id="250339937" name="Picture 250339937"/>
+                    <pic:cNvPicPr/>
+                  </pic:nvPicPr>
+                  <pic:blipFill>
+                    <a:blip r:embed="rId15" cstate="print">
+                      <a:extLst>
+                        <a:ext uri="{28A0092B-C50C-407E-A947-70E740481C1C}">
+                          <a14:useLocalDpi xmlns:a14="http://schemas.microsoft.com/office/drawing/2010/main" val="0"/>
+                        </a:ext>
+                      </a:extLst>
+                    </a:blip>
+                    <a:stretch>
+                      <a:fillRect/>
+                    </a:stretch>
+                  </pic:blipFill>
+                  <pic:spPr>
+                    <a:xfrm>
+                      <a:off x="0" y="0"/>
+                      <a:ext cx="3864425" cy="2959035"/>
+                    </a:xfrm>
+                    <a:prstGeom prst="rect">
+                      <a:avLst/>
+                    </a:prstGeom>
+                  </pic:spPr>
+                </pic:pic>
+              </a:graphicData>
+            </a:graphic>
+          </wp:inline>
+        </w:drawing>
+      </w:r>
+    </w:p>
+    <w:p>
+      <w:pPr>
+        <w:pStyle w:val="RTOWorksBullet1"/>
+        <w:tabs>
+          <w:tab w:val="clear" w:pos="0"/>
+        </w:tabs>
+        <w:rPr>
+          <w:rFonts w:asciiTheme="majorHAnsi" w:hAnsiTheme="majorHAnsi" w:cstheme="majorBidi"/>
+          <w:b/>
+          <w:i/>
+          <w:caps/>
+          <w:color w:val="2A2A2A" w:themeColor="text2"/>
+          <w:sz w:val="28"/>
+          <w:szCs w:val="26"/>
+          <w:lang w:eastAsia="ja-JP"/>
+        </w:rPr>
+      </w:pPr>
+      <w:r>
+        <w:rPr>
+          <w:rFonts w:asciiTheme="majorHAnsi" w:hAnsiTheme="majorHAnsi" w:cstheme="majorBidi"/>
+          <w:b/>
+          <w:i/>
+          <w:caps/>
+          <w:color w:val="2A2A2A" w:themeColor="text2"/>
+          <w:sz w:val="28"/>
+          <w:szCs w:val="26"/>
+          <w:lang w:eastAsia="ja-JP"/>
+        </w:rPr>
+        <w:lastRenderedPageBreak/>
+        <w:drawing>
+          <wp:inline distT="0" distB="0" distL="0" distR="0" wp14:anchorId="6CEEE346" wp14:editId="68E0D56E">
+            <wp:extent cx="5274310" cy="800100"/>
+            <wp:effectExtent l="0" t="0" r="0" b="0"/>
+            <wp:docPr id="1447587538" name="Picture 1"/>
+            <wp:cNvGraphicFramePr>
+              <a:graphicFrameLocks xmlns:a="http://schemas.openxmlformats.org/drawingml/2006/main" noChangeAspect="1"/>
+            </wp:cNvGraphicFramePr>
+            <a:graphic xmlns:a="http://schemas.openxmlformats.org/drawingml/2006/main">
+              <a:graphicData uri="http://schemas.openxmlformats.org/drawingml/2006/picture">
+                <pic:pic xmlns:pic="http://schemas.openxmlformats.org/drawingml/2006/picture">
+                  <pic:nvPicPr>
+                    <pic:cNvPr id="1447587538" name=""/>
+                    <pic:cNvPicPr/>
+                  </pic:nvPicPr>
+                  <pic:blipFill>
+                    <a:blip r:embed="rId16"/>
+                    <a:stretch>
+                      <a:fillRect/>
+                    </a:stretch>
+                  </pic:blipFill>
+                  <pic:spPr>
+                    <a:xfrm>
+                      <a:off x="0" y="0"/>
+                      <a:ext cx="5274310" cy="800100"/>
+                    </a:xfrm>
+                    <a:prstGeom prst="rect">
+                      <a:avLst/>
+                    </a:prstGeom>
+                  </pic:spPr>
+                </pic:pic>
+              </a:graphicData>
+            </a:graphic>
+          </wp:inline>
+        </w:drawing>
+      </w:r>
+    </w:p>
+    <w:p>
+      <w:pPr>
+        <w:pStyle w:val="Heading2"/>
+      </w:pPr>
+      <w:bookmarkStart w:id="5" w:name="_Toc84508556"/>
+      <w:r>
+        <w:t>Device testing</w:t>
+      </w:r>
+      <w:bookmarkEnd w:id="5"/>
+    </w:p>
+    <w:p>
+      <w:r>
+        <w:drawing>
+          <wp:inline distT="0" distB="0" distL="0" distR="0" wp14:anchorId="413E55E5" wp14:editId="54140FB3">
+            <wp:extent cx="5274310" cy="2961005"/>
+            <wp:effectExtent l="0" t="0" r="0" b="0"/>
+            <wp:docPr id="229050311" name="Picture 1"/>
+            <wp:cNvGraphicFramePr>
+              <a:graphicFrameLocks xmlns:a="http://schemas.openxmlformats.org/drawingml/2006/main" noChangeAspect="1"/>
+            </wp:cNvGraphicFramePr>
+            <a:graphic xmlns:a="http://schemas.openxmlformats.org/drawingml/2006/main">
+              <a:graphicData uri="http://schemas.openxmlformats.org/drawingml/2006/picture">
+                <pic:pic xmlns:pic="http://schemas.openxmlformats.org/drawingml/2006/picture">
+                  <pic:nvPicPr>
+                    <pic:cNvPr id="229050311" name=""/>
+                    <pic:cNvPicPr/>
+                  </pic:nvPicPr>
+                  <pic:blipFill>
+                    <a:blip r:embed="rId17"/>
+                    <a:stretch>
+                      <a:fillRect/>
+                    </a:stretch>
+                  </pic:blipFill>
+                  <pic:spPr>
+                    <a:xfrm>
+                      <a:off x="0" y="0"/>
+                      <a:ext cx="5274310" cy="2961005"/>
+                    </a:xfrm>
+                    <a:prstGeom prst="rect">
+                      <a:avLst/>
+                    </a:prstGeom>
+                  </pic:spPr>
+                </pic:pic>
+              </a:graphicData>
+            </a:graphic>
+          </wp:inline>
+        </w:drawing>
+      </w:r>
+    </w:p>
+    <w:p>
+      <w:r>
+        <w:lastRenderedPageBreak/>
+        <w:drawing>
+          <wp:inline distT="0" distB="0" distL="0" distR="0" wp14:anchorId="7D36066E" wp14:editId="1CA1B64E">
+            <wp:extent cx="3556000" cy="6134100"/>
+            <wp:effectExtent l="0" t="0" r="0" b="0"/>
+            <wp:docPr id="1549318149" name="Picture 1"/>
+            <wp:cNvGraphicFramePr>
+              <a:graphicFrameLocks xmlns:a="http://schemas.openxmlformats.org/drawingml/2006/main" noChangeAspect="1"/>
+            </wp:cNvGraphicFramePr>
+            <a:graphic xmlns:a="http://schemas.openxmlformats.org/drawingml/2006/main">
+              <a:graphicData uri="http://schemas.openxmlformats.org/drawingml/2006/picture">
+                <pic:pic xmlns:pic="http://schemas.openxmlformats.org/drawingml/2006/picture">
+                  <pic:nvPicPr>
+                    <pic:cNvPr id="1549318149" name=""/>
+                    <pic:cNvPicPr/>
+                  </pic:nvPicPr>
+                  <pic:blipFill>
+                    <a:blip r:embed="rId18"/>
+                    <a:stretch>
+                      <a:fillRect/>
+                    </a:stretch>
+                  </pic:blipFill>
+                  <pic:spPr>
+                    <a:xfrm>
+                      <a:off x="0" y="0"/>
+                      <a:ext cx="3556000" cy="6134100"/>
+                    </a:xfrm>
+                    <a:prstGeom prst="rect">
+                      <a:avLst/>
+                    </a:prstGeom>
+                  </pic:spPr>
+                </pic:pic>
+              </a:graphicData>
+            </a:graphic>
+          </wp:inline>
+        </w:drawing>
+      </w:r>
+    </w:p>
+    <w:p>
+      <w:r>
+        <w:lastRenderedPageBreak/>
+        <w:drawing>
+          <wp:inline distT="0" distB="0" distL="0" distR="0" wp14:anchorId="0805B83F" wp14:editId="7417CB26">
+            <wp:extent cx="5274310" cy="2969895"/>
+            <wp:effectExtent l="0" t="0" r="0" b="0"/>
+            <wp:docPr id="1851632867" name="Picture 1"/>
+            <wp:cNvGraphicFramePr>
+              <a:graphicFrameLocks xmlns:a="http://schemas.openxmlformats.org/drawingml/2006/main" noChangeAspect="1"/>
+            </wp:cNvGraphicFramePr>
+            <a:graphic xmlns:a="http://schemas.openxmlformats.org/drawingml/2006/main">
+              <a:graphicData uri="http://schemas.openxmlformats.org/drawingml/2006/picture">
+                <pic:pic xmlns:pic="http://schemas.openxmlformats.org/drawingml/2006/picture">
+                  <pic:nvPicPr>
+                    <pic:cNvPr id="1851632867" name=""/>
+                    <pic:cNvPicPr/>
+                  </pic:nvPicPr>
+                  <pic:blipFill>
+                    <a:blip r:embed="rId19"/>
+                    <a:stretch>
+                      <a:fillRect/>
+                    </a:stretch>
+                  </pic:blipFill>
+                  <pic:spPr>
+                    <a:xfrm>
+                      <a:off x="0" y="0"/>
+                      <a:ext cx="5274310" cy="2969895"/>
+                    </a:xfrm>
+                    <a:prstGeom prst="rect">
+                      <a:avLst/>
+                    </a:prstGeom>
+                  </pic:spPr>
+                </pic:pic>
+              </a:graphicData>
+            </a:graphic>
+          </wp:inline>
+        </w:drawing>
+      </w:r>
+      <w:r>
+        <w:rPr>
+          <w:noProof/>
+        </w:rPr>
+        <w:t xml:space="preserve"> </w:t>
+      </w:r>
+      <w:r>
+        <w:lastRenderedPageBreak/>
+        <w:drawing>
+          <wp:inline distT="0" distB="0" distL="0" distR="0" wp14:anchorId="4ED24320" wp14:editId="7366121E">
+            <wp:extent cx="3721100" cy="6172200"/>
+            <wp:effectExtent l="0" t="0" r="0" b="0"/>
+            <wp:docPr id="951399934" name="Picture 1"/>
+            <wp:cNvGraphicFramePr>
+              <a:graphicFrameLocks xmlns:a="http://schemas.openxmlformats.org/drawingml/2006/main" noChangeAspect="1"/>
+            </wp:cNvGraphicFramePr>
+            <a:graphic xmlns:a="http://schemas.openxmlformats.org/drawingml/2006/main">
+              <a:graphicData uri="http://schemas.openxmlformats.org/drawingml/2006/picture">
+                <pic:pic xmlns:pic="http://schemas.openxmlformats.org/drawingml/2006/picture">
+                  <pic:nvPicPr>
+                    <pic:cNvPr id="951399934" name=""/>
+                    <pic:cNvPicPr/>
+                  </pic:nvPicPr>
+                  <pic:blipFill>
+                    <a:blip r:embed="rId20"/>
+                    <a:stretch>
+                      <a:fillRect/>
+                    </a:stretch>
+                  </pic:blipFill>
+                  <pic:spPr>
+                    <a:xfrm>
+                      <a:off x="0" y="0"/>
+                      <a:ext cx="3721100" cy="6172200"/>
+                    </a:xfrm>
+                    <a:prstGeom prst="rect">
+                      <a:avLst/>
+                    </a:prstGeom>
+                  </pic:spPr>
+                </pic:pic>
+              </a:graphicData>
+            </a:graphic>
+          </wp:inline>
+        </w:drawing>
+      </w:r>
     </w:p>
     <w:p>
       <w:pPr>
@@ -769,361 +1560,92 @@
           <w:lang w:val="en-US" w:eastAsia="ja-JP"/>
         </w:rPr>
       </w:pPr>
-      <w:r>
-        <w:rPr>
-          <w:rFonts w:asciiTheme="minorHAnsi" w:hAnsiTheme="minorHAnsi" w:cstheme="minorBidi"/>
-          <w:i/>
-          <w:iCs/>
-          <w:color w:val="5F5F5F" w:themeColor="text2" w:themeTint="BF"/>
-          <w:sz w:val="24"/>
-          <w:szCs w:val="24"/>
-          <w:lang w:val="en-US" w:eastAsia="ja-JP"/>
-        </w:rPr>
-        <w:t>Instruction: Describe the testing process you followed to ensure that:</w:t>
-      </w:r>
     </w:p>
     <w:p>
       <w:pPr>
-        <w:pStyle w:val="RTOWorksBodyText"/>
-        <w:numPr>
-          <w:ilvl w:val="0"/>
-          <w:numId w:val="4"/>
-        </w:numPr>
-        <w:rPr>
-          <w:rFonts w:asciiTheme="minorHAnsi" w:hAnsiTheme="minorHAnsi" w:cstheme="minorBidi"/>
-          <w:i/>
-          <w:iCs/>
-          <w:color w:val="5F5F5F" w:themeColor="text2" w:themeTint="BF"/>
-          <w:sz w:val="24"/>
-          <w:szCs w:val="24"/>
-          <w:lang w:val="en-US" w:eastAsia="ja-JP"/>
-        </w:rPr>
-      </w:pPr>
-      <w:r>
-        <w:rPr>
-          <w:rFonts w:asciiTheme="minorHAnsi" w:hAnsiTheme="minorHAnsi" w:cstheme="minorBidi"/>
-          <w:i/>
-          <w:iCs/>
-          <w:color w:val="5F5F5F" w:themeColor="text2" w:themeTint="BF"/>
-          <w:sz w:val="24"/>
-          <w:szCs w:val="24"/>
-          <w:lang w:val="en-US" w:eastAsia="ja-JP"/>
-        </w:rPr>
-        <w:t>The website is functional</w:t>
-      </w:r>
-    </w:p>
-    <w:p>
-      <w:pPr>
-        <w:pStyle w:val="RTOWorksBodyText"/>
-        <w:numPr>
-          <w:ilvl w:val="0"/>
-          <w:numId w:val="4"/>
-        </w:numPr>
-        <w:rPr>
-          <w:rFonts w:asciiTheme="minorHAnsi" w:hAnsiTheme="minorHAnsi" w:cstheme="minorBidi"/>
-          <w:i/>
-          <w:iCs/>
-          <w:color w:val="5F5F5F" w:themeColor="text2" w:themeTint="BF"/>
-          <w:sz w:val="24"/>
-          <w:szCs w:val="24"/>
-          <w:lang w:val="en-US" w:eastAsia="ja-JP"/>
-        </w:rPr>
-      </w:pPr>
-      <w:r>
-        <w:rPr>
-          <w:rFonts w:asciiTheme="minorHAnsi" w:hAnsiTheme="minorHAnsi" w:cstheme="minorBidi"/>
-          <w:i/>
-          <w:iCs/>
-          <w:color w:val="5F5F5F" w:themeColor="text2" w:themeTint="BF"/>
-          <w:sz w:val="24"/>
-          <w:szCs w:val="24"/>
-          <w:lang w:val="en-US" w:eastAsia="ja-JP"/>
-        </w:rPr>
-        <w:t>The website is functional after the change you made</w:t>
-      </w:r>
-    </w:p>
-    <w:p>
-      <w:pPr>
-        <w:pStyle w:val="RTOWorksBodyText"/>
-        <w:numPr>
-          <w:ilvl w:val="0"/>
-          <w:numId w:val="4"/>
-        </w:numPr>
-        <w:rPr>
-          <w:rFonts w:asciiTheme="minorHAnsi" w:hAnsiTheme="minorHAnsi" w:cstheme="minorBidi"/>
-          <w:i/>
-          <w:iCs/>
-          <w:color w:val="5F5F5F" w:themeColor="text2" w:themeTint="BF"/>
-          <w:sz w:val="24"/>
-          <w:szCs w:val="24"/>
-          <w:lang w:val="en-US" w:eastAsia="ja-JP"/>
-        </w:rPr>
-      </w:pPr>
-      <w:r>
-        <w:rPr>
-          <w:rFonts w:asciiTheme="minorHAnsi" w:hAnsiTheme="minorHAnsi" w:cstheme="minorBidi"/>
-          <w:i/>
-          <w:iCs/>
-          <w:color w:val="5F5F5F" w:themeColor="text2" w:themeTint="BF"/>
-          <w:sz w:val="24"/>
-          <w:szCs w:val="24"/>
-          <w:lang w:val="en-US" w:eastAsia="ja-JP"/>
-        </w:rPr>
-        <w:t>The website complies with cyber security procedures. Describe how you follow the procedures.</w:t>
-      </w:r>
-    </w:p>
-    <w:p/>
-    <w:p>
-      <w:pPr>
-        <w:rPr>
-          <w:rFonts w:asciiTheme="majorHAnsi" w:eastAsiaTheme="majorEastAsia" w:hAnsiTheme="majorHAnsi" w:cstheme="majorBidi"/>
-          <w:b/>
-          <w:caps/>
-          <w:color w:val="2A2A2A" w:themeColor="text2"/>
-          <w:sz w:val="90"/>
-          <w:szCs w:val="32"/>
-        </w:rPr>
-      </w:pPr>
-      <w:r>
-        <w:br w:type="page"/>
-      </w:r>
-    </w:p>
-    <w:p>
-      <w:pPr>
-        <w:pStyle w:val="Heading1"/>
-      </w:pPr>
-      <w:bookmarkStart w:id="3" w:name="_Toc84508554"/>
+        <w:pStyle w:val="Heading2"/>
+      </w:pPr>
+      <w:bookmarkStart w:id="6" w:name="_Toc84508557"/>
       <w:r>
         <w:lastRenderedPageBreak/>
-        <w:t>XML document Testing</w:t>
-      </w:r>
-      <w:bookmarkEnd w:id="3"/>
-    </w:p>
-    <w:p>
-      <w:pPr>
-        <w:pStyle w:val="Heading2"/>
-      </w:pPr>
-      <w:bookmarkStart w:id="4" w:name="_Toc84508555"/>
-      <w:r>
-        <w:t>Offline testing</w:t>
-      </w:r>
-      <w:bookmarkEnd w:id="4"/>
-    </w:p>
-    <w:p>
-      <w:pPr>
-        <w:pStyle w:val="RTOWorksBodyText"/>
-        <w:rPr>
-          <w:rFonts w:asciiTheme="minorHAnsi" w:hAnsiTheme="minorHAnsi" w:cstheme="minorBidi"/>
-          <w:i/>
-          <w:iCs/>
-          <w:color w:val="5F5F5F" w:themeColor="text2" w:themeTint="BF"/>
-          <w:sz w:val="24"/>
-          <w:szCs w:val="24"/>
-          <w:lang w:val="en-US" w:eastAsia="ja-JP"/>
-        </w:rPr>
-      </w:pPr>
-      <w:r>
-        <w:rPr>
-          <w:rFonts w:asciiTheme="minorHAnsi" w:hAnsiTheme="minorHAnsi" w:cstheme="minorBidi"/>
-          <w:i/>
-          <w:iCs/>
-          <w:color w:val="5F5F5F" w:themeColor="text2" w:themeTint="BF"/>
-          <w:sz w:val="24"/>
-          <w:szCs w:val="24"/>
-          <w:lang w:val="en-US" w:eastAsia="ja-JP"/>
-        </w:rPr>
-        <w:t>Instruction: You are to test both of your XML documents offline to check if they are working on two different browsers. Provide the name of the browsers.</w:t>
-      </w:r>
-    </w:p>
-    <w:p>
-      <w:pPr>
-        <w:pStyle w:val="RTOWorksBodyText"/>
-        <w:rPr>
-          <w:rFonts w:asciiTheme="minorHAnsi" w:hAnsiTheme="minorHAnsi" w:cstheme="minorBidi"/>
-          <w:i/>
-          <w:iCs/>
-          <w:color w:val="5F5F5F" w:themeColor="text2" w:themeTint="BF"/>
-          <w:sz w:val="24"/>
-          <w:szCs w:val="24"/>
-          <w:lang w:val="en-US" w:eastAsia="ja-JP"/>
-        </w:rPr>
-      </w:pPr>
-      <w:r>
-        <w:rPr>
-          <w:rFonts w:asciiTheme="minorHAnsi" w:hAnsiTheme="minorHAnsi" w:cstheme="minorBidi"/>
-          <w:i/>
-          <w:iCs/>
-          <w:color w:val="5F5F5F" w:themeColor="text2" w:themeTint="BF"/>
-          <w:sz w:val="24"/>
-          <w:szCs w:val="24"/>
-          <w:lang w:val="en-US" w:eastAsia="ja-JP"/>
-        </w:rPr>
-        <w:t>Describe the testing process you undertook and paste the screens</w:t>
-      </w:r>
-      <w:r>
-        <w:rPr>
-          <w:rFonts w:asciiTheme="minorHAnsi" w:hAnsiTheme="minorHAnsi" w:cstheme="minorBidi"/>
-          <w:i/>
-          <w:iCs/>
-          <w:color w:val="5F5F5F" w:themeColor="text2" w:themeTint="BF"/>
-          <w:sz w:val="24"/>
-          <w:szCs w:val="24"/>
-          <w:lang w:val="en-US" w:eastAsia="ja-JP"/>
-        </w:rPr>
-        <w:t>hots below.</w:t>
-      </w:r>
-    </w:p>
-    <w:p>
-      <w:pPr>
-        <w:pStyle w:val="RTOWorksBullet1"/>
-        <w:tabs>
-          <w:tab w:val="clear" w:pos="0"/>
-        </w:tabs>
-        <w:rPr>
-          <w:rFonts w:asciiTheme="majorHAnsi" w:hAnsiTheme="majorHAnsi" w:cstheme="majorBidi"/>
-          <w:b/>
-          <w:i/>
-          <w:caps/>
-          <w:color w:val="2A2A2A" w:themeColor="text2"/>
-          <w:sz w:val="28"/>
-          <w:szCs w:val="26"/>
-          <w:lang w:val="en-US" w:eastAsia="ja-JP"/>
-        </w:rPr>
-      </w:pPr>
-    </w:p>
-    <w:p>
-      <w:pPr>
-        <w:pStyle w:val="Heading2"/>
-      </w:pPr>
-      <w:bookmarkStart w:id="5" w:name="_Toc84508556"/>
-      <w:r>
-        <w:t>Device testing</w:t>
-      </w:r>
-      <w:bookmarkEnd w:id="5"/>
-    </w:p>
-    <w:p>
-      <w:pPr>
-        <w:pStyle w:val="RTOWorksBodyText"/>
-        <w:rPr>
-          <w:rFonts w:asciiTheme="minorHAnsi" w:hAnsiTheme="minorHAnsi" w:cstheme="minorBidi"/>
-          <w:iCs/>
-          <w:color w:val="5F5F5F" w:themeColor="text2" w:themeTint="BF"/>
-          <w:sz w:val="24"/>
-          <w:szCs w:val="24"/>
-          <w:lang w:val="en-US" w:eastAsia="ja-JP"/>
-        </w:rPr>
-      </w:pPr>
-      <w:r>
-        <w:rPr>
-          <w:rFonts w:asciiTheme="minorHAnsi" w:hAnsiTheme="minorHAnsi" w:cstheme="minorBidi"/>
-          <w:i/>
-          <w:iCs/>
-          <w:color w:val="5F5F5F" w:themeColor="text2" w:themeTint="BF"/>
-          <w:sz w:val="24"/>
-          <w:szCs w:val="24"/>
-          <w:lang w:val="en-US" w:eastAsia="ja-JP"/>
-        </w:rPr>
-        <w:t>Instruction: Test that data from xml documents appear in menu and contact page on laptop and mobile phone. Paste screenshot below.</w:t>
-      </w:r>
-    </w:p>
-    <w:p>
-      <w:pPr>
-        <w:pStyle w:val="RTOWorksBodyText"/>
-        <w:rPr>
-          <w:rFonts w:asciiTheme="minorHAnsi" w:hAnsiTheme="minorHAnsi" w:cstheme="minorBidi"/>
-          <w:iCs/>
-          <w:color w:val="5F5F5F" w:themeColor="text2" w:themeTint="BF"/>
-          <w:sz w:val="24"/>
-          <w:szCs w:val="24"/>
-          <w:lang w:val="en-US" w:eastAsia="ja-JP"/>
-        </w:rPr>
-      </w:pPr>
-    </w:p>
-    <w:p>
-      <w:pPr>
-        <w:pStyle w:val="Heading2"/>
-      </w:pPr>
-      <w:bookmarkStart w:id="6" w:name="_Toc84508557"/>
-      <w:r>
         <w:t>Online testing</w:t>
       </w:r>
       <w:bookmarkEnd w:id="6"/>
     </w:p>
     <w:p>
       <w:pPr>
-        <w:pStyle w:val="RTOWorksBodyText"/>
-        <w:rPr>
-          <w:rFonts w:asciiTheme="minorHAnsi" w:hAnsiTheme="minorHAnsi" w:cstheme="minorBidi"/>
-          <w:i/>
-          <w:iCs/>
-          <w:color w:val="5F5F5F" w:themeColor="text2" w:themeTint="BF"/>
-          <w:sz w:val="24"/>
-          <w:szCs w:val="24"/>
-          <w:lang w:val="en-US" w:eastAsia="ja-JP"/>
-        </w:rPr>
+        <w:pStyle w:val="RTOWorksBullet1"/>
+        <w:tabs>
+          <w:tab w:val="clear" w:pos="0"/>
+        </w:tabs>
+        <w:ind w:left="0" w:firstLine="0"/>
       </w:pPr>
       <w:r>
         <w:rPr>
-          <w:rFonts w:asciiTheme="minorHAnsi" w:hAnsiTheme="minorHAnsi" w:cstheme="minorBidi"/>
-          <w:i/>
-          <w:iCs/>
-          <w:color w:val="5F5F5F" w:themeColor="text2" w:themeTint="BF"/>
-          <w:sz w:val="24"/>
-          <w:szCs w:val="24"/>
-          <w:lang w:val="en-US" w:eastAsia="ja-JP"/>
+          <w:noProof/>
         </w:rPr>
-        <w:t>Instruction: You are to host your website and test both of your XML documents onl</w:t>
-      </w:r>
-      <w:r>
-        <w:rPr>
-          <w:rFonts w:asciiTheme="minorHAnsi" w:hAnsiTheme="minorHAnsi" w:cstheme="minorBidi"/>
-          <w:i/>
-          <w:iCs/>
-          <w:color w:val="5F5F5F" w:themeColor="text2" w:themeTint="BF"/>
-          <w:sz w:val="24"/>
-          <w:szCs w:val="24"/>
-          <w:lang w:val="en-US" w:eastAsia="ja-JP"/>
-        </w:rPr>
-        <w:t>ine to check if they are working.</w:t>
+        <w:drawing>
+          <wp:inline distT="0" distB="0" distL="0" distR="0" wp14:anchorId="26CDEB57" wp14:editId="7C4904B5">
+            <wp:extent cx="5274310" cy="2903855"/>
+            <wp:effectExtent l="0" t="0" r="0" b="0"/>
+            <wp:docPr id="756897069" name="Picture 4"/>
+            <wp:cNvGraphicFramePr>
+              <a:graphicFrameLocks xmlns:a="http://schemas.openxmlformats.org/drawingml/2006/main" noChangeAspect="1"/>
+            </wp:cNvGraphicFramePr>
+            <a:graphic xmlns:a="http://schemas.openxmlformats.org/drawingml/2006/main">
+              <a:graphicData uri="http://schemas.openxmlformats.org/drawingml/2006/picture">
+                <pic:pic xmlns:pic="http://schemas.openxmlformats.org/drawingml/2006/picture">
+                  <pic:nvPicPr>
+                    <pic:cNvPr id="756897069" name="Picture 756897069"/>
+                    <pic:cNvPicPr/>
+                  </pic:nvPicPr>
+                  <pic:blipFill>
+                    <a:blip r:embed="rId21" cstate="print">
+                      <a:extLst>
+                        <a:ext uri="{28A0092B-C50C-407E-A947-70E740481C1C}">
+                          <a14:useLocalDpi xmlns:a14="http://schemas.microsoft.com/office/drawing/2010/main" val="0"/>
+                        </a:ext>
+                      </a:extLst>
+                    </a:blip>
+                    <a:stretch>
+                      <a:fillRect/>
+                    </a:stretch>
+                  </pic:blipFill>
+                  <pic:spPr>
+                    <a:xfrm>
+                      <a:off x="0" y="0"/>
+                      <a:ext cx="5274310" cy="2903855"/>
+                    </a:xfrm>
+                    <a:prstGeom prst="rect">
+                      <a:avLst/>
+                    </a:prstGeom>
+                  </pic:spPr>
+                </pic:pic>
+              </a:graphicData>
+            </a:graphic>
+          </wp:inline>
+        </w:drawing>
       </w:r>
     </w:p>
     <w:p>
       <w:pPr>
-        <w:pStyle w:val="RTOWorksBodyText"/>
-        <w:rPr>
-          <w:rFonts w:asciiTheme="minorHAnsi" w:hAnsiTheme="minorHAnsi" w:cstheme="minorBidi"/>
-          <w:i/>
-          <w:iCs/>
-          <w:color w:val="5F5F5F" w:themeColor="text2" w:themeTint="BF"/>
-          <w:sz w:val="24"/>
-          <w:szCs w:val="24"/>
-          <w:lang w:val="en-US" w:eastAsia="ja-JP"/>
-        </w:rPr>
-      </w:pPr>
-      <w:r>
-        <w:rPr>
-          <w:rFonts w:asciiTheme="minorHAnsi" w:hAnsiTheme="minorHAnsi" w:cstheme="minorBidi"/>
-          <w:i/>
-          <w:iCs/>
-          <w:color w:val="5F5F5F" w:themeColor="text2" w:themeTint="BF"/>
-          <w:sz w:val="24"/>
-          <w:szCs w:val="24"/>
-          <w:lang w:val="en-US" w:eastAsia="ja-JP"/>
-        </w:rPr>
-        <w:t>Provide screenshots and links to your menu and contact pages below. Note that at least one screenshot should include the domain name in the address bar.</w:t>
-      </w:r>
-    </w:p>
-    <w:p>
-      <w:pPr>
         <w:pStyle w:val="RTOWorksBullet1"/>
         <w:tabs>
           <w:tab w:val="clear" w:pos="0"/>
         </w:tabs>
         <w:ind w:left="0" w:firstLine="0"/>
       </w:pPr>
+      <w:hyperlink r:id="rId22" w:history="1">
+        <w:r>
+          <w:rPr>
+            <w:rStyle w:val="Hyperlink"/>
+          </w:rPr>
+          <w:t>https://josejairruiz-cyber.github.io/bryanCafe/index.html</w:t>
+        </w:r>
+      </w:hyperlink>
     </w:p>
     <w:sectPr>
-      <w:footerReference w:type="default" r:id="rId13"/>
+      <w:footerReference w:type="default" r:id="rId23"/>
       <w:pgSz w:w="11906" w:h="16838"/>
       <w:pgMar w:top="1440" w:right="1800" w:bottom="1440" w:left="1800" w:header="0" w:footer="720" w:gutter="0"/>
       <w:pgNumType w:start="1"/>
@@ -1137,8 +1659,8 @@
 </file>
 
 <file path=word/endnotes.xml><?xml version="1.0" encoding="utf-8"?>
-<w:endnotes xmlns:ve="http://schemas.openxmlformats.org/markup-compatibility/2006" xmlns:o="urn:schemas-microsoft-com:office:office" xmlns:r="http://schemas.openxmlformats.org/officeDocument/2006/relationships" xmlns:m="http://schemas.openxmlformats.org/officeDocument/2006/math" xmlns:v="urn:schemas-microsoft-com:vml" xmlns:wp="http://schemas.openxmlformats.org/drawingml/2006/wordprocessingDrawing" xmlns:w10="urn:schemas-microsoft-com:office:word" xmlns:w="http://schemas.openxmlformats.org/wordprocessingml/2006/main" xmlns:wne="http://schemas.microsoft.com/office/word/2006/wordml">
-  <w:endnote w:type="separator" w:id="0">
+<w:endnotes xmlns:wpc="http://schemas.microsoft.com/office/word/2010/wordprocessingCanvas" xmlns:cx="http://schemas.microsoft.com/office/drawing/2014/chartex" xmlns:cx1="http://schemas.microsoft.com/office/drawing/2015/9/8/chartex" xmlns:cx2="http://schemas.microsoft.com/office/drawing/2015/10/21/chartex" xmlns:cx3="http://schemas.microsoft.com/office/drawing/2016/5/9/chartex" xmlns:cx4="http://schemas.microsoft.com/office/drawing/2016/5/10/chartex" xmlns:cx5="http://schemas.microsoft.com/office/drawing/2016/5/11/chartex" xmlns:cx6="http://schemas.microsoft.com/office/drawing/2016/5/12/chartex" xmlns:cx7="http://schemas.microsoft.com/office/drawing/2016/5/13/chartex" xmlns:cx8="http://schemas.microsoft.com/office/drawing/2016/5/14/chartex" xmlns:mc="http://schemas.openxmlformats.org/markup-compatibility/2006" xmlns:aink="http://schemas.microsoft.com/office/drawing/2016/ink" xmlns:am3d="http://schemas.microsoft.com/office/drawing/2017/model3d" xmlns:o="urn:schemas-microsoft-com:office:office" xmlns:oel="http://schemas.microsoft.com/office/2019/extlst" xmlns:r="http://schemas.openxmlformats.org/officeDocument/2006/relationships" xmlns:m="http://schemas.openxmlformats.org/officeDocument/2006/math" xmlns:v="urn:schemas-microsoft-com:vml" xmlns:wp14="http://schemas.microsoft.com/office/word/2010/wordprocessingDrawing" xmlns:wp="http://schemas.openxmlformats.org/drawingml/2006/wordprocessingDrawing" xmlns:w10="urn:schemas-microsoft-com:office:word" xmlns:w="http://schemas.openxmlformats.org/wordprocessingml/2006/main" xmlns:w14="http://schemas.microsoft.com/office/word/2010/wordml" xmlns:w15="http://schemas.microsoft.com/office/word/2012/wordml" xmlns:w16cex="http://schemas.microsoft.com/office/word/2018/wordml/cex" xmlns:w16cid="http://schemas.microsoft.com/office/word/2016/wordml/cid" xmlns:w16="http://schemas.microsoft.com/office/word/2018/wordml" xmlns:w16du="http://schemas.microsoft.com/office/word/2023/wordml/word16du" xmlns:w16sdtdh="http://schemas.microsoft.com/office/word/2020/wordml/sdtdatahash" xmlns:w16sdtfl="http://schemas.microsoft.com/office/word/2024/wordml/sdtformatlock" xmlns:w16se="http://schemas.microsoft.com/office/word/2015/wordml/symex" xmlns:wpg="http://schemas.microsoft.com/office/word/2010/wordprocessingGroup" xmlns:wpi="http://schemas.microsoft.com/office/word/2010/wordprocessingInk" xmlns:wne="http://schemas.microsoft.com/office/word/2006/wordml" xmlns:wps="http://schemas.microsoft.com/office/word/2010/wordprocessingShape" mc:Ignorable="w14 w15 w16se w16cid w16 w16cex w16sdtdh w16sdtfl w16du wp14">
+  <w:endnote w:type="separator" w:id="-1">
     <w:p>
       <w:pPr>
         <w:spacing w:after="0" w:line="240" w:lineRule="auto"/>
@@ -1148,7 +1670,7 @@
       </w:r>
     </w:p>
   </w:endnote>
-  <w:endnote w:type="continuationSeparator" w:id="1">
+  <w:endnote w:type="continuationSeparator" w:id="0">
     <w:p>
       <w:pPr>
         <w:spacing w:after="0" w:line="240" w:lineRule="auto"/>
@@ -1162,7 +1684,7 @@
 </file>
 
 <file path=word/footer1.xml><?xml version="1.0" encoding="utf-8"?>
-<w:ftr xmlns:ve="http://schemas.openxmlformats.org/markup-compatibility/2006" xmlns:o="urn:schemas-microsoft-com:office:office" xmlns:r="http://schemas.openxmlformats.org/officeDocument/2006/relationships" xmlns:m="http://schemas.openxmlformats.org/officeDocument/2006/math" xmlns:v="urn:schemas-microsoft-com:vml" xmlns:wp="http://schemas.openxmlformats.org/drawingml/2006/wordprocessingDrawing" xmlns:w10="urn:schemas-microsoft-com:office:word" xmlns:w="http://schemas.openxmlformats.org/wordprocessingml/2006/main" xmlns:wne="http://schemas.microsoft.com/office/word/2006/wordml">
+<w:ftr xmlns:wpc="http://schemas.microsoft.com/office/word/2010/wordprocessingCanvas" xmlns:cx="http://schemas.microsoft.com/office/drawing/2014/chartex" xmlns:cx1="http://schemas.microsoft.com/office/drawing/2015/9/8/chartex" xmlns:cx2="http://schemas.microsoft.com/office/drawing/2015/10/21/chartex" xmlns:cx3="http://schemas.microsoft.com/office/drawing/2016/5/9/chartex" xmlns:cx4="http://schemas.microsoft.com/office/drawing/2016/5/10/chartex" xmlns:cx5="http://schemas.microsoft.com/office/drawing/2016/5/11/chartex" xmlns:cx6="http://schemas.microsoft.com/office/drawing/2016/5/12/chartex" xmlns:cx7="http://schemas.microsoft.com/office/drawing/2016/5/13/chartex" xmlns:cx8="http://schemas.microsoft.com/office/drawing/2016/5/14/chartex" xmlns:mc="http://schemas.openxmlformats.org/markup-compatibility/2006" xmlns:aink="http://schemas.microsoft.com/office/drawing/2016/ink" xmlns:am3d="http://schemas.microsoft.com/office/drawing/2017/model3d" xmlns:o="urn:schemas-microsoft-com:office:office" xmlns:oel="http://schemas.microsoft.com/office/2019/extlst" xmlns:r="http://schemas.openxmlformats.org/officeDocument/2006/relationships" xmlns:m="http://schemas.openxmlformats.org/officeDocument/2006/math" xmlns:v="urn:schemas-microsoft-com:vml" xmlns:wp14="http://schemas.microsoft.com/office/word/2010/wordprocessingDrawing" xmlns:wp="http://schemas.openxmlformats.org/drawingml/2006/wordprocessingDrawing" xmlns:w10="urn:schemas-microsoft-com:office:word" xmlns:w="http://schemas.openxmlformats.org/wordprocessingml/2006/main" xmlns:w14="http://schemas.microsoft.com/office/word/2010/wordml" xmlns:w15="http://schemas.microsoft.com/office/word/2012/wordml" xmlns:w16cex="http://schemas.microsoft.com/office/word/2018/wordml/cex" xmlns:w16cid="http://schemas.microsoft.com/office/word/2016/wordml/cid" xmlns:w16="http://schemas.microsoft.com/office/word/2018/wordml" xmlns:w16du="http://schemas.microsoft.com/office/word/2023/wordml/word16du" xmlns:w16sdtdh="http://schemas.microsoft.com/office/word/2020/wordml/sdtdatahash" xmlns:w16sdtfl="http://schemas.microsoft.com/office/word/2024/wordml/sdtformatlock" xmlns:w16se="http://schemas.microsoft.com/office/word/2015/wordml/symex" xmlns:wpg="http://schemas.microsoft.com/office/word/2010/wordprocessingGroup" xmlns:wpi="http://schemas.microsoft.com/office/word/2010/wordprocessingInk" xmlns:wne="http://schemas.microsoft.com/office/word/2006/wordml" xmlns:wps="http://schemas.microsoft.com/office/word/2010/wordprocessingShape" mc:Ignorable="w14 w15 w16se w16cid w16 w16cex w16sdtdh w16sdtfl w16du wp14">
   <w:sdt>
     <w:sdtPr>
       <w:id w:val="1709211399"/>
@@ -1180,10 +1702,7 @@
           <w:fldChar w:fldCharType="begin"/>
         </w:r>
         <w:r>
-          <w:instrText xml:space="preserve"> P</w:instrText>
-        </w:r>
-        <w:r>
-          <w:instrText xml:space="preserve">AGE </w:instrText>
+          <w:instrText xml:space="preserve"> PAGE </w:instrText>
         </w:r>
         <w:r>
           <w:fldChar w:fldCharType="separate"/>
@@ -1204,8 +1723,8 @@
 </file>
 
 <file path=word/footnotes.xml><?xml version="1.0" encoding="utf-8"?>
-<w:footnotes xmlns:ve="http://schemas.openxmlformats.org/markup-compatibility/2006" xmlns:o="urn:schemas-microsoft-com:office:office" xmlns:r="http://schemas.openxmlformats.org/officeDocument/2006/relationships" xmlns:m="http://schemas.openxmlformats.org/officeDocument/2006/math" xmlns:v="urn:schemas-microsoft-com:vml" xmlns:wp="http://schemas.openxmlformats.org/drawingml/2006/wordprocessingDrawing" xmlns:w10="urn:schemas-microsoft-com:office:word" xmlns:w="http://schemas.openxmlformats.org/wordprocessingml/2006/main" xmlns:wne="http://schemas.microsoft.com/office/word/2006/wordml">
-  <w:footnote w:type="separator" w:id="0">
+<w:footnotes xmlns:wpc="http://schemas.microsoft.com/office/word/2010/wordprocessingCanvas" xmlns:cx="http://schemas.microsoft.com/office/drawing/2014/chartex" xmlns:cx1="http://schemas.microsoft.com/office/drawing/2015/9/8/chartex" xmlns:cx2="http://schemas.microsoft.com/office/drawing/2015/10/21/chartex" xmlns:cx3="http://schemas.microsoft.com/office/drawing/2016/5/9/chartex" xmlns:cx4="http://schemas.microsoft.com/office/drawing/2016/5/10/chartex" xmlns:cx5="http://schemas.microsoft.com/office/drawing/2016/5/11/chartex" xmlns:cx6="http://schemas.microsoft.com/office/drawing/2016/5/12/chartex" xmlns:cx7="http://schemas.microsoft.com/office/drawing/2016/5/13/chartex" xmlns:cx8="http://schemas.microsoft.com/office/drawing/2016/5/14/chartex" xmlns:mc="http://schemas.openxmlformats.org/markup-compatibility/2006" xmlns:aink="http://schemas.microsoft.com/office/drawing/2016/ink" xmlns:am3d="http://schemas.microsoft.com/office/drawing/2017/model3d" xmlns:o="urn:schemas-microsoft-com:office:office" xmlns:oel="http://schemas.microsoft.com/office/2019/extlst" xmlns:r="http://schemas.openxmlformats.org/officeDocument/2006/relationships" xmlns:m="http://schemas.openxmlformats.org/officeDocument/2006/math" xmlns:v="urn:schemas-microsoft-com:vml" xmlns:wp14="http://schemas.microsoft.com/office/word/2010/wordprocessingDrawing" xmlns:wp="http://schemas.openxmlformats.org/drawingml/2006/wordprocessingDrawing" xmlns:w10="urn:schemas-microsoft-com:office:word" xmlns:w="http://schemas.openxmlformats.org/wordprocessingml/2006/main" xmlns:w14="http://schemas.microsoft.com/office/word/2010/wordml" xmlns:w15="http://schemas.microsoft.com/office/word/2012/wordml" xmlns:w16cex="http://schemas.microsoft.com/office/word/2018/wordml/cex" xmlns:w16cid="http://schemas.microsoft.com/office/word/2016/wordml/cid" xmlns:w16="http://schemas.microsoft.com/office/word/2018/wordml" xmlns:w16du="http://schemas.microsoft.com/office/word/2023/wordml/word16du" xmlns:w16sdtdh="http://schemas.microsoft.com/office/word/2020/wordml/sdtdatahash" xmlns:w16sdtfl="http://schemas.microsoft.com/office/word/2024/wordml/sdtformatlock" xmlns:w16se="http://schemas.microsoft.com/office/word/2015/wordml/symex" xmlns:wpg="http://schemas.microsoft.com/office/word/2010/wordprocessingGroup" xmlns:wpi="http://schemas.microsoft.com/office/word/2010/wordprocessingInk" xmlns:wne="http://schemas.microsoft.com/office/word/2006/wordml" xmlns:wps="http://schemas.microsoft.com/office/word/2010/wordprocessingShape" mc:Ignorable="w14 w15 w16se w16cid w16 w16cex w16sdtdh w16sdtfl w16du wp14">
+  <w:footnote w:type="separator" w:id="-1">
     <w:p>
       <w:pPr>
         <w:spacing w:after="0" w:line="240" w:lineRule="auto"/>
@@ -1215,7 +1734,7 @@
       </w:r>
     </w:p>
   </w:footnote>
-  <w:footnote w:type="continuationSeparator" w:id="1">
+  <w:footnote w:type="continuationSeparator" w:id="0">
     <w:p>
       <w:pPr>
         <w:spacing w:after="0" w:line="240" w:lineRule="auto"/>
@@ -1229,8 +1748,8 @@
 </file>
 
 <file path=word/numbering.xml><?xml version="1.0" encoding="utf-8"?>
-<w:numbering xmlns:ve="http://schemas.openxmlformats.org/markup-compatibility/2006" xmlns:o="urn:schemas-microsoft-com:office:office" xmlns:r="http://schemas.openxmlformats.org/officeDocument/2006/relationships" xmlns:m="http://schemas.openxmlformats.org/officeDocument/2006/math" xmlns:v="urn:schemas-microsoft-com:vml" xmlns:wp="http://schemas.openxmlformats.org/drawingml/2006/wordprocessingDrawing" xmlns:w10="urn:schemas-microsoft-com:office:word" xmlns:w="http://schemas.openxmlformats.org/wordprocessingml/2006/main" xmlns:wne="http://schemas.microsoft.com/office/word/2006/wordml">
-  <w:abstractNum w:abstractNumId="0">
+<w:numbering xmlns:wpc="http://schemas.microsoft.com/office/word/2010/wordprocessingCanvas" xmlns:cx="http://schemas.microsoft.com/office/drawing/2014/chartex" xmlns:cx1="http://schemas.microsoft.com/office/drawing/2015/9/8/chartex" xmlns:cx2="http://schemas.microsoft.com/office/drawing/2015/10/21/chartex" xmlns:cx3="http://schemas.microsoft.com/office/drawing/2016/5/9/chartex" xmlns:cx4="http://schemas.microsoft.com/office/drawing/2016/5/10/chartex" xmlns:cx5="http://schemas.microsoft.com/office/drawing/2016/5/11/chartex" xmlns:cx6="http://schemas.microsoft.com/office/drawing/2016/5/12/chartex" xmlns:cx7="http://schemas.microsoft.com/office/drawing/2016/5/13/chartex" xmlns:cx8="http://schemas.microsoft.com/office/drawing/2016/5/14/chartex" xmlns:mc="http://schemas.openxmlformats.org/markup-compatibility/2006" xmlns:aink="http://schemas.microsoft.com/office/drawing/2016/ink" xmlns:am3d="http://schemas.microsoft.com/office/drawing/2017/model3d" xmlns:o="urn:schemas-microsoft-com:office:office" xmlns:oel="http://schemas.microsoft.com/office/2019/extlst" xmlns:r="http://schemas.openxmlformats.org/officeDocument/2006/relationships" xmlns:m="http://schemas.openxmlformats.org/officeDocument/2006/math" xmlns:v="urn:schemas-microsoft-com:vml" xmlns:wp14="http://schemas.microsoft.com/office/word/2010/wordprocessingDrawing" xmlns:wp="http://schemas.openxmlformats.org/drawingml/2006/wordprocessingDrawing" xmlns:w10="urn:schemas-microsoft-com:office:word" xmlns:w="http://schemas.openxmlformats.org/wordprocessingml/2006/main" xmlns:w14="http://schemas.microsoft.com/office/word/2010/wordml" xmlns:w15="http://schemas.microsoft.com/office/word/2012/wordml" xmlns:w16cex="http://schemas.microsoft.com/office/word/2018/wordml/cex" xmlns:w16cid="http://schemas.microsoft.com/office/word/2016/wordml/cid" xmlns:w16="http://schemas.microsoft.com/office/word/2018/wordml" xmlns:w16du="http://schemas.microsoft.com/office/word/2023/wordml/word16du" xmlns:w16sdtdh="http://schemas.microsoft.com/office/word/2020/wordml/sdtdatahash" xmlns:w16sdtfl="http://schemas.microsoft.com/office/word/2024/wordml/sdtformatlock" xmlns:w16se="http://schemas.microsoft.com/office/word/2015/wordml/symex" xmlns:wpg="http://schemas.microsoft.com/office/word/2010/wordprocessingGroup" xmlns:wpi="http://schemas.microsoft.com/office/word/2010/wordprocessingInk" xmlns:wne="http://schemas.microsoft.com/office/word/2006/wordml" xmlns:wps="http://schemas.microsoft.com/office/word/2010/wordprocessingShape" mc:Ignorable="w14 w15 w16se w16cid w16 w16cex w16sdtdh w16sdtfl w16du wp14">
+  <w:abstractNum w:abstractNumId="0" w15:restartNumberingAfterBreak="0">
     <w:nsid w:val="26996B1C"/>
     <w:multiLevelType w:val="multilevel"/>
     <w:tmpl w:val="C962708A"/>
@@ -1343,7 +1862,120 @@
       </w:pPr>
     </w:lvl>
   </w:abstractNum>
-  <w:abstractNum w:abstractNumId="1">
+  <w:abstractNum w:abstractNumId="1" w15:restartNumberingAfterBreak="0">
+    <w:nsid w:val="28034035"/>
+    <w:multiLevelType w:val="hybridMultilevel"/>
+    <w:tmpl w:val="DF88F2A2"/>
+    <w:lvl w:ilvl="0" w:tplc="08090001">
+      <w:start w:val="1"/>
+      <w:numFmt w:val="bullet"/>
+      <w:lvlText w:val=""/>
+      <w:lvlJc w:val="left"/>
+      <w:pPr>
+        <w:ind w:left="720" w:hanging="360"/>
+      </w:pPr>
+      <w:rPr>
+        <w:rFonts w:ascii="Symbol" w:hAnsi="Symbol" w:hint="default"/>
+      </w:rPr>
+    </w:lvl>
+    <w:lvl w:ilvl="1" w:tplc="08090003" w:tentative="1">
+      <w:start w:val="1"/>
+      <w:numFmt w:val="bullet"/>
+      <w:lvlText w:val="o"/>
+      <w:lvlJc w:val="left"/>
+      <w:pPr>
+        <w:ind w:left="1440" w:hanging="360"/>
+      </w:pPr>
+      <w:rPr>
+        <w:rFonts w:ascii="Courier New" w:hAnsi="Courier New" w:cs="Courier New" w:hint="default"/>
+      </w:rPr>
+    </w:lvl>
+    <w:lvl w:ilvl="2" w:tplc="08090005" w:tentative="1">
+      <w:start w:val="1"/>
+      <w:numFmt w:val="bullet"/>
+      <w:lvlText w:val=""/>
+      <w:lvlJc w:val="left"/>
+      <w:pPr>
+        <w:ind w:left="2160" w:hanging="360"/>
+      </w:pPr>
+      <w:rPr>
+        <w:rFonts w:ascii="Wingdings" w:hAnsi="Wingdings" w:hint="default"/>
+      </w:rPr>
+    </w:lvl>
+    <w:lvl w:ilvl="3" w:tplc="08090001" w:tentative="1">
+      <w:start w:val="1"/>
+      <w:numFmt w:val="bullet"/>
+      <w:lvlText w:val=""/>
+      <w:lvlJc w:val="left"/>
+      <w:pPr>
+        <w:ind w:left="2880" w:hanging="360"/>
+      </w:pPr>
+      <w:rPr>
+        <w:rFonts w:ascii="Symbol" w:hAnsi="Symbol" w:hint="default"/>
+      </w:rPr>
+    </w:lvl>
+    <w:lvl w:ilvl="4" w:tplc="08090003" w:tentative="1">
+      <w:start w:val="1"/>
+      <w:numFmt w:val="bullet"/>
+      <w:lvlText w:val="o"/>
+      <w:lvlJc w:val="left"/>
+      <w:pPr>
+        <w:ind w:left="3600" w:hanging="360"/>
+      </w:pPr>
+      <w:rPr>
+        <w:rFonts w:ascii="Courier New" w:hAnsi="Courier New" w:cs="Courier New" w:hint="default"/>
+      </w:rPr>
+    </w:lvl>
+    <w:lvl w:ilvl="5" w:tplc="08090005" w:tentative="1">
+      <w:start w:val="1"/>
+      <w:numFmt w:val="bullet"/>
+      <w:lvlText w:val=""/>
+      <w:lvlJc w:val="left"/>
+      <w:pPr>
+        <w:ind w:left="4320" w:hanging="360"/>
+      </w:pPr>
+      <w:rPr>
+        <w:rFonts w:ascii="Wingdings" w:hAnsi="Wingdings" w:hint="default"/>
+      </w:rPr>
+    </w:lvl>
+    <w:lvl w:ilvl="6" w:tplc="08090001" w:tentative="1">
+      <w:start w:val="1"/>
+      <w:numFmt w:val="bullet"/>
+      <w:lvlText w:val=""/>
+      <w:lvlJc w:val="left"/>
+      <w:pPr>
+        <w:ind w:left="5040" w:hanging="360"/>
+      </w:pPr>
+      <w:rPr>
+        <w:rFonts w:ascii="Symbol" w:hAnsi="Symbol" w:hint="default"/>
+      </w:rPr>
+    </w:lvl>
+    <w:lvl w:ilvl="7" w:tplc="08090003" w:tentative="1">
+      <w:start w:val="1"/>
+      <w:numFmt w:val="bullet"/>
+      <w:lvlText w:val="o"/>
+      <w:lvlJc w:val="left"/>
+      <w:pPr>
+        <w:ind w:left="5760" w:hanging="360"/>
+      </w:pPr>
+      <w:rPr>
+        <w:rFonts w:ascii="Courier New" w:hAnsi="Courier New" w:cs="Courier New" w:hint="default"/>
+      </w:rPr>
+    </w:lvl>
+    <w:lvl w:ilvl="8" w:tplc="08090005" w:tentative="1">
+      <w:start w:val="1"/>
+      <w:numFmt w:val="bullet"/>
+      <w:lvlText w:val=""/>
+      <w:lvlJc w:val="left"/>
+      <w:pPr>
+        <w:ind w:left="6480" w:hanging="360"/>
+      </w:pPr>
+      <w:rPr>
+        <w:rFonts w:ascii="Wingdings" w:hAnsi="Wingdings" w:hint="default"/>
+      </w:rPr>
+    </w:lvl>
+  </w:abstractNum>
+  <w:abstractNum w:abstractNumId="2" w15:restartNumberingAfterBreak="0">
     <w:nsid w:val="2AFA7618"/>
     <w:multiLevelType w:val="multilevel"/>
     <w:tmpl w:val="6FD8173C"/>
@@ -1465,7 +2097,7 @@
       </w:pPr>
     </w:lvl>
   </w:abstractNum>
-  <w:abstractNum w:abstractNumId="2">
+  <w:abstractNum w:abstractNumId="3" w15:restartNumberingAfterBreak="0">
     <w:nsid w:val="326B63E8"/>
     <w:multiLevelType w:val="multilevel"/>
     <w:tmpl w:val="90A2036A"/>
@@ -1607,7 +2239,7 @@
       </w:rPr>
     </w:lvl>
   </w:abstractNum>
-  <w:abstractNum w:abstractNumId="3">
+  <w:abstractNum w:abstractNumId="4" w15:restartNumberingAfterBreak="0">
     <w:nsid w:val="43EA2F67"/>
     <w:multiLevelType w:val="multilevel"/>
     <w:tmpl w:val="737E02B0"/>
@@ -1747,7 +2379,305 @@
       </w:rPr>
     </w:lvl>
   </w:abstractNum>
-  <w:abstractNum w:abstractNumId="4">
+  <w:abstractNum w:abstractNumId="5" w15:restartNumberingAfterBreak="0">
+    <w:nsid w:val="55AA16F4"/>
+    <w:multiLevelType w:val="multilevel"/>
+    <w:tmpl w:val="A78EA730"/>
+    <w:lvl w:ilvl="0">
+      <w:start w:val="1"/>
+      <w:numFmt w:val="bullet"/>
+      <w:lvlText w:val=""/>
+      <w:lvlJc w:val="left"/>
+      <w:pPr>
+        <w:tabs>
+          <w:tab w:val="num" w:pos="720"/>
+        </w:tabs>
+        <w:ind w:left="720" w:hanging="360"/>
+      </w:pPr>
+      <w:rPr>
+        <w:rFonts w:ascii="Symbol" w:hAnsi="Symbol" w:hint="default"/>
+        <w:sz w:val="20"/>
+      </w:rPr>
+    </w:lvl>
+    <w:lvl w:ilvl="1" w:tentative="1">
+      <w:start w:val="1"/>
+      <w:numFmt w:val="bullet"/>
+      <w:lvlText w:val="o"/>
+      <w:lvlJc w:val="left"/>
+      <w:pPr>
+        <w:tabs>
+          <w:tab w:val="num" w:pos="1440"/>
+        </w:tabs>
+        <w:ind w:left="1440" w:hanging="360"/>
+      </w:pPr>
+      <w:rPr>
+        <w:rFonts w:ascii="Courier New" w:hAnsi="Courier New" w:hint="default"/>
+        <w:sz w:val="20"/>
+      </w:rPr>
+    </w:lvl>
+    <w:lvl w:ilvl="2" w:tentative="1">
+      <w:start w:val="1"/>
+      <w:numFmt w:val="bullet"/>
+      <w:lvlText w:val=""/>
+      <w:lvlJc w:val="left"/>
+      <w:pPr>
+        <w:tabs>
+          <w:tab w:val="num" w:pos="2160"/>
+        </w:tabs>
+        <w:ind w:left="2160" w:hanging="360"/>
+      </w:pPr>
+      <w:rPr>
+        <w:rFonts w:ascii="Wingdings" w:hAnsi="Wingdings" w:hint="default"/>
+        <w:sz w:val="20"/>
+      </w:rPr>
+    </w:lvl>
+    <w:lvl w:ilvl="3" w:tentative="1">
+      <w:start w:val="1"/>
+      <w:numFmt w:val="bullet"/>
+      <w:lvlText w:val=""/>
+      <w:lvlJc w:val="left"/>
+      <w:pPr>
+        <w:tabs>
+          <w:tab w:val="num" w:pos="2880"/>
+        </w:tabs>
+        <w:ind w:left="2880" w:hanging="360"/>
+      </w:pPr>
+      <w:rPr>
+        <w:rFonts w:ascii="Wingdings" w:hAnsi="Wingdings" w:hint="default"/>
+        <w:sz w:val="20"/>
+      </w:rPr>
+    </w:lvl>
+    <w:lvl w:ilvl="4" w:tentative="1">
+      <w:start w:val="1"/>
+      <w:numFmt w:val="bullet"/>
+      <w:lvlText w:val=""/>
+      <w:lvlJc w:val="left"/>
+      <w:pPr>
+        <w:tabs>
+          <w:tab w:val="num" w:pos="3600"/>
+        </w:tabs>
+        <w:ind w:left="3600" w:hanging="360"/>
+      </w:pPr>
+      <w:rPr>
+        <w:rFonts w:ascii="Wingdings" w:hAnsi="Wingdings" w:hint="default"/>
+        <w:sz w:val="20"/>
+      </w:rPr>
+    </w:lvl>
+    <w:lvl w:ilvl="5" w:tentative="1">
+      <w:start w:val="1"/>
+      <w:numFmt w:val="bullet"/>
+      <w:lvlText w:val=""/>
+      <w:lvlJc w:val="left"/>
+      <w:pPr>
+        <w:tabs>
+          <w:tab w:val="num" w:pos="4320"/>
+        </w:tabs>
+        <w:ind w:left="4320" w:hanging="360"/>
+      </w:pPr>
+      <w:rPr>
+        <w:rFonts w:ascii="Wingdings" w:hAnsi="Wingdings" w:hint="default"/>
+        <w:sz w:val="20"/>
+      </w:rPr>
+    </w:lvl>
+    <w:lvl w:ilvl="6" w:tentative="1">
+      <w:start w:val="1"/>
+      <w:numFmt w:val="bullet"/>
+      <w:lvlText w:val=""/>
+      <w:lvlJc w:val="left"/>
+      <w:pPr>
+        <w:tabs>
+          <w:tab w:val="num" w:pos="5040"/>
+        </w:tabs>
+        <w:ind w:left="5040" w:hanging="360"/>
+      </w:pPr>
+      <w:rPr>
+        <w:rFonts w:ascii="Wingdings" w:hAnsi="Wingdings" w:hint="default"/>
+        <w:sz w:val="20"/>
+      </w:rPr>
+    </w:lvl>
+    <w:lvl w:ilvl="7" w:tentative="1">
+      <w:start w:val="1"/>
+      <w:numFmt w:val="bullet"/>
+      <w:lvlText w:val=""/>
+      <w:lvlJc w:val="left"/>
+      <w:pPr>
+        <w:tabs>
+          <w:tab w:val="num" w:pos="5760"/>
+        </w:tabs>
+        <w:ind w:left="5760" w:hanging="360"/>
+      </w:pPr>
+      <w:rPr>
+        <w:rFonts w:ascii="Wingdings" w:hAnsi="Wingdings" w:hint="default"/>
+        <w:sz w:val="20"/>
+      </w:rPr>
+    </w:lvl>
+    <w:lvl w:ilvl="8" w:tentative="1">
+      <w:start w:val="1"/>
+      <w:numFmt w:val="bullet"/>
+      <w:lvlText w:val=""/>
+      <w:lvlJc w:val="left"/>
+      <w:pPr>
+        <w:tabs>
+          <w:tab w:val="num" w:pos="6480"/>
+        </w:tabs>
+        <w:ind w:left="6480" w:hanging="360"/>
+      </w:pPr>
+      <w:rPr>
+        <w:rFonts w:ascii="Wingdings" w:hAnsi="Wingdings" w:hint="default"/>
+        <w:sz w:val="20"/>
+      </w:rPr>
+    </w:lvl>
+  </w:abstractNum>
+  <w:abstractNum w:abstractNumId="6" w15:restartNumberingAfterBreak="0">
+    <w:nsid w:val="5FCB2DF9"/>
+    <w:multiLevelType w:val="multilevel"/>
+    <w:tmpl w:val="D53874BA"/>
+    <w:lvl w:ilvl="0">
+      <w:start w:val="1"/>
+      <w:numFmt w:val="bullet"/>
+      <w:lvlText w:val=""/>
+      <w:lvlJc w:val="left"/>
+      <w:pPr>
+        <w:tabs>
+          <w:tab w:val="num" w:pos="720"/>
+        </w:tabs>
+        <w:ind w:left="720" w:hanging="360"/>
+      </w:pPr>
+      <w:rPr>
+        <w:rFonts w:ascii="Symbol" w:hAnsi="Symbol" w:hint="default"/>
+        <w:sz w:val="20"/>
+      </w:rPr>
+    </w:lvl>
+    <w:lvl w:ilvl="1" w:tentative="1">
+      <w:start w:val="1"/>
+      <w:numFmt w:val="bullet"/>
+      <w:lvlText w:val="o"/>
+      <w:lvlJc w:val="left"/>
+      <w:pPr>
+        <w:tabs>
+          <w:tab w:val="num" w:pos="1440"/>
+        </w:tabs>
+        <w:ind w:left="1440" w:hanging="360"/>
+      </w:pPr>
+      <w:rPr>
+        <w:rFonts w:ascii="Courier New" w:hAnsi="Courier New" w:hint="default"/>
+        <w:sz w:val="20"/>
+      </w:rPr>
+    </w:lvl>
+    <w:lvl w:ilvl="2" w:tentative="1">
+      <w:start w:val="1"/>
+      <w:numFmt w:val="bullet"/>
+      <w:lvlText w:val=""/>
+      <w:lvlJc w:val="left"/>
+      <w:pPr>
+        <w:tabs>
+          <w:tab w:val="num" w:pos="2160"/>
+        </w:tabs>
+        <w:ind w:left="2160" w:hanging="360"/>
+      </w:pPr>
+      <w:rPr>
+        <w:rFonts w:ascii="Wingdings" w:hAnsi="Wingdings" w:hint="default"/>
+        <w:sz w:val="20"/>
+      </w:rPr>
+    </w:lvl>
+    <w:lvl w:ilvl="3" w:tentative="1">
+      <w:start w:val="1"/>
+      <w:numFmt w:val="bullet"/>
+      <w:lvlText w:val=""/>
+      <w:lvlJc w:val="left"/>
+      <w:pPr>
+        <w:tabs>
+          <w:tab w:val="num" w:pos="2880"/>
+        </w:tabs>
+        <w:ind w:left="2880" w:hanging="360"/>
+      </w:pPr>
+      <w:rPr>
+        <w:rFonts w:ascii="Wingdings" w:hAnsi="Wingdings" w:hint="default"/>
+        <w:sz w:val="20"/>
+      </w:rPr>
+    </w:lvl>
+    <w:lvl w:ilvl="4" w:tentative="1">
+      <w:start w:val="1"/>
+      <w:numFmt w:val="bullet"/>
+      <w:lvlText w:val=""/>
+      <w:lvlJc w:val="left"/>
+      <w:pPr>
+        <w:tabs>
+          <w:tab w:val="num" w:pos="3600"/>
+        </w:tabs>
+        <w:ind w:left="3600" w:hanging="360"/>
+      </w:pPr>
+      <w:rPr>
+        <w:rFonts w:ascii="Wingdings" w:hAnsi="Wingdings" w:hint="default"/>
+        <w:sz w:val="20"/>
+      </w:rPr>
+    </w:lvl>
+    <w:lvl w:ilvl="5" w:tentative="1">
+      <w:start w:val="1"/>
+      <w:numFmt w:val="bullet"/>
+      <w:lvlText w:val=""/>
+      <w:lvlJc w:val="left"/>
+      <w:pPr>
+        <w:tabs>
+          <w:tab w:val="num" w:pos="4320"/>
+        </w:tabs>
+        <w:ind w:left="4320" w:hanging="360"/>
+      </w:pPr>
+      <w:rPr>
+        <w:rFonts w:ascii="Wingdings" w:hAnsi="Wingdings" w:hint="default"/>
+        <w:sz w:val="20"/>
+      </w:rPr>
+    </w:lvl>
+    <w:lvl w:ilvl="6" w:tentative="1">
+      <w:start w:val="1"/>
+      <w:numFmt w:val="bullet"/>
+      <w:lvlText w:val=""/>
+      <w:lvlJc w:val="left"/>
+      <w:pPr>
+        <w:tabs>
+          <w:tab w:val="num" w:pos="5040"/>
+        </w:tabs>
+        <w:ind w:left="5040" w:hanging="360"/>
+      </w:pPr>
+      <w:rPr>
+        <w:rFonts w:ascii="Wingdings" w:hAnsi="Wingdings" w:hint="default"/>
+        <w:sz w:val="20"/>
+      </w:rPr>
+    </w:lvl>
+    <w:lvl w:ilvl="7" w:tentative="1">
+      <w:start w:val="1"/>
+      <w:numFmt w:val="bullet"/>
+      <w:lvlText w:val=""/>
+      <w:lvlJc w:val="left"/>
+      <w:pPr>
+        <w:tabs>
+          <w:tab w:val="num" w:pos="5760"/>
+        </w:tabs>
+        <w:ind w:left="5760" w:hanging="360"/>
+      </w:pPr>
+      <w:rPr>
+        <w:rFonts w:ascii="Wingdings" w:hAnsi="Wingdings" w:hint="default"/>
+        <w:sz w:val="20"/>
+      </w:rPr>
+    </w:lvl>
+    <w:lvl w:ilvl="8" w:tentative="1">
+      <w:start w:val="1"/>
+      <w:numFmt w:val="bullet"/>
+      <w:lvlText w:val=""/>
+      <w:lvlJc w:val="left"/>
+      <w:pPr>
+        <w:tabs>
+          <w:tab w:val="num" w:pos="6480"/>
+        </w:tabs>
+        <w:ind w:left="6480" w:hanging="360"/>
+      </w:pPr>
+      <w:rPr>
+        <w:rFonts w:ascii="Wingdings" w:hAnsi="Wingdings" w:hint="default"/>
+        <w:sz w:val="20"/>
+      </w:rPr>
+    </w:lvl>
+  </w:abstractNum>
+  <w:abstractNum w:abstractNumId="7" w15:restartNumberingAfterBreak="0">
     <w:nsid w:val="74D903BB"/>
     <w:multiLevelType w:val="multilevel"/>
     <w:tmpl w:val="A5DC5920"/>
@@ -1878,26 +2808,35 @@
       </w:pPr>
     </w:lvl>
   </w:abstractNum>
-  <w:num w:numId="1">
+  <w:num w:numId="1" w16cid:durableId="1103452558">
+    <w:abstractNumId w:val="3"/>
+  </w:num>
+  <w:num w:numId="2" w16cid:durableId="143132658">
+    <w:abstractNumId w:val="0"/>
+  </w:num>
+  <w:num w:numId="3" w16cid:durableId="2052337151">
+    <w:abstractNumId w:val="7"/>
+  </w:num>
+  <w:num w:numId="4" w16cid:durableId="227040101">
+    <w:abstractNumId w:val="4"/>
+  </w:num>
+  <w:num w:numId="5" w16cid:durableId="1336568346">
     <w:abstractNumId w:val="2"/>
   </w:num>
-  <w:num w:numId="2">
-    <w:abstractNumId w:val="0"/>
+  <w:num w:numId="6" w16cid:durableId="1132753076">
+    <w:abstractNumId w:val="5"/>
   </w:num>
-  <w:num w:numId="3">
-    <w:abstractNumId w:val="4"/>
+  <w:num w:numId="7" w16cid:durableId="1401169352">
+    <w:abstractNumId w:val="1"/>
   </w:num>
-  <w:num w:numId="4">
-    <w:abstractNumId w:val="3"/>
-  </w:num>
-  <w:num w:numId="5">
-    <w:abstractNumId w:val="1"/>
+  <w:num w:numId="8" w16cid:durableId="983313483">
+    <w:abstractNumId w:val="6"/>
   </w:num>
 </w:numbering>
 </file>
 
 <file path=word/styles.xml><?xml version="1.0" encoding="utf-8"?>
-<w:styles xmlns:r="http://schemas.openxmlformats.org/officeDocument/2006/relationships" xmlns:w="http://schemas.openxmlformats.org/wordprocessingml/2006/main">
+<w:styles xmlns:mc="http://schemas.openxmlformats.org/markup-compatibility/2006" xmlns:r="http://schemas.openxmlformats.org/officeDocument/2006/relationships" xmlns:w="http://schemas.openxmlformats.org/wordprocessingml/2006/main" xmlns:w14="http://schemas.microsoft.com/office/word/2010/wordml" xmlns:w15="http://schemas.microsoft.com/office/word/2012/wordml" xmlns:w16cex="http://schemas.microsoft.com/office/word/2018/wordml/cex" xmlns:w16cid="http://schemas.microsoft.com/office/word/2016/wordml/cid" xmlns:w16="http://schemas.microsoft.com/office/word/2018/wordml" xmlns:w16du="http://schemas.microsoft.com/office/word/2023/wordml/word16du" xmlns:w16sdtdh="http://schemas.microsoft.com/office/word/2020/wordml/sdtdatahash" xmlns:w16sdtfl="http://schemas.microsoft.com/office/word/2024/wordml/sdtformatlock" xmlns:w16se="http://schemas.microsoft.com/office/word/2015/wordml/symex" mc:Ignorable="w14 w15 w16se w16cid w16 w16cex w16sdtdh w16sdtfl w16du">
   <w:docDefaults>
     <w:rPrDefault>
       <w:rPr>
@@ -1914,151 +2853,383 @@
       </w:pPr>
     </w:pPrDefault>
   </w:docDefaults>
-  <w:latentStyles w:defLockedState="0" w:defUIPriority="99" w:defSemiHidden="1" w:defUnhideWhenUsed="1" w:defQFormat="0" w:count="267">
-    <w:lsdException w:name="Normal" w:semiHidden="0" w:uiPriority="0" w:unhideWhenUsed="0" w:qFormat="1"/>
-    <w:lsdException w:name="heading 1" w:semiHidden="0" w:uiPriority="9" w:unhideWhenUsed="0" w:qFormat="1"/>
-    <w:lsdException w:name="heading 2" w:uiPriority="9" w:qFormat="1"/>
-    <w:lsdException w:name="heading 3" w:uiPriority="9" w:qFormat="1"/>
-    <w:lsdException w:name="heading 4" w:uiPriority="9" w:qFormat="1"/>
-    <w:lsdException w:name="heading 5" w:uiPriority="9" w:qFormat="1"/>
-    <w:lsdException w:name="heading 6" w:uiPriority="9" w:qFormat="1"/>
-    <w:lsdException w:name="heading 7" w:uiPriority="9" w:qFormat="1"/>
-    <w:lsdException w:name="heading 8" w:uiPriority="9" w:qFormat="1"/>
-    <w:lsdException w:name="heading 9" w:uiPriority="9" w:qFormat="1"/>
-    <w:lsdException w:name="toc 1" w:uiPriority="39" w:qFormat="1"/>
-    <w:lsdException w:name="toc 2" w:uiPriority="39" w:qFormat="1"/>
-    <w:lsdException w:name="toc 3" w:uiPriority="39"/>
-    <w:lsdException w:name="toc 4" w:uiPriority="39"/>
-    <w:lsdException w:name="toc 5" w:uiPriority="39"/>
-    <w:lsdException w:name="toc 6" w:uiPriority="39"/>
-    <w:lsdException w:name="toc 7" w:uiPriority="39"/>
-    <w:lsdException w:name="toc 8" w:uiPriority="39"/>
-    <w:lsdException w:name="toc 9" w:uiPriority="39"/>
-    <w:lsdException w:name="header" w:qFormat="1"/>
-    <w:lsdException w:name="footer" w:qFormat="1"/>
-    <w:lsdException w:name="caption" w:uiPriority="35" w:qFormat="1"/>
-    <w:lsdException w:name="List Bullet" w:qFormat="1"/>
-    <w:lsdException w:name="List Number" w:semiHidden="0" w:uiPriority="13" w:unhideWhenUsed="0" w:qFormat="1"/>
-    <w:lsdException w:name="Title" w:uiPriority="10" w:qFormat="1"/>
-    <w:lsdException w:name="Default Paragraph Font" w:uiPriority="1"/>
-    <w:lsdException w:name="Subtitle" w:uiPriority="11" w:qFormat="1"/>
-    <w:lsdException w:name="Strong" w:uiPriority="8" w:qFormat="1"/>
-    <w:lsdException w:name="Emphasis" w:uiPriority="20" w:qFormat="1"/>
-    <w:lsdException w:name="Normal Table" w:semiHidden="0" w:unhideWhenUsed="0"/>
-    <w:lsdException w:name="Table Web 2" w:semiHidden="0" w:unhideWhenUsed="0"/>
-    <w:lsdException w:name="Table Grid" w:semiHidden="0" w:uiPriority="39" w:unhideWhenUsed="0"/>
-    <w:lsdException w:name="Table Theme" w:semiHidden="0" w:unhideWhenUsed="0"/>
-    <w:lsdException w:name="Placeholder Text" w:unhideWhenUsed="0"/>
-    <w:lsdException w:name="No Spacing" w:uiPriority="10" w:qFormat="1"/>
-    <w:lsdException w:name="Light Shading" w:semiHidden="0" w:uiPriority="60" w:unhideWhenUsed="0"/>
-    <w:lsdException w:name="Light List" w:semiHidden="0" w:uiPriority="61" w:unhideWhenUsed="0"/>
-    <w:lsdException w:name="Light Grid" w:semiHidden="0" w:uiPriority="62" w:unhideWhenUsed="0"/>
-    <w:lsdException w:name="Medium Shading 1" w:semiHidden="0" w:uiPriority="63" w:unhideWhenUsed="0"/>
-    <w:lsdException w:name="Medium Shading 2" w:semiHidden="0" w:uiPriority="64" w:unhideWhenUsed="0"/>
-    <w:lsdException w:name="Medium List 1" w:semiHidden="0" w:uiPriority="65" w:unhideWhenUsed="0"/>
-    <w:lsdException w:name="Medium List 2" w:semiHidden="0" w:uiPriority="66" w:unhideWhenUsed="0"/>
-    <w:lsdException w:name="Medium Grid 1" w:semiHidden="0" w:uiPriority="67" w:unhideWhenUsed="0"/>
-    <w:lsdException w:name="Medium Grid 2" w:semiHidden="0" w:uiPriority="68" w:unhideWhenUsed="0"/>
-    <w:lsdException w:name="Medium Grid 3" w:semiHidden="0" w:uiPriority="69" w:unhideWhenUsed="0"/>
-    <w:lsdException w:name="Dark List" w:semiHidden="0" w:uiPriority="70" w:unhideWhenUsed="0"/>
-    <w:lsdException w:name="Colorful Shading" w:semiHidden="0" w:uiPriority="71" w:unhideWhenUsed="0"/>
-    <w:lsdException w:name="Colorful List" w:semiHidden="0" w:uiPriority="72" w:unhideWhenUsed="0"/>
-    <w:lsdException w:name="Colorful Grid" w:semiHidden="0" w:uiPriority="73" w:unhideWhenUsed="0"/>
-    <w:lsdException w:name="Light Shading Accent 1" w:semiHidden="0" w:uiPriority="60" w:unhideWhenUsed="0"/>
-    <w:lsdException w:name="Light List Accent 1" w:semiHidden="0" w:uiPriority="61" w:unhideWhenUsed="0"/>
-    <w:lsdException w:name="Light Grid Accent 1" w:semiHidden="0" w:uiPriority="62" w:unhideWhenUsed="0"/>
-    <w:lsdException w:name="Medium Shading 1 Accent 1" w:semiHidden="0" w:uiPriority="63" w:unhideWhenUsed="0"/>
-    <w:lsdException w:name="Medium Shading 2 Accent 1" w:semiHidden="0" w:uiPriority="64" w:unhideWhenUsed="0"/>
-    <w:lsdException w:name="Medium List 1 Accent 1" w:semiHidden="0" w:uiPriority="65" w:unhideWhenUsed="0"/>
-    <w:lsdException w:name="Revision" w:unhideWhenUsed="0"/>
-    <w:lsdException w:name="List Paragraph" w:uiPriority="34" w:qFormat="1"/>
-    <w:lsdException w:name="Quote" w:semiHidden="0" w:uiPriority="29" w:unhideWhenUsed="0" w:qFormat="1"/>
-    <w:lsdException w:name="Intense Quote" w:uiPriority="30" w:qFormat="1"/>
-    <w:lsdException w:name="Medium List 2 Accent 1" w:semiHidden="0" w:uiPriority="66" w:unhideWhenUsed="0"/>
-    <w:lsdException w:name="Medium Grid 1 Accent 1" w:semiHidden="0" w:uiPriority="67" w:unhideWhenUsed="0"/>
-    <w:lsdException w:name="Medium Grid 2 Accent 1" w:semiHidden="0" w:uiPriority="68" w:unhideWhenUsed="0"/>
-    <w:lsdException w:name="Medium Grid 3 Accent 1" w:semiHidden="0" w:uiPriority="69" w:unhideWhenUsed="0"/>
-    <w:lsdException w:name="Dark List Accent 1" w:semiHidden="0" w:uiPriority="70" w:unhideWhenUsed="0"/>
-    <w:lsdException w:name="Colorful Shading Accent 1" w:semiHidden="0" w:uiPriority="71" w:unhideWhenUsed="0"/>
-    <w:lsdException w:name="Colorful List Accent 1" w:semiHidden="0" w:uiPriority="72" w:unhideWhenUsed="0"/>
-    <w:lsdException w:name="Colorful Grid Accent 1" w:semiHidden="0" w:uiPriority="73" w:unhideWhenUsed="0"/>
-    <w:lsdException w:name="Light Shading Accent 2" w:semiHidden="0" w:uiPriority="60" w:unhideWhenUsed="0"/>
-    <w:lsdException w:name="Light List Accent 2" w:semiHidden="0" w:uiPriority="61" w:unhideWhenUsed="0"/>
-    <w:lsdException w:name="Light Grid Accent 2" w:semiHidden="0" w:uiPriority="62" w:unhideWhenUsed="0"/>
-    <w:lsdException w:name="Medium Shading 1 Accent 2" w:semiHidden="0" w:uiPriority="63" w:unhideWhenUsed="0"/>
-    <w:lsdException w:name="Medium Shading 2 Accent 2" w:semiHidden="0" w:uiPriority="64" w:unhideWhenUsed="0"/>
-    <w:lsdException w:name="Medium List 1 Accent 2" w:semiHidden="0" w:uiPriority="65" w:unhideWhenUsed="0"/>
-    <w:lsdException w:name="Medium List 2 Accent 2" w:semiHidden="0" w:uiPriority="66" w:unhideWhenUsed="0"/>
-    <w:lsdException w:name="Medium Grid 1 Accent 2" w:semiHidden="0" w:uiPriority="67" w:unhideWhenUsed="0"/>
-    <w:lsdException w:name="Medium Grid 2 Accent 2" w:semiHidden="0" w:uiPriority="68" w:unhideWhenUsed="0"/>
-    <w:lsdException w:name="Medium Grid 3 Accent 2" w:semiHidden="0" w:uiPriority="69" w:unhideWhenUsed="0"/>
-    <w:lsdException w:name="Dark List Accent 2" w:semiHidden="0" w:uiPriority="70" w:unhideWhenUsed="0"/>
-    <w:lsdException w:name="Colorful Shading Accent 2" w:semiHidden="0" w:uiPriority="71" w:unhideWhenUsed="0"/>
-    <w:lsdException w:name="Colorful List Accent 2" w:semiHidden="0" w:uiPriority="72" w:unhideWhenUsed="0"/>
-    <w:lsdException w:name="Colorful Grid Accent 2" w:semiHidden="0" w:uiPriority="73" w:unhideWhenUsed="0"/>
-    <w:lsdException w:name="Light Shading Accent 3" w:semiHidden="0" w:uiPriority="60" w:unhideWhenUsed="0"/>
-    <w:lsdException w:name="Light List Accent 3" w:semiHidden="0" w:uiPriority="61" w:unhideWhenUsed="0"/>
-    <w:lsdException w:name="Light Grid Accent 3" w:semiHidden="0" w:uiPriority="62" w:unhideWhenUsed="0"/>
-    <w:lsdException w:name="Medium Shading 1 Accent 3" w:semiHidden="0" w:uiPriority="63" w:unhideWhenUsed="0"/>
-    <w:lsdException w:name="Medium Shading 2 Accent 3" w:semiHidden="0" w:uiPriority="64" w:unhideWhenUsed="0"/>
-    <w:lsdException w:name="Medium List 1 Accent 3" w:semiHidden="0" w:uiPriority="65" w:unhideWhenUsed="0"/>
-    <w:lsdException w:name="Medium List 2 Accent 3" w:semiHidden="0" w:uiPriority="66" w:unhideWhenUsed="0"/>
-    <w:lsdException w:name="Medium Grid 1 Accent 3" w:semiHidden="0" w:uiPriority="67" w:unhideWhenUsed="0"/>
-    <w:lsdException w:name="Medium Grid 2 Accent 3" w:semiHidden="0" w:uiPriority="68" w:unhideWhenUsed="0"/>
-    <w:lsdException w:name="Medium Grid 3 Accent 3" w:semiHidden="0" w:uiPriority="69" w:unhideWhenUsed="0"/>
-    <w:lsdException w:name="Dark List Accent 3" w:semiHidden="0" w:uiPriority="70" w:unhideWhenUsed="0"/>
-    <w:lsdException w:name="Colorful Shading Accent 3" w:semiHidden="0" w:uiPriority="71" w:unhideWhenUsed="0"/>
-    <w:lsdException w:name="Colorful List Accent 3" w:semiHidden="0" w:uiPriority="72" w:unhideWhenUsed="0"/>
-    <w:lsdException w:name="Colorful Grid Accent 3" w:semiHidden="0" w:uiPriority="73" w:unhideWhenUsed="0"/>
-    <w:lsdException w:name="Light Shading Accent 4" w:semiHidden="0" w:uiPriority="60" w:unhideWhenUsed="0"/>
-    <w:lsdException w:name="Light List Accent 4" w:semiHidden="0" w:uiPriority="61" w:unhideWhenUsed="0"/>
-    <w:lsdException w:name="Light Grid Accent 4" w:semiHidden="0" w:uiPriority="62" w:unhideWhenUsed="0"/>
-    <w:lsdException w:name="Medium Shading 1 Accent 4" w:semiHidden="0" w:uiPriority="63" w:unhideWhenUsed="0"/>
-    <w:lsdException w:name="Medium Shading 2 Accent 4" w:semiHidden="0" w:uiPriority="64" w:unhideWhenUsed="0"/>
-    <w:lsdException w:name="Medium List 1 Accent 4" w:semiHidden="0" w:uiPriority="65" w:unhideWhenUsed="0"/>
-    <w:lsdException w:name="Medium List 2 Accent 4" w:semiHidden="0" w:uiPriority="66" w:unhideWhenUsed="0"/>
-    <w:lsdException w:name="Medium Grid 1 Accent 4" w:semiHidden="0" w:uiPriority="67" w:unhideWhenUsed="0"/>
-    <w:lsdException w:name="Medium Grid 2 Accent 4" w:semiHidden="0" w:uiPriority="68" w:unhideWhenUsed="0"/>
-    <w:lsdException w:name="Medium Grid 3 Accent 4" w:semiHidden="0" w:uiPriority="69" w:unhideWhenUsed="0"/>
-    <w:lsdException w:name="Dark List Accent 4" w:semiHidden="0" w:uiPriority="70" w:unhideWhenUsed="0"/>
-    <w:lsdException w:name="Colorful Shading Accent 4" w:semiHidden="0" w:uiPriority="71" w:unhideWhenUsed="0"/>
-    <w:lsdException w:name="Colorful List Accent 4" w:semiHidden="0" w:uiPriority="72" w:unhideWhenUsed="0"/>
-    <w:lsdException w:name="Colorful Grid Accent 4" w:semiHidden="0" w:uiPriority="73" w:unhideWhenUsed="0"/>
-    <w:lsdException w:name="Light Shading Accent 5" w:semiHidden="0" w:uiPriority="60" w:unhideWhenUsed="0"/>
-    <w:lsdException w:name="Light List Accent 5" w:semiHidden="0" w:uiPriority="61" w:unhideWhenUsed="0"/>
-    <w:lsdException w:name="Light Grid Accent 5" w:semiHidden="0" w:uiPriority="62" w:unhideWhenUsed="0"/>
-    <w:lsdException w:name="Medium Shading 1 Accent 5" w:semiHidden="0" w:uiPriority="63" w:unhideWhenUsed="0"/>
-    <w:lsdException w:name="Medium Shading 2 Accent 5" w:semiHidden="0" w:uiPriority="64" w:unhideWhenUsed="0"/>
-    <w:lsdException w:name="Medium List 1 Accent 5" w:semiHidden="0" w:uiPriority="65" w:unhideWhenUsed="0"/>
-    <w:lsdException w:name="Medium List 2 Accent 5" w:semiHidden="0" w:uiPriority="66" w:unhideWhenUsed="0"/>
-    <w:lsdException w:name="Medium Grid 1 Accent 5" w:semiHidden="0" w:uiPriority="67" w:unhideWhenUsed="0"/>
-    <w:lsdException w:name="Medium Grid 2 Accent 5" w:semiHidden="0" w:uiPriority="68" w:unhideWhenUsed="0"/>
-    <w:lsdException w:name="Medium Grid 3 Accent 5" w:semiHidden="0" w:uiPriority="69" w:unhideWhenUsed="0"/>
-    <w:lsdException w:name="Dark List Accent 5" w:semiHidden="0" w:uiPriority="70" w:unhideWhenUsed="0"/>
-    <w:lsdException w:name="Colorful Shading Accent 5" w:semiHidden="0" w:uiPriority="71" w:unhideWhenUsed="0"/>
-    <w:lsdException w:name="Colorful List Accent 5" w:semiHidden="0" w:uiPriority="72" w:unhideWhenUsed="0"/>
-    <w:lsdException w:name="Colorful Grid Accent 5" w:semiHidden="0" w:uiPriority="73" w:unhideWhenUsed="0"/>
-    <w:lsdException w:name="Light Shading Accent 6" w:semiHidden="0" w:uiPriority="60" w:unhideWhenUsed="0"/>
-    <w:lsdException w:name="Light List Accent 6" w:semiHidden="0" w:uiPriority="61" w:unhideWhenUsed="0"/>
-    <w:lsdException w:name="Light Grid Accent 6" w:semiHidden="0" w:uiPriority="62" w:unhideWhenUsed="0"/>
-    <w:lsdException w:name="Medium Shading 1 Accent 6" w:semiHidden="0" w:uiPriority="63" w:unhideWhenUsed="0"/>
-    <w:lsdException w:name="Medium Shading 2 Accent 6" w:semiHidden="0" w:uiPriority="64" w:unhideWhenUsed="0"/>
-    <w:lsdException w:name="Medium List 1 Accent 6" w:semiHidden="0" w:uiPriority="65" w:unhideWhenUsed="0"/>
-    <w:lsdException w:name="Medium List 2 Accent 6" w:semiHidden="0" w:uiPriority="66" w:unhideWhenUsed="0"/>
-    <w:lsdException w:name="Medium Grid 1 Accent 6" w:semiHidden="0" w:uiPriority="67" w:unhideWhenUsed="0"/>
-    <w:lsdException w:name="Medium Grid 2 Accent 6" w:semiHidden="0" w:uiPriority="68" w:unhideWhenUsed="0"/>
-    <w:lsdException w:name="Medium Grid 3 Accent 6" w:semiHidden="0" w:uiPriority="69" w:unhideWhenUsed="0"/>
-    <w:lsdException w:name="Dark List Accent 6" w:semiHidden="0" w:uiPriority="70" w:unhideWhenUsed="0"/>
-    <w:lsdException w:name="Colorful Shading Accent 6" w:semiHidden="0" w:uiPriority="71" w:unhideWhenUsed="0"/>
-    <w:lsdException w:name="Colorful List Accent 6" w:semiHidden="0" w:uiPriority="72" w:unhideWhenUsed="0"/>
-    <w:lsdException w:name="Colorful Grid Accent 6" w:semiHidden="0" w:uiPriority="73" w:unhideWhenUsed="0"/>
-    <w:lsdException w:name="Subtle Emphasis" w:uiPriority="19" w:qFormat="1"/>
-    <w:lsdException w:name="Intense Emphasis" w:uiPriority="21" w:qFormat="1"/>
-    <w:lsdException w:name="Subtle Reference" w:uiPriority="31" w:qFormat="1"/>
-    <w:lsdException w:name="Intense Reference" w:uiPriority="32" w:qFormat="1"/>
-    <w:lsdException w:name="Book Title" w:uiPriority="33" w:qFormat="1"/>
-    <w:lsdException w:name="Bibliography" w:uiPriority="37"/>
-    <w:lsdException w:name="TOC Heading" w:uiPriority="39" w:qFormat="1"/>
+  <w:latentStyles w:defLockedState="0" w:defUIPriority="99" w:defSemiHidden="0" w:defUnhideWhenUsed="0" w:defQFormat="0" w:count="376">
+    <w:lsdException w:name="Normal" w:uiPriority="0" w:qFormat="1"/>
+    <w:lsdException w:name="heading 1" w:uiPriority="9" w:qFormat="1"/>
+    <w:lsdException w:name="heading 2" w:semiHidden="1" w:uiPriority="9" w:unhideWhenUsed="1" w:qFormat="1"/>
+    <w:lsdException w:name="heading 3" w:semiHidden="1" w:uiPriority="9" w:unhideWhenUsed="1" w:qFormat="1"/>
+    <w:lsdException w:name="heading 4" w:semiHidden="1" w:uiPriority="9" w:unhideWhenUsed="1" w:qFormat="1"/>
+    <w:lsdException w:name="heading 5" w:semiHidden="1" w:uiPriority="9" w:unhideWhenUsed="1" w:qFormat="1"/>
+    <w:lsdException w:name="heading 6" w:semiHidden="1" w:uiPriority="9" w:unhideWhenUsed="1" w:qFormat="1"/>
+    <w:lsdException w:name="heading 7" w:semiHidden="1" w:uiPriority="9" w:unhideWhenUsed="1" w:qFormat="1"/>
+    <w:lsdException w:name="heading 8" w:semiHidden="1" w:uiPriority="9" w:unhideWhenUsed="1" w:qFormat="1"/>
+    <w:lsdException w:name="heading 9" w:semiHidden="1" w:uiPriority="9" w:unhideWhenUsed="1" w:qFormat="1"/>
+    <w:lsdException w:name="index 1" w:semiHidden="1" w:unhideWhenUsed="1"/>
+    <w:lsdException w:name="index 2" w:semiHidden="1" w:unhideWhenUsed="1"/>
+    <w:lsdException w:name="index 3" w:semiHidden="1" w:unhideWhenUsed="1"/>
+    <w:lsdException w:name="index 4" w:semiHidden="1" w:unhideWhenUsed="1"/>
+    <w:lsdException w:name="index 5" w:semiHidden="1" w:unhideWhenUsed="1"/>
+    <w:lsdException w:name="index 6" w:semiHidden="1" w:unhideWhenUsed="1"/>
+    <w:lsdException w:name="index 7" w:semiHidden="1" w:unhideWhenUsed="1"/>
+    <w:lsdException w:name="index 8" w:semiHidden="1" w:unhideWhenUsed="1"/>
+    <w:lsdException w:name="index 9" w:semiHidden="1" w:unhideWhenUsed="1"/>
+    <w:lsdException w:name="toc 1" w:semiHidden="1" w:uiPriority="39" w:unhideWhenUsed="1" w:qFormat="1"/>
+    <w:lsdException w:name="toc 2" w:semiHidden="1" w:uiPriority="39" w:unhideWhenUsed="1" w:qFormat="1"/>
+    <w:lsdException w:name="toc 3" w:semiHidden="1" w:uiPriority="39" w:unhideWhenUsed="1"/>
+    <w:lsdException w:name="toc 4" w:semiHidden="1" w:uiPriority="39" w:unhideWhenUsed="1"/>
+    <w:lsdException w:name="toc 5" w:semiHidden="1" w:uiPriority="39" w:unhideWhenUsed="1"/>
+    <w:lsdException w:name="toc 6" w:semiHidden="1" w:uiPriority="39" w:unhideWhenUsed="1"/>
+    <w:lsdException w:name="toc 7" w:semiHidden="1" w:uiPriority="39" w:unhideWhenUsed="1"/>
+    <w:lsdException w:name="toc 8" w:semiHidden="1" w:uiPriority="39" w:unhideWhenUsed="1"/>
+    <w:lsdException w:name="toc 9" w:semiHidden="1" w:uiPriority="39" w:unhideWhenUsed="1"/>
+    <w:lsdException w:name="Normal Indent" w:semiHidden="1" w:unhideWhenUsed="1"/>
+    <w:lsdException w:name="footnote text" w:semiHidden="1" w:unhideWhenUsed="1"/>
+    <w:lsdException w:name="annotation text" w:semiHidden="1" w:unhideWhenUsed="1"/>
+    <w:lsdException w:name="header" w:semiHidden="1" w:unhideWhenUsed="1" w:qFormat="1"/>
+    <w:lsdException w:name="footer" w:semiHidden="1" w:unhideWhenUsed="1" w:qFormat="1"/>
+    <w:lsdException w:name="index heading" w:semiHidden="1" w:unhideWhenUsed="1"/>
+    <w:lsdException w:name="caption" w:semiHidden="1" w:uiPriority="35" w:unhideWhenUsed="1" w:qFormat="1"/>
+    <w:lsdException w:name="table of figures" w:semiHidden="1" w:unhideWhenUsed="1"/>
+    <w:lsdException w:name="envelope address" w:semiHidden="1" w:unhideWhenUsed="1"/>
+    <w:lsdException w:name="envelope return" w:semiHidden="1" w:unhideWhenUsed="1"/>
+    <w:lsdException w:name="footnote reference" w:semiHidden="1" w:unhideWhenUsed="1"/>
+    <w:lsdException w:name="annotation reference" w:semiHidden="1" w:unhideWhenUsed="1"/>
+    <w:lsdException w:name="line number" w:semiHidden="1" w:unhideWhenUsed="1"/>
+    <w:lsdException w:name="page number" w:semiHidden="1" w:unhideWhenUsed="1"/>
+    <w:lsdException w:name="endnote reference" w:semiHidden="1" w:unhideWhenUsed="1"/>
+    <w:lsdException w:name="endnote text" w:semiHidden="1" w:unhideWhenUsed="1"/>
+    <w:lsdException w:name="table of authorities" w:semiHidden="1" w:unhideWhenUsed="1"/>
+    <w:lsdException w:name="macro" w:semiHidden="1" w:unhideWhenUsed="1"/>
+    <w:lsdException w:name="toa heading" w:semiHidden="1" w:unhideWhenUsed="1"/>
+    <w:lsdException w:name="List" w:semiHidden="1" w:unhideWhenUsed="1"/>
+    <w:lsdException w:name="List Bullet" w:semiHidden="1" w:unhideWhenUsed="1" w:qFormat="1"/>
+    <w:lsdException w:name="List Number" w:uiPriority="13" w:qFormat="1"/>
+    <w:lsdException w:name="List 2" w:semiHidden="1" w:unhideWhenUsed="1"/>
+    <w:lsdException w:name="List 3" w:semiHidden="1" w:unhideWhenUsed="1"/>
+    <w:lsdException w:name="List 4" w:semiHidden="1" w:unhideWhenUsed="1"/>
+    <w:lsdException w:name="List 5" w:semiHidden="1" w:unhideWhenUsed="1"/>
+    <w:lsdException w:name="List Bullet 2" w:semiHidden="1" w:unhideWhenUsed="1"/>
+    <w:lsdException w:name="List Bullet 3" w:semiHidden="1" w:unhideWhenUsed="1"/>
+    <w:lsdException w:name="List Bullet 4" w:semiHidden="1" w:unhideWhenUsed="1"/>
+    <w:lsdException w:name="List Bullet 5" w:semiHidden="1" w:unhideWhenUsed="1"/>
+    <w:lsdException w:name="List Number 2" w:semiHidden="1" w:unhideWhenUsed="1"/>
+    <w:lsdException w:name="List Number 3" w:semiHidden="1" w:unhideWhenUsed="1"/>
+    <w:lsdException w:name="List Number 4" w:semiHidden="1" w:unhideWhenUsed="1"/>
+    <w:lsdException w:name="List Number 5" w:semiHidden="1" w:unhideWhenUsed="1"/>
+    <w:lsdException w:name="Title" w:semiHidden="1" w:uiPriority="10" w:unhideWhenUsed="1" w:qFormat="1"/>
+    <w:lsdException w:name="Closing" w:semiHidden="1" w:unhideWhenUsed="1"/>
+    <w:lsdException w:name="Signature" w:semiHidden="1" w:unhideWhenUsed="1"/>
+    <w:lsdException w:name="Default Paragraph Font" w:semiHidden="1" w:uiPriority="1" w:unhideWhenUsed="1"/>
+    <w:lsdException w:name="Body Text" w:semiHidden="1" w:unhideWhenUsed="1"/>
+    <w:lsdException w:name="Body Text Indent" w:semiHidden="1" w:unhideWhenUsed="1"/>
+    <w:lsdException w:name="List Continue" w:semiHidden="1" w:unhideWhenUsed="1"/>
+    <w:lsdException w:name="List Continue 2" w:semiHidden="1" w:unhideWhenUsed="1"/>
+    <w:lsdException w:name="List Continue 3" w:semiHidden="1" w:unhideWhenUsed="1"/>
+    <w:lsdException w:name="List Continue 4" w:semiHidden="1" w:unhideWhenUsed="1"/>
+    <w:lsdException w:name="List Continue 5" w:semiHidden="1" w:unhideWhenUsed="1"/>
+    <w:lsdException w:name="Message Header" w:semiHidden="1" w:unhideWhenUsed="1"/>
+    <w:lsdException w:name="Subtitle" w:semiHidden="1" w:uiPriority="11" w:unhideWhenUsed="1" w:qFormat="1"/>
+    <w:lsdException w:name="Salutation" w:semiHidden="1" w:unhideWhenUsed="1"/>
+    <w:lsdException w:name="Date" w:semiHidden="1" w:unhideWhenUsed="1"/>
+    <w:lsdException w:name="Body Text First Indent" w:semiHidden="1" w:unhideWhenUsed="1"/>
+    <w:lsdException w:name="Body Text First Indent 2" w:semiHidden="1" w:unhideWhenUsed="1"/>
+    <w:lsdException w:name="Note Heading" w:semiHidden="1" w:unhideWhenUsed="1"/>
+    <w:lsdException w:name="Body Text 2" w:semiHidden="1" w:unhideWhenUsed="1"/>
+    <w:lsdException w:name="Body Text 3" w:semiHidden="1" w:unhideWhenUsed="1"/>
+    <w:lsdException w:name="Body Text Indent 2" w:semiHidden="1" w:unhideWhenUsed="1"/>
+    <w:lsdException w:name="Body Text Indent 3" w:semiHidden="1" w:unhideWhenUsed="1"/>
+    <w:lsdException w:name="Block Text" w:semiHidden="1" w:unhideWhenUsed="1"/>
+    <w:lsdException w:name="Hyperlink" w:semiHidden="1" w:unhideWhenUsed="1"/>
+    <w:lsdException w:name="FollowedHyperlink" w:semiHidden="1" w:unhideWhenUsed="1"/>
+    <w:lsdException w:name="Strong" w:semiHidden="1" w:uiPriority="22" w:unhideWhenUsed="1" w:qFormat="1"/>
+    <w:lsdException w:name="Emphasis" w:semiHidden="1" w:uiPriority="20" w:unhideWhenUsed="1" w:qFormat="1"/>
+    <w:lsdException w:name="Document Map" w:semiHidden="1" w:unhideWhenUsed="1"/>
+    <w:lsdException w:name="Plain Text" w:semiHidden="1" w:unhideWhenUsed="1"/>
+    <w:lsdException w:name="E-mail Signature" w:semiHidden="1" w:unhideWhenUsed="1"/>
+    <w:lsdException w:name="HTML Top of Form" w:semiHidden="1" w:unhideWhenUsed="1"/>
+    <w:lsdException w:name="HTML Bottom of Form" w:semiHidden="1" w:unhideWhenUsed="1"/>
+    <w:lsdException w:name="Normal (Web)" w:semiHidden="1" w:unhideWhenUsed="1"/>
+    <w:lsdException w:name="HTML Acronym" w:semiHidden="1" w:unhideWhenUsed="1"/>
+    <w:lsdException w:name="HTML Address" w:semiHidden="1" w:unhideWhenUsed="1"/>
+    <w:lsdException w:name="HTML Cite" w:semiHidden="1" w:unhideWhenUsed="1"/>
+    <w:lsdException w:name="HTML Code" w:semiHidden="1" w:unhideWhenUsed="1"/>
+    <w:lsdException w:name="HTML Definition" w:semiHidden="1" w:unhideWhenUsed="1"/>
+    <w:lsdException w:name="HTML Keyboard" w:semiHidden="1" w:unhideWhenUsed="1"/>
+    <w:lsdException w:name="HTML Preformatted" w:semiHidden="1" w:unhideWhenUsed="1"/>
+    <w:lsdException w:name="HTML Sample" w:semiHidden="1" w:unhideWhenUsed="1"/>
+    <w:lsdException w:name="HTML Typewriter" w:semiHidden="1" w:unhideWhenUsed="1"/>
+    <w:lsdException w:name="HTML Variable" w:semiHidden="1" w:unhideWhenUsed="1"/>
+    <w:lsdException w:name="Normal Table" w:semiHidden="1" w:unhideWhenUsed="1"/>
+    <w:lsdException w:name="annotation subject" w:semiHidden="1" w:unhideWhenUsed="1"/>
+    <w:lsdException w:name="No List" w:semiHidden="1" w:unhideWhenUsed="1"/>
+    <w:lsdException w:name="Outline List 1" w:semiHidden="1" w:unhideWhenUsed="1"/>
+    <w:lsdException w:name="Outline List 2" w:semiHidden="1" w:unhideWhenUsed="1"/>
+    <w:lsdException w:name="Outline List 3" w:semiHidden="1" w:unhideWhenUsed="1"/>
+    <w:lsdException w:name="Table Simple 1" w:semiHidden="1" w:unhideWhenUsed="1"/>
+    <w:lsdException w:name="Table Simple 2" w:semiHidden="1" w:unhideWhenUsed="1"/>
+    <w:lsdException w:name="Table Simple 3" w:semiHidden="1" w:unhideWhenUsed="1"/>
+    <w:lsdException w:name="Table Classic 1" w:semiHidden="1" w:unhideWhenUsed="1"/>
+    <w:lsdException w:name="Table Classic 2" w:semiHidden="1" w:unhideWhenUsed="1"/>
+    <w:lsdException w:name="Table Classic 3" w:semiHidden="1" w:unhideWhenUsed="1"/>
+    <w:lsdException w:name="Table Classic 4" w:semiHidden="1" w:unhideWhenUsed="1"/>
+    <w:lsdException w:name="Table Colorful 1" w:semiHidden="1" w:unhideWhenUsed="1"/>
+    <w:lsdException w:name="Table Colorful 2" w:semiHidden="1" w:unhideWhenUsed="1"/>
+    <w:lsdException w:name="Table Colorful 3" w:semiHidden="1" w:unhideWhenUsed="1"/>
+    <w:lsdException w:name="Table Columns 1" w:semiHidden="1" w:unhideWhenUsed="1"/>
+    <w:lsdException w:name="Table Columns 2" w:semiHidden="1" w:unhideWhenUsed="1"/>
+    <w:lsdException w:name="Table Columns 3" w:semiHidden="1" w:unhideWhenUsed="1"/>
+    <w:lsdException w:name="Table Columns 4" w:semiHidden="1" w:unhideWhenUsed="1"/>
+    <w:lsdException w:name="Table Columns 5" w:semiHidden="1" w:unhideWhenUsed="1"/>
+    <w:lsdException w:name="Table Grid 1" w:semiHidden="1" w:unhideWhenUsed="1"/>
+    <w:lsdException w:name="Table Grid 2" w:semiHidden="1" w:unhideWhenUsed="1"/>
+    <w:lsdException w:name="Table Grid 3" w:semiHidden="1" w:unhideWhenUsed="1"/>
+    <w:lsdException w:name="Table Grid 4" w:semiHidden="1" w:unhideWhenUsed="1"/>
+    <w:lsdException w:name="Table Grid 5" w:semiHidden="1" w:unhideWhenUsed="1"/>
+    <w:lsdException w:name="Table Grid 6" w:semiHidden="1" w:unhideWhenUsed="1"/>
+    <w:lsdException w:name="Table Grid 7" w:semiHidden="1" w:unhideWhenUsed="1"/>
+    <w:lsdException w:name="Table Grid 8" w:semiHidden="1" w:unhideWhenUsed="1"/>
+    <w:lsdException w:name="Table List 1" w:semiHidden="1" w:unhideWhenUsed="1"/>
+    <w:lsdException w:name="Table List 2" w:semiHidden="1" w:unhideWhenUsed="1"/>
+    <w:lsdException w:name="Table List 3" w:semiHidden="1" w:unhideWhenUsed="1"/>
+    <w:lsdException w:name="Table List 4" w:semiHidden="1" w:unhideWhenUsed="1"/>
+    <w:lsdException w:name="Table List 5" w:semiHidden="1" w:unhideWhenUsed="1"/>
+    <w:lsdException w:name="Table List 6" w:semiHidden="1" w:unhideWhenUsed="1"/>
+    <w:lsdException w:name="Table List 7" w:semiHidden="1" w:unhideWhenUsed="1"/>
+    <w:lsdException w:name="Table List 8" w:semiHidden="1" w:unhideWhenUsed="1"/>
+    <w:lsdException w:name="Table 3D effects 1" w:semiHidden="1" w:unhideWhenUsed="1"/>
+    <w:lsdException w:name="Table 3D effects 2" w:semiHidden="1" w:unhideWhenUsed="1"/>
+    <w:lsdException w:name="Table 3D effects 3" w:semiHidden="1" w:unhideWhenUsed="1"/>
+    <w:lsdException w:name="Table Contemporary" w:semiHidden="1" w:unhideWhenUsed="1"/>
+    <w:lsdException w:name="Table Elegant" w:semiHidden="1" w:unhideWhenUsed="1"/>
+    <w:lsdException w:name="Table Professional" w:semiHidden="1" w:unhideWhenUsed="1"/>
+    <w:lsdException w:name="Table Subtle 1" w:semiHidden="1" w:unhideWhenUsed="1"/>
+    <w:lsdException w:name="Table Subtle 2" w:semiHidden="1" w:unhideWhenUsed="1"/>
+    <w:lsdException w:name="Table Web 1" w:semiHidden="1" w:unhideWhenUsed="1"/>
+    <w:lsdException w:name="Table Web 2" w:semiHidden="1" w:unhideWhenUsed="1"/>
+    <w:lsdException w:name="Table Web 3" w:semiHidden="1" w:unhideWhenUsed="1"/>
+    <w:lsdException w:name="Balloon Text" w:semiHidden="1" w:unhideWhenUsed="1"/>
+    <w:lsdException w:name="Table Grid" w:uiPriority="39"/>
+    <w:lsdException w:name="Table Theme" w:semiHidden="1" w:unhideWhenUsed="1"/>
+    <w:lsdException w:name="Placeholder Text" w:semiHidden="1"/>
+    <w:lsdException w:name="No Spacing" w:semiHidden="1" w:uiPriority="10" w:unhideWhenUsed="1" w:qFormat="1"/>
+    <w:lsdException w:name="Light Shading" w:uiPriority="60"/>
+    <w:lsdException w:name="Light List" w:uiPriority="61"/>
+    <w:lsdException w:name="Light Grid" w:uiPriority="62"/>
+    <w:lsdException w:name="Medium Shading 1" w:uiPriority="63"/>
+    <w:lsdException w:name="Medium Shading 2" w:uiPriority="64"/>
+    <w:lsdException w:name="Medium List 1" w:uiPriority="65"/>
+    <w:lsdException w:name="Medium List 2" w:uiPriority="66"/>
+    <w:lsdException w:name="Medium Grid 1" w:uiPriority="67"/>
+    <w:lsdException w:name="Medium Grid 2" w:uiPriority="68"/>
+    <w:lsdException w:name="Medium Grid 3" w:uiPriority="69"/>
+    <w:lsdException w:name="Dark List" w:uiPriority="70"/>
+    <w:lsdException w:name="Colorful Shading" w:uiPriority="71"/>
+    <w:lsdException w:name="Colorful List" w:uiPriority="72"/>
+    <w:lsdException w:name="Colorful Grid" w:uiPriority="73"/>
+    <w:lsdException w:name="Light Shading Accent 1" w:uiPriority="60"/>
+    <w:lsdException w:name="Light List Accent 1" w:uiPriority="61"/>
+    <w:lsdException w:name="Light Grid Accent 1" w:uiPriority="62"/>
+    <w:lsdException w:name="Medium Shading 1 Accent 1" w:uiPriority="63"/>
+    <w:lsdException w:name="Medium Shading 2 Accent 1" w:uiPriority="64"/>
+    <w:lsdException w:name="Medium List 1 Accent 1" w:uiPriority="65"/>
+    <w:lsdException w:name="Revision" w:semiHidden="1"/>
+    <w:lsdException w:name="List Paragraph" w:semiHidden="1" w:uiPriority="34" w:unhideWhenUsed="1" w:qFormat="1"/>
+    <w:lsdException w:name="Quote" w:uiPriority="29" w:qFormat="1"/>
+    <w:lsdException w:name="Intense Quote" w:semiHidden="1" w:uiPriority="30" w:unhideWhenUsed="1" w:qFormat="1"/>
+    <w:lsdException w:name="Medium List 2 Accent 1" w:uiPriority="66"/>
+    <w:lsdException w:name="Medium Grid 1 Accent 1" w:uiPriority="67"/>
+    <w:lsdException w:name="Medium Grid 2 Accent 1" w:uiPriority="68"/>
+    <w:lsdException w:name="Medium Grid 3 Accent 1" w:uiPriority="69"/>
+    <w:lsdException w:name="Dark List Accent 1" w:uiPriority="70"/>
+    <w:lsdException w:name="Colorful Shading Accent 1" w:uiPriority="71"/>
+    <w:lsdException w:name="Colorful List Accent 1" w:uiPriority="72"/>
+    <w:lsdException w:name="Colorful Grid Accent 1" w:uiPriority="73"/>
+    <w:lsdException w:name="Light Shading Accent 2" w:uiPriority="60"/>
+    <w:lsdException w:name="Light List Accent 2" w:uiPriority="61"/>
+    <w:lsdException w:name="Light Grid Accent 2" w:uiPriority="62"/>
+    <w:lsdException w:name="Medium Shading 1 Accent 2" w:uiPriority="63"/>
+    <w:lsdException w:name="Medium Shading 2 Accent 2" w:uiPriority="64"/>
+    <w:lsdException w:name="Medium List 1 Accent 2" w:uiPriority="65"/>
+    <w:lsdException w:name="Medium List 2 Accent 2" w:uiPriority="66"/>
+    <w:lsdException w:name="Medium Grid 1 Accent 2" w:uiPriority="67"/>
+    <w:lsdException w:name="Medium Grid 2 Accent 2" w:uiPriority="68"/>
+    <w:lsdException w:name="Medium Grid 3 Accent 2" w:uiPriority="69"/>
+    <w:lsdException w:name="Dark List Accent 2" w:uiPriority="70"/>
+    <w:lsdException w:name="Colorful Shading Accent 2" w:uiPriority="71"/>
+    <w:lsdException w:name="Colorful List Accent 2" w:uiPriority="72"/>
+    <w:lsdException w:name="Colorful Grid Accent 2" w:uiPriority="73"/>
+    <w:lsdException w:name="Light Shading Accent 3" w:uiPriority="60"/>
+    <w:lsdException w:name="Light List Accent 3" w:uiPriority="61"/>
+    <w:lsdException w:name="Light Grid Accent 3" w:uiPriority="62"/>
+    <w:lsdException w:name="Medium Shading 1 Accent 3" w:uiPriority="63"/>
+    <w:lsdException w:name="Medium Shading 2 Accent 3" w:uiPriority="64"/>
+    <w:lsdException w:name="Medium List 1 Accent 3" w:uiPriority="65"/>
+    <w:lsdException w:name="Medium List 2 Accent 3" w:uiPriority="66"/>
+    <w:lsdException w:name="Medium Grid 1 Accent 3" w:uiPriority="67"/>
+    <w:lsdException w:name="Medium Grid 2 Accent 3" w:uiPriority="68"/>
+    <w:lsdException w:name="Medium Grid 3 Accent 3" w:uiPriority="69"/>
+    <w:lsdException w:name="Dark List Accent 3" w:uiPriority="70"/>
+    <w:lsdException w:name="Colorful Shading Accent 3" w:uiPriority="71"/>
+    <w:lsdException w:name="Colorful List Accent 3" w:uiPriority="72"/>
+    <w:lsdException w:name="Colorful Grid Accent 3" w:uiPriority="73"/>
+    <w:lsdException w:name="Light Shading Accent 4" w:uiPriority="60"/>
+    <w:lsdException w:name="Light List Accent 4" w:uiPriority="61"/>
+    <w:lsdException w:name="Light Grid Accent 4" w:uiPriority="62"/>
+    <w:lsdException w:name="Medium Shading 1 Accent 4" w:uiPriority="63"/>
+    <w:lsdException w:name="Medium Shading 2 Accent 4" w:uiPriority="64"/>
+    <w:lsdException w:name="Medium List 1 Accent 4" w:uiPriority="65"/>
+    <w:lsdException w:name="Medium List 2 Accent 4" w:uiPriority="66"/>
+    <w:lsdException w:name="Medium Grid 1 Accent 4" w:uiPriority="67"/>
+    <w:lsdException w:name="Medium Grid 2 Accent 4" w:uiPriority="68"/>
+    <w:lsdException w:name="Medium Grid 3 Accent 4" w:uiPriority="69"/>
+    <w:lsdException w:name="Dark List Accent 4" w:uiPriority="70"/>
+    <w:lsdException w:name="Colorful Shading Accent 4" w:uiPriority="71"/>
+    <w:lsdException w:name="Colorful List Accent 4" w:uiPriority="72"/>
+    <w:lsdException w:name="Colorful Grid Accent 4" w:uiPriority="73"/>
+    <w:lsdException w:name="Light Shading Accent 5" w:uiPriority="60"/>
+    <w:lsdException w:name="Light List Accent 5" w:uiPriority="61"/>
+    <w:lsdException w:name="Light Grid Accent 5" w:uiPriority="62"/>
+    <w:lsdException w:name="Medium Shading 1 Accent 5" w:uiPriority="63"/>
+    <w:lsdException w:name="Medium Shading 2 Accent 5" w:uiPriority="64"/>
+    <w:lsdException w:name="Medium List 1 Accent 5" w:uiPriority="65"/>
+    <w:lsdException w:name="Medium List 2 Accent 5" w:uiPriority="66"/>
+    <w:lsdException w:name="Medium Grid 1 Accent 5" w:uiPriority="67"/>
+    <w:lsdException w:name="Medium Grid 2 Accent 5" w:uiPriority="68"/>
+    <w:lsdException w:name="Medium Grid 3 Accent 5" w:uiPriority="69"/>
+    <w:lsdException w:name="Dark List Accent 5" w:uiPriority="70"/>
+    <w:lsdException w:name="Colorful Shading Accent 5" w:uiPriority="71"/>
+    <w:lsdException w:name="Colorful List Accent 5" w:uiPriority="72"/>
+    <w:lsdException w:name="Colorful Grid Accent 5" w:uiPriority="73"/>
+    <w:lsdException w:name="Light Shading Accent 6" w:uiPriority="60"/>
+    <w:lsdException w:name="Light List Accent 6" w:uiPriority="61"/>
+    <w:lsdException w:name="Light Grid Accent 6" w:uiPriority="62"/>
+    <w:lsdException w:name="Medium Shading 1 Accent 6" w:uiPriority="63"/>
+    <w:lsdException w:name="Medium Shading 2 Accent 6" w:uiPriority="64"/>
+    <w:lsdException w:name="Medium List 1 Accent 6" w:uiPriority="65"/>
+    <w:lsdException w:name="Medium List 2 Accent 6" w:uiPriority="66"/>
+    <w:lsdException w:name="Medium Grid 1 Accent 6" w:uiPriority="67"/>
+    <w:lsdException w:name="Medium Grid 2 Accent 6" w:uiPriority="68"/>
+    <w:lsdException w:name="Medium Grid 3 Accent 6" w:uiPriority="69"/>
+    <w:lsdException w:name="Dark List Accent 6" w:uiPriority="70"/>
+    <w:lsdException w:name="Colorful Shading Accent 6" w:uiPriority="71"/>
+    <w:lsdException w:name="Colorful List Accent 6" w:uiPriority="72"/>
+    <w:lsdException w:name="Colorful Grid Accent 6" w:uiPriority="73"/>
+    <w:lsdException w:name="Subtle Emphasis" w:semiHidden="1" w:uiPriority="19" w:unhideWhenUsed="1" w:qFormat="1"/>
+    <w:lsdException w:name="Intense Emphasis" w:semiHidden="1" w:uiPriority="21" w:unhideWhenUsed="1" w:qFormat="1"/>
+    <w:lsdException w:name="Subtle Reference" w:semiHidden="1" w:uiPriority="31" w:unhideWhenUsed="1" w:qFormat="1"/>
+    <w:lsdException w:name="Intense Reference" w:semiHidden="1" w:uiPriority="32" w:unhideWhenUsed="1" w:qFormat="1"/>
+    <w:lsdException w:name="Book Title" w:semiHidden="1" w:uiPriority="33" w:unhideWhenUsed="1" w:qFormat="1"/>
+    <w:lsdException w:name="Bibliography" w:semiHidden="1" w:uiPriority="37" w:unhideWhenUsed="1"/>
+    <w:lsdException w:name="TOC Heading" w:semiHidden="1" w:uiPriority="39" w:unhideWhenUsed="1" w:qFormat="1"/>
+    <w:lsdException w:name="Plain Table 1" w:uiPriority="41"/>
+    <w:lsdException w:name="Plain Table 2" w:uiPriority="42"/>
+    <w:lsdException w:name="Plain Table 3" w:uiPriority="43"/>
+    <w:lsdException w:name="Plain Table 4" w:uiPriority="44"/>
+    <w:lsdException w:name="Plain Table 5" w:uiPriority="45"/>
+    <w:lsdException w:name="Grid Table Light" w:uiPriority="40"/>
+    <w:lsdException w:name="Grid Table 1 Light" w:uiPriority="46"/>
+    <w:lsdException w:name="Grid Table 2" w:uiPriority="47"/>
+    <w:lsdException w:name="Grid Table 3" w:uiPriority="48"/>
+    <w:lsdException w:name="Grid Table 4" w:uiPriority="49"/>
+    <w:lsdException w:name="Grid Table 5 Dark" w:uiPriority="50"/>
+    <w:lsdException w:name="Grid Table 6 Colorful" w:uiPriority="51"/>
+    <w:lsdException w:name="Grid Table 7 Colorful" w:uiPriority="52"/>
+    <w:lsdException w:name="Grid Table 1 Light Accent 1" w:uiPriority="46"/>
+    <w:lsdException w:name="Grid Table 2 Accent 1" w:uiPriority="47"/>
+    <w:lsdException w:name="Grid Table 3 Accent 1" w:uiPriority="48"/>
+    <w:lsdException w:name="Grid Table 4 Accent 1" w:uiPriority="49"/>
+    <w:lsdException w:name="Grid Table 5 Dark Accent 1" w:uiPriority="50"/>
+    <w:lsdException w:name="Grid Table 6 Colorful Accent 1" w:uiPriority="51"/>
+    <w:lsdException w:name="Grid Table 7 Colorful Accent 1" w:uiPriority="52"/>
+    <w:lsdException w:name="Grid Table 1 Light Accent 2" w:uiPriority="46"/>
+    <w:lsdException w:name="Grid Table 2 Accent 2" w:uiPriority="47"/>
+    <w:lsdException w:name="Grid Table 3 Accent 2" w:uiPriority="48"/>
+    <w:lsdException w:name="Grid Table 4 Accent 2" w:uiPriority="49"/>
+    <w:lsdException w:name="Grid Table 5 Dark Accent 2" w:uiPriority="50"/>
+    <w:lsdException w:name="Grid Table 6 Colorful Accent 2" w:uiPriority="51"/>
+    <w:lsdException w:name="Grid Table 7 Colorful Accent 2" w:uiPriority="52"/>
+    <w:lsdException w:name="Grid Table 1 Light Accent 3" w:uiPriority="46"/>
+    <w:lsdException w:name="Grid Table 2 Accent 3" w:uiPriority="47"/>
+    <w:lsdException w:name="Grid Table 3 Accent 3" w:uiPriority="48"/>
+    <w:lsdException w:name="Grid Table 4 Accent 3" w:uiPriority="49"/>
+    <w:lsdException w:name="Grid Table 5 Dark Accent 3" w:uiPriority="50"/>
+    <w:lsdException w:name="Grid Table 6 Colorful Accent 3" w:uiPriority="51"/>
+    <w:lsdException w:name="Grid Table 7 Colorful Accent 3" w:uiPriority="52"/>
+    <w:lsdException w:name="Grid Table 1 Light Accent 4" w:uiPriority="46"/>
+    <w:lsdException w:name="Grid Table 2 Accent 4" w:uiPriority="47"/>
+    <w:lsdException w:name="Grid Table 3 Accent 4" w:uiPriority="48"/>
+    <w:lsdException w:name="Grid Table 4 Accent 4" w:uiPriority="49"/>
+    <w:lsdException w:name="Grid Table 5 Dark Accent 4" w:uiPriority="50"/>
+    <w:lsdException w:name="Grid Table 6 Colorful Accent 4" w:uiPriority="51"/>
+    <w:lsdException w:name="Grid Table 7 Colorful Accent 4" w:uiPriority="52"/>
+    <w:lsdException w:name="Grid Table 1 Light Accent 5" w:uiPriority="46"/>
+    <w:lsdException w:name="Grid Table 2 Accent 5" w:uiPriority="47"/>
+    <w:lsdException w:name="Grid Table 3 Accent 5" w:uiPriority="48"/>
+    <w:lsdException w:name="Grid Table 4 Accent 5" w:uiPriority="49"/>
+    <w:lsdException w:name="Grid Table 5 Dark Accent 5" w:uiPriority="50"/>
+    <w:lsdException w:name="Grid Table 6 Colorful Accent 5" w:uiPriority="51"/>
+    <w:lsdException w:name="Grid Table 7 Colorful Accent 5" w:uiPriority="52"/>
+    <w:lsdException w:name="Grid Table 1 Light Accent 6" w:uiPriority="46"/>
+    <w:lsdException w:name="Grid Table 2 Accent 6" w:uiPriority="47"/>
+    <w:lsdException w:name="Grid Table 3 Accent 6" w:uiPriority="48"/>
+    <w:lsdException w:name="Grid Table 4 Accent 6" w:uiPriority="49"/>
+    <w:lsdException w:name="Grid Table 5 Dark Accent 6" w:uiPriority="50"/>
+    <w:lsdException w:name="Grid Table 6 Colorful Accent 6" w:uiPriority="51"/>
+    <w:lsdException w:name="Grid Table 7 Colorful Accent 6" w:uiPriority="52"/>
+    <w:lsdException w:name="List Table 1 Light" w:uiPriority="46"/>
+    <w:lsdException w:name="List Table 2" w:uiPriority="47"/>
+    <w:lsdException w:name="List Table 3" w:uiPriority="48"/>
+    <w:lsdException w:name="List Table 4" w:uiPriority="49"/>
+    <w:lsdException w:name="List Table 5 Dark" w:uiPriority="50"/>
+    <w:lsdException w:name="List Table 6 Colorful" w:uiPriority="51"/>
+    <w:lsdException w:name="List Table 7 Colorful" w:uiPriority="52"/>
+    <w:lsdException w:name="List Table 1 Light Accent 1" w:uiPriority="46"/>
+    <w:lsdException w:name="List Table 2 Accent 1" w:uiPriority="47"/>
+    <w:lsdException w:name="List Table 3 Accent 1" w:uiPriority="48"/>
+    <w:lsdException w:name="List Table 4 Accent 1" w:uiPriority="49"/>
+    <w:lsdException w:name="List Table 5 Dark Accent 1" w:uiPriority="50"/>
+    <w:lsdException w:name="List Table 6 Colorful Accent 1" w:uiPriority="51"/>
+    <w:lsdException w:name="List Table 7 Colorful Accent 1" w:uiPriority="52"/>
+    <w:lsdException w:name="List Table 1 Light Accent 2" w:uiPriority="46"/>
+    <w:lsdException w:name="List Table 2 Accent 2" w:uiPriority="47"/>
+    <w:lsdException w:name="List Table 3 Accent 2" w:uiPriority="48"/>
+    <w:lsdException w:name="List Table 4 Accent 2" w:uiPriority="49"/>
+    <w:lsdException w:name="List Table 5 Dark Accent 2" w:uiPriority="50"/>
+    <w:lsdException w:name="List Table 6 Colorful Accent 2" w:uiPriority="51"/>
+    <w:lsdException w:name="List Table 7 Colorful Accent 2" w:uiPriority="52"/>
+    <w:lsdException w:name="List Table 1 Light Accent 3" w:uiPriority="46"/>
+    <w:lsdException w:name="List Table 2 Accent 3" w:uiPriority="47"/>
+    <w:lsdException w:name="List Table 3 Accent 3" w:uiPriority="48"/>
+    <w:lsdException w:name="List Table 4 Accent 3" w:uiPriority="49"/>
+    <w:lsdException w:name="List Table 5 Dark Accent 3" w:uiPriority="50"/>
+    <w:lsdException w:name="List Table 6 Colorful Accent 3" w:uiPriority="51"/>
+    <w:lsdException w:name="List Table 7 Colorful Accent 3" w:uiPriority="52"/>
+    <w:lsdException w:name="List Table 1 Light Accent 4" w:uiPriority="46"/>
+    <w:lsdException w:name="List Table 2 Accent 4" w:uiPriority="47"/>
+    <w:lsdException w:name="List Table 3 Accent 4" w:uiPriority="48"/>
+    <w:lsdException w:name="List Table 4 Accent 4" w:uiPriority="49"/>
+    <w:lsdException w:name="List Table 5 Dark Accent 4" w:uiPriority="50"/>
+    <w:lsdException w:name="List Table 6 Colorful Accent 4" w:uiPriority="51"/>
+    <w:lsdException w:name="List Table 7 Colorful Accent 4" w:uiPriority="52"/>
+    <w:lsdException w:name="List Table 1 Light Accent 5" w:uiPriority="46"/>
+    <w:lsdException w:name="List Table 2 Accent 5" w:uiPriority="47"/>
+    <w:lsdException w:name="List Table 3 Accent 5" w:uiPriority="48"/>
+    <w:lsdException w:name="List Table 4 Accent 5" w:uiPriority="49"/>
+    <w:lsdException w:name="List Table 5 Dark Accent 5" w:uiPriority="50"/>
+    <w:lsdException w:name="List Table 6 Colorful Accent 5" w:uiPriority="51"/>
+    <w:lsdException w:name="List Table 7 Colorful Accent 5" w:uiPriority="52"/>
+    <w:lsdException w:name="List Table 1 Light Accent 6" w:uiPriority="46"/>
+    <w:lsdException w:name="List Table 2 Accent 6" w:uiPriority="47"/>
+    <w:lsdException w:name="List Table 3 Accent 6" w:uiPriority="48"/>
+    <w:lsdException w:name="List Table 4 Accent 6" w:uiPriority="49"/>
+    <w:lsdException w:name="List Table 5 Dark Accent 6" w:uiPriority="50"/>
+    <w:lsdException w:name="List Table 6 Colorful Accent 6" w:uiPriority="51"/>
+    <w:lsdException w:name="List Table 7 Colorful Accent 6" w:uiPriority="52"/>
+    <w:lsdException w:name="Mention" w:semiHidden="1" w:unhideWhenUsed="1"/>
+    <w:lsdException w:name="Smart Hyperlink" w:semiHidden="1" w:unhideWhenUsed="1"/>
+    <w:lsdException w:name="Hashtag" w:semiHidden="1" w:unhideWhenUsed="1"/>
+    <w:lsdException w:name="Unresolved Mention" w:semiHidden="1" w:unhideWhenUsed="1"/>
+    <w:lsdException w:name="Smart Link" w:semiHidden="1" w:unhideWhenUsed="1"/>
   </w:latentStyles>
   <w:style w:type="paragraph" w:default="1" w:styleId="Normal">
     <w:name w:val="Normal"/>
@@ -2299,7 +3470,6 @@
     <w:uiPriority w:val="99"/>
     <w:semiHidden/>
     <w:unhideWhenUsed/>
-    <w:qFormat/>
     <w:tblPr>
       <w:tblInd w:w="0" w:type="dxa"/>
       <w:tblCellMar>
@@ -2574,8 +3744,7 @@
   <w:style w:type="character" w:styleId="Strong">
     <w:name w:val="Strong"/>
     <w:basedOn w:val="DefaultParagraphFont"/>
-    <w:uiPriority w:val="8"/>
-    <w:semiHidden/>
+    <w:uiPriority w:val="22"/>
     <w:unhideWhenUsed/>
     <w:qFormat/>
     <w:rsid w:val="003C678D"/>
@@ -2815,7 +3984,6 @@
     <w:name w:val="List Paragraph"/>
     <w:basedOn w:val="Normal"/>
     <w:uiPriority w:val="34"/>
-    <w:semiHidden/>
     <w:unhideWhenUsed/>
     <w:qFormat/>
     <w:rsid w:val="003C678D"/>
@@ -3098,7 +4266,6 @@
     <w:uiPriority w:val="39"/>
     <w:rsid w:val="003C678D"/>
     <w:tblPr>
-      <w:tblInd w:w="0" w:type="dxa"/>
       <w:tblBorders>
         <w:top w:val="single" w:sz="4" w:space="0" w:color="auto"/>
         <w:left w:val="single" w:sz="4" w:space="0" w:color="auto"/>
@@ -3107,12 +4274,6 @@
         <w:insideH w:val="single" w:sz="4" w:space="0" w:color="auto"/>
         <w:insideV w:val="single" w:sz="4" w:space="0" w:color="auto"/>
       </w:tblBorders>
-      <w:tblCellMar>
-        <w:top w:w="0" w:type="dxa"/>
-        <w:left w:w="108" w:type="dxa"/>
-        <w:bottom w:w="0" w:type="dxa"/>
-        <w:right w:w="108" w:type="dxa"/>
-      </w:tblCellMar>
     </w:tblPr>
   </w:style>
   <w:style w:type="table" w:customStyle="1" w:styleId="Generaltable">
@@ -3123,14 +4284,11 @@
     <w:tblPr>
       <w:tblStyleRowBandSize w:val="1"/>
       <w:tblStyleColBandSize w:val="1"/>
-      <w:tblInd w:w="0" w:type="dxa"/>
       <w:tblBorders>
         <w:insideH w:val="single" w:sz="8" w:space="0" w:color="C9C9C9" w:themeColor="text2" w:themeTint="40"/>
       </w:tblBorders>
       <w:tblCellMar>
-        <w:top w:w="0" w:type="dxa"/>
         <w:left w:w="0" w:type="dxa"/>
-        <w:bottom w:w="0" w:type="dxa"/>
         <w:right w:w="504" w:type="dxa"/>
       </w:tblCellMar>
     </w:tblPr>
@@ -3227,11 +4385,47 @@
       </w:pPr>
     </w:tblStylePr>
   </w:style>
+  <w:style w:type="character" w:styleId="HTMLCode">
+    <w:name w:val="HTML Code"/>
+    <w:basedOn w:val="DefaultParagraphFont"/>
+    <w:uiPriority w:val="99"/>
+    <w:semiHidden/>
+    <w:unhideWhenUsed/>
+    <w:rsid w:val="002A6CB0"/>
+    <w:rPr>
+      <w:rFonts w:ascii="Courier New" w:eastAsia="Times New Roman" w:hAnsi="Courier New" w:cs="Courier New"/>
+      <w:sz w:val="20"/>
+      <w:szCs w:val="20"/>
+    </w:rPr>
+  </w:style>
+  <w:style w:type="character" w:styleId="Hyperlink">
+    <w:name w:val="Hyperlink"/>
+    <w:basedOn w:val="DefaultParagraphFont"/>
+    <w:uiPriority w:val="99"/>
+    <w:unhideWhenUsed/>
+    <w:rsid w:val="000A7DC6"/>
+    <w:rPr>
+      <w:color w:val="B67AC3" w:themeColor="hyperlink"/>
+      <w:u w:val="single"/>
+    </w:rPr>
+  </w:style>
+  <w:style w:type="character" w:styleId="UnresolvedMention">
+    <w:name w:val="Unresolved Mention"/>
+    <w:basedOn w:val="DefaultParagraphFont"/>
+    <w:uiPriority w:val="99"/>
+    <w:semiHidden/>
+    <w:unhideWhenUsed/>
+    <w:rsid w:val="000A7DC6"/>
+    <w:rPr>
+      <w:color w:val="605E5C"/>
+      <w:shd w:val="clear" w:color="auto" w:fill="E1DFDD"/>
+    </w:rPr>
+  </w:style>
 </w:styles>
 </file>
 
 <file path=word/glossary/document.xml><?xml version="1.0" encoding="utf-8"?>
-<w:glossaryDocument xmlns:ve="http://schemas.openxmlformats.org/markup-compatibility/2006" xmlns:o="urn:schemas-microsoft-com:office:office" xmlns:r="http://schemas.openxmlformats.org/officeDocument/2006/relationships" xmlns:m="http://schemas.openxmlformats.org/officeDocument/2006/math" xmlns:v="urn:schemas-microsoft-com:vml" xmlns:wp="http://schemas.openxmlformats.org/drawingml/2006/wordprocessingDrawing" xmlns:w10="urn:schemas-microsoft-com:office:word" xmlns:w="http://schemas.openxmlformats.org/wordprocessingml/2006/main" xmlns:wne="http://schemas.microsoft.com/office/word/2006/wordml">
+<w:glossaryDocument xmlns:wpc="http://schemas.microsoft.com/office/word/2010/wordprocessingCanvas" xmlns:cx="http://schemas.microsoft.com/office/drawing/2014/chartex" xmlns:cx1="http://schemas.microsoft.com/office/drawing/2015/9/8/chartex" xmlns:cx2="http://schemas.microsoft.com/office/drawing/2015/10/21/chartex" xmlns:cx3="http://schemas.microsoft.com/office/drawing/2016/5/9/chartex" xmlns:cx4="http://schemas.microsoft.com/office/drawing/2016/5/10/chartex" xmlns:cx5="http://schemas.microsoft.com/office/drawing/2016/5/11/chartex" xmlns:cx6="http://schemas.microsoft.com/office/drawing/2016/5/12/chartex" xmlns:cx7="http://schemas.microsoft.com/office/drawing/2016/5/13/chartex" xmlns:cx8="http://schemas.microsoft.com/office/drawing/2016/5/14/chartex" xmlns:mc="http://schemas.openxmlformats.org/markup-compatibility/2006" xmlns:aink="http://schemas.microsoft.com/office/drawing/2016/ink" xmlns:am3d="http://schemas.microsoft.com/office/drawing/2017/model3d" xmlns:o="urn:schemas-microsoft-com:office:office" xmlns:oel="http://schemas.microsoft.com/office/2019/extlst" xmlns:r="http://schemas.openxmlformats.org/officeDocument/2006/relationships" xmlns:m="http://schemas.openxmlformats.org/officeDocument/2006/math" xmlns:v="urn:schemas-microsoft-com:vml" xmlns:wp14="http://schemas.microsoft.com/office/word/2010/wordprocessingDrawing" xmlns:wp="http://schemas.openxmlformats.org/drawingml/2006/wordprocessingDrawing" xmlns:w10="urn:schemas-microsoft-com:office:word" xmlns:w="http://schemas.openxmlformats.org/wordprocessingml/2006/main" xmlns:w14="http://schemas.microsoft.com/office/word/2010/wordml" xmlns:w15="http://schemas.microsoft.com/office/word/2012/wordml" xmlns:w16cex="http://schemas.microsoft.com/office/word/2018/wordml/cex" xmlns:w16cid="http://schemas.microsoft.com/office/word/2016/wordml/cid" xmlns:w16="http://schemas.microsoft.com/office/word/2018/wordml" xmlns:w16du="http://schemas.microsoft.com/office/word/2023/wordml/word16du" xmlns:w16sdtdh="http://schemas.microsoft.com/office/word/2020/wordml/sdtdatahash" xmlns:w16sdtfl="http://schemas.microsoft.com/office/word/2024/wordml/sdtformatlock" xmlns:w16se="http://schemas.microsoft.com/office/word/2015/wordml/symex" xmlns:wpg="http://schemas.microsoft.com/office/word/2010/wordprocessingGroup" xmlns:wpi="http://schemas.microsoft.com/office/word/2010/wordprocessingInk" xmlns:wne="http://schemas.microsoft.com/office/word/2006/wordml" xmlns:wps="http://schemas.microsoft.com/office/word/2010/wordprocessingShape" mc:Ignorable="w14 w15 w16se w16cid w16 w16cex w16sdtdh w16sdtfl w16du wp14">
   <w:docParts>
     <w:docPart>
       <w:docPartPr>
@@ -3267,11 +4461,11 @@
 </file>
 
 <file path=word/glossary/fontTable.xml><?xml version="1.0" encoding="utf-8"?>
-<w:fonts xmlns:r="http://schemas.openxmlformats.org/officeDocument/2006/relationships" xmlns:w="http://schemas.openxmlformats.org/wordprocessingml/2006/main">
+<w:fonts xmlns:mc="http://schemas.openxmlformats.org/markup-compatibility/2006" xmlns:r="http://schemas.openxmlformats.org/officeDocument/2006/relationships" xmlns:w="http://schemas.openxmlformats.org/wordprocessingml/2006/main" xmlns:w14="http://schemas.microsoft.com/office/word/2010/wordml" xmlns:w15="http://schemas.microsoft.com/office/word/2012/wordml" xmlns:w16cex="http://schemas.microsoft.com/office/word/2018/wordml/cex" xmlns:w16cid="http://schemas.microsoft.com/office/word/2016/wordml/cid" xmlns:w16="http://schemas.microsoft.com/office/word/2018/wordml" xmlns:w16du="http://schemas.microsoft.com/office/word/2023/wordml/word16du" xmlns:w16sdtdh="http://schemas.microsoft.com/office/word/2020/wordml/sdtdatahash" xmlns:w16sdtfl="http://schemas.microsoft.com/office/word/2024/wordml/sdtformatlock" xmlns:w16se="http://schemas.microsoft.com/office/word/2015/wordml/symex" mc:Ignorable="w14 w15 w16se w16cid w16 w16cex w16sdtdh w16sdtfl w16du">
   <w:font w:name="Symbol">
     <w:panose1 w:val="05050102010706020507"/>
     <w:charset w:val="02"/>
-    <w:family w:val="roman"/>
+    <w:family w:val="decorative"/>
     <w:pitch w:val="variable"/>
     <w:sig w:usb0="00000000" w:usb1="10000000" w:usb2="00000000" w:usb3="00000000" w:csb0="80000000" w:csb1="00000000"/>
   </w:font>
@@ -3291,46 +4485,24 @@
   </w:font>
   <w:font w:name="Wingdings">
     <w:panose1 w:val="05000000000000000000"/>
-    <w:charset w:val="02"/>
-    <w:family w:val="auto"/>
+    <w:charset w:val="4D"/>
+    <w:family w:val="decorative"/>
     <w:pitch w:val="variable"/>
-    <w:sig w:usb0="00000000" w:usb1="10000000" w:usb2="00000000" w:usb3="00000000" w:csb0="80000000" w:csb1="00000000"/>
+    <w:sig w:usb0="00000003" w:usb1="00000000" w:usb2="00000000" w:usb3="00000000" w:csb0="80000001" w:csb1="00000000"/>
   </w:font>
   <w:font w:name="Verdana">
     <w:panose1 w:val="020B0604030504040204"/>
     <w:charset w:val="00"/>
     <w:family w:val="swiss"/>
     <w:pitch w:val="variable"/>
-    <w:sig w:usb0="A00006FF" w:usb1="4000205B" w:usb2="00000010" w:usb3="00000000" w:csb0="0000019F" w:csb1="00000000"/>
-  </w:font>
-  <w:font w:name="Tahoma">
-    <w:panose1 w:val="020B0604030504040204"/>
-    <w:charset w:val="00"/>
-    <w:family w:val="swiss"/>
-    <w:pitch w:val="variable"/>
-    <w:sig w:usb0="E1002EFF" w:usb1="C000605B" w:usb2="00000029" w:usb3="00000000" w:csb0="000101FF" w:csb1="00000000"/>
-  </w:font>
-  <w:font w:name="Microsoft YaHei">
-    <w:panose1 w:val="020B0503020204020204"/>
-    <w:charset w:val="86"/>
-    <w:family w:val="roman"/>
-    <w:notTrueType/>
-    <w:pitch w:val="default"/>
-    <w:sig w:usb0="00000000" w:usb1="00000000" w:usb2="00000000" w:usb3="00000000" w:csb0="00000000" w:csb1="00000000"/>
+    <w:sig w:usb0="A10006FF" w:usb1="4000205B" w:usb2="00000010" w:usb3="00000000" w:csb0="0000019F" w:csb1="00000000"/>
   </w:font>
   <w:font w:name="Segoe UI">
     <w:panose1 w:val="020B0502040204020203"/>
     <w:charset w:val="00"/>
-    <w:family w:val="roman"/>
-    <w:pitch w:val="variable"/>
-    <w:sig w:usb0="00000000" w:usb1="00000000" w:usb2="00000000" w:usb3="00000000" w:csb0="00000000" w:csb1="00000000"/>
-  </w:font>
-  <w:font w:name="Microsoft YaHei">
-    <w:panose1 w:val="020B0503020204020204"/>
-    <w:charset w:val="86"/>
     <w:family w:val="swiss"/>
     <w:pitch w:val="variable"/>
-    <w:sig w:usb0="80000287" w:usb1="2ACF3C50" w:usb2="00000016" w:usb3="00000000" w:csb0="0004001F" w:csb1="00000000"/>
+    <w:sig w:usb0="E4002EFF" w:usb1="C000E47F" w:usb2="00000009" w:usb3="00000000" w:csb0="000001FF" w:csb1="00000000"/>
   </w:font>
   <w:font w:name="Liberation Sans">
     <w:altName w:val="Arial"/>
@@ -3339,6 +4511,13 @@
     <w:family w:val="swiss"/>
     <w:pitch w:val="variable"/>
     <w:sig w:usb0="E0000AFF" w:usb1="500078FF" w:usb2="00000021" w:usb3="00000000" w:csb0="000001BF" w:csb1="00000000"/>
+  </w:font>
+  <w:font w:name="Microsoft YaHei">
+    <w:panose1 w:val="020B0503020204020204"/>
+    <w:charset w:val="86"/>
+    <w:family w:val="swiss"/>
+    <w:pitch w:val="variable"/>
+    <w:sig w:usb0="80000287" w:usb1="2ACF3C50" w:usb2="00000016" w:usb3="00000000" w:csb0="0004001F" w:csb1="00000000"/>
   </w:font>
   <w:font w:name="Lucida Sans">
     <w:panose1 w:val="020B0602030504020204"/>
@@ -3352,28 +4531,28 @@
     <w:charset w:val="00"/>
     <w:family w:val="swiss"/>
     <w:pitch w:val="variable"/>
-    <w:sig w:usb0="E0002EFF" w:usb1="C000785B" w:usb2="00000009" w:usb3="00000000" w:csb0="000001FF" w:csb1="00000000"/>
+    <w:sig w:usb0="E0002AFF" w:usb1="C0007843" w:usb2="00000009" w:usb3="00000000" w:csb0="000001FF" w:csb1="00000000"/>
   </w:font>
-  <w:font w:name="Calibri">
-    <w:panose1 w:val="020F0502020204030204"/>
+  <w:font w:name="Aptos">
+    <w:panose1 w:val="020B0004020202020204"/>
     <w:charset w:val="00"/>
     <w:family w:val="swiss"/>
     <w:pitch w:val="variable"/>
-    <w:sig w:usb0="E4002EFF" w:usb1="C200247B" w:usb2="00000009" w:usb3="00000000" w:csb0="000001FF" w:csb1="00000000"/>
+    <w:sig w:usb0="20000287" w:usb1="00000003" w:usb2="00000000" w:usb3="00000000" w:csb0="0000019F" w:csb1="00000000"/>
   </w:font>
-  <w:font w:name="Cambria">
-    <w:panose1 w:val="02040503050406030204"/>
+  <w:font w:name="Aptos Display">
+    <w:panose1 w:val="020B0004020202020204"/>
     <w:charset w:val="00"/>
-    <w:family w:val="roman"/>
+    <w:family w:val="swiss"/>
     <w:pitch w:val="variable"/>
-    <w:sig w:usb0="E00006FF" w:usb1="420024FF" w:usb2="02000000" w:usb3="00000000" w:csb0="0000019F" w:csb1="00000000"/>
+    <w:sig w:usb0="20000287" w:usb1="00000003" w:usb2="00000000" w:usb3="00000000" w:csb0="0000019F" w:csb1="00000000"/>
   </w:font>
 </w:fonts>
 </file>
 
 <file path=word/glossary/numbering.xml><?xml version="1.0" encoding="utf-8"?>
-<w:numbering xmlns:ve="http://schemas.openxmlformats.org/markup-compatibility/2006" xmlns:o="urn:schemas-microsoft-com:office:office" xmlns:r="http://schemas.openxmlformats.org/officeDocument/2006/relationships" xmlns:m="http://schemas.openxmlformats.org/officeDocument/2006/math" xmlns:v="urn:schemas-microsoft-com:vml" xmlns:wp="http://schemas.openxmlformats.org/drawingml/2006/wordprocessingDrawing" xmlns:w10="urn:schemas-microsoft-com:office:word" xmlns:w="http://schemas.openxmlformats.org/wordprocessingml/2006/main" xmlns:wne="http://schemas.microsoft.com/office/word/2006/wordml">
-  <w:abstractNum w:abstractNumId="0">
+<w:numbering xmlns:wpc="http://schemas.microsoft.com/office/word/2010/wordprocessingCanvas" xmlns:cx="http://schemas.microsoft.com/office/drawing/2014/chartex" xmlns:cx1="http://schemas.microsoft.com/office/drawing/2015/9/8/chartex" xmlns:cx2="http://schemas.microsoft.com/office/drawing/2015/10/21/chartex" xmlns:cx3="http://schemas.microsoft.com/office/drawing/2016/5/9/chartex" xmlns:cx4="http://schemas.microsoft.com/office/drawing/2016/5/10/chartex" xmlns:cx5="http://schemas.microsoft.com/office/drawing/2016/5/11/chartex" xmlns:cx6="http://schemas.microsoft.com/office/drawing/2016/5/12/chartex" xmlns:cx7="http://schemas.microsoft.com/office/drawing/2016/5/13/chartex" xmlns:cx8="http://schemas.microsoft.com/office/drawing/2016/5/14/chartex" xmlns:mc="http://schemas.openxmlformats.org/markup-compatibility/2006" xmlns:aink="http://schemas.microsoft.com/office/drawing/2016/ink" xmlns:am3d="http://schemas.microsoft.com/office/drawing/2017/model3d" xmlns:o="urn:schemas-microsoft-com:office:office" xmlns:oel="http://schemas.microsoft.com/office/2019/extlst" xmlns:r="http://schemas.openxmlformats.org/officeDocument/2006/relationships" xmlns:m="http://schemas.openxmlformats.org/officeDocument/2006/math" xmlns:v="urn:schemas-microsoft-com:vml" xmlns:wp14="http://schemas.microsoft.com/office/word/2010/wordprocessingDrawing" xmlns:wp="http://schemas.openxmlformats.org/drawingml/2006/wordprocessingDrawing" xmlns:w10="urn:schemas-microsoft-com:office:word" xmlns:w="http://schemas.openxmlformats.org/wordprocessingml/2006/main" xmlns:w14="http://schemas.microsoft.com/office/word/2010/wordml" xmlns:w15="http://schemas.microsoft.com/office/word/2012/wordml" xmlns:w16cex="http://schemas.microsoft.com/office/word/2018/wordml/cex" xmlns:w16cid="http://schemas.microsoft.com/office/word/2016/wordml/cid" xmlns:w16="http://schemas.microsoft.com/office/word/2018/wordml" xmlns:w16du="http://schemas.microsoft.com/office/word/2023/wordml/word16du" xmlns:w16sdtdh="http://schemas.microsoft.com/office/word/2020/wordml/sdtdatahash" xmlns:w16sdtfl="http://schemas.microsoft.com/office/word/2024/wordml/sdtformatlock" xmlns:w16se="http://schemas.microsoft.com/office/word/2015/wordml/symex" xmlns:wpg="http://schemas.microsoft.com/office/word/2010/wordprocessingGroup" xmlns:wpi="http://schemas.microsoft.com/office/word/2010/wordprocessingInk" xmlns:wne="http://schemas.microsoft.com/office/word/2006/wordml" xmlns:wps="http://schemas.microsoft.com/office/word/2010/wordprocessingShape" mc:Ignorable="w14 w15 w16se w16cid w16 w16cex w16sdtdh w16sdtfl w16du wp14">
+  <w:abstractNum w:abstractNumId="0" w15:restartNumberingAfterBreak="0">
     <w:nsid w:val="4A851C91"/>
     <w:multiLevelType w:val="multilevel"/>
     <w:tmpl w:val="5270E964"/>
@@ -3486,23 +4665,27 @@
       </w:pPr>
     </w:lvl>
   </w:abstractNum>
-  <w:num w:numId="1">
+  <w:num w:numId="1" w16cid:durableId="295914121">
     <w:abstractNumId w:val="0"/>
   </w:num>
 </w:numbering>
 </file>
 
 <file path=word/glossary/settings.xml><?xml version="1.0" encoding="utf-8"?>
-<w:settings xmlns:o="urn:schemas-microsoft-com:office:office" xmlns:r="http://schemas.openxmlformats.org/officeDocument/2006/relationships" xmlns:m="http://schemas.openxmlformats.org/officeDocument/2006/math" xmlns:v="urn:schemas-microsoft-com:vml" xmlns:w10="urn:schemas-microsoft-com:office:word" xmlns:w="http://schemas.openxmlformats.org/wordprocessingml/2006/main" xmlns:sl="http://schemas.openxmlformats.org/schemaLibrary/2006/main">
+<w:settings xmlns:mc="http://schemas.openxmlformats.org/markup-compatibility/2006" xmlns:o="urn:schemas-microsoft-com:office:office" xmlns:r="http://schemas.openxmlformats.org/officeDocument/2006/relationships" xmlns:m="http://schemas.openxmlformats.org/officeDocument/2006/math" xmlns:v="urn:schemas-microsoft-com:vml" xmlns:w10="urn:schemas-microsoft-com:office:word" xmlns:w="http://schemas.openxmlformats.org/wordprocessingml/2006/main" xmlns:w14="http://schemas.microsoft.com/office/word/2010/wordml" xmlns:w15="http://schemas.microsoft.com/office/word/2012/wordml" xmlns:w16cex="http://schemas.microsoft.com/office/word/2018/wordml/cex" xmlns:w16cid="http://schemas.microsoft.com/office/word/2016/wordml/cid" xmlns:w16="http://schemas.microsoft.com/office/word/2018/wordml" xmlns:w16du="http://schemas.microsoft.com/office/word/2023/wordml/word16du" xmlns:w16sdtdh="http://schemas.microsoft.com/office/word/2020/wordml/sdtdatahash" xmlns:w16sdtfl="http://schemas.microsoft.com/office/word/2024/wordml/sdtformatlock" xmlns:w16se="http://schemas.microsoft.com/office/word/2015/wordml/symex" xmlns:sl="http://schemas.openxmlformats.org/schemaLibrary/2006/main" mc:Ignorable="w14 w15 w16se w16cid w16 w16cex w16sdtdh w16sdtfl w16du">
   <w:view w:val="normal"/>
   <w:defaultTabStop w:val="720"/>
   <w:characterSpacingControl w:val="doNotCompress"/>
   <w:compat>
     <w:useFELayout/>
+    <w:compatSetting w:name="compatibilityMode" w:uri="http://schemas.microsoft.com/office/word" w:val="12"/>
+    <w:compatSetting w:name="useWord2013TrackBottomHyphenation" w:uri="http://schemas.microsoft.com/office/word" w:val="1"/>
   </w:compat>
   <w:rsids>
     <w:rsidRoot w:val="0042225E"/>
     <w:rsid w:val="0042225E"/>
+    <w:rsid w:val="00474898"/>
+    <w:rsid w:val="004F35CF"/>
     <w:rsid w:val="00F63671"/>
   </w:rsids>
   <m:mathPr>
@@ -3526,7 +4709,7 @@
 </file>
 
 <file path=word/glossary/styles.xml><?xml version="1.0" encoding="utf-8"?>
-<w:styles xmlns:r="http://schemas.openxmlformats.org/officeDocument/2006/relationships" xmlns:w="http://schemas.openxmlformats.org/wordprocessingml/2006/main">
+<w:styles xmlns:mc="http://schemas.openxmlformats.org/markup-compatibility/2006" xmlns:r="http://schemas.openxmlformats.org/officeDocument/2006/relationships" xmlns:w="http://schemas.openxmlformats.org/wordprocessingml/2006/main" xmlns:w14="http://schemas.microsoft.com/office/word/2010/wordml" xmlns:w15="http://schemas.microsoft.com/office/word/2012/wordml" xmlns:w16cex="http://schemas.microsoft.com/office/word/2018/wordml/cex" xmlns:w16cid="http://schemas.microsoft.com/office/word/2016/wordml/cid" xmlns:w16="http://schemas.microsoft.com/office/word/2018/wordml" xmlns:w16du="http://schemas.microsoft.com/office/word/2023/wordml/word16du" xmlns:w16sdtdh="http://schemas.microsoft.com/office/word/2020/wordml/sdtdatahash" xmlns:w16sdtfl="http://schemas.microsoft.com/office/word/2024/wordml/sdtformatlock" xmlns:w16se="http://schemas.microsoft.com/office/word/2015/wordml/symex" mc:Ignorable="w14 w15 w16se w16cid w16 w16cex w16sdtdh w16sdtfl w16du">
   <w:docDefaults>
     <w:rPrDefault>
       <w:rPr>
@@ -3538,145 +4721,383 @@
     </w:rPrDefault>
     <w:pPrDefault/>
   </w:docDefaults>
-  <w:latentStyles w:defLockedState="0" w:defUIPriority="99" w:defSemiHidden="1" w:defUnhideWhenUsed="1" w:defQFormat="0" w:count="267">
-    <w:lsdException w:name="Normal" w:semiHidden="0" w:uiPriority="0" w:unhideWhenUsed="0" w:qFormat="1"/>
-    <w:lsdException w:name="heading 1" w:semiHidden="0" w:uiPriority="9" w:unhideWhenUsed="0" w:qFormat="1"/>
-    <w:lsdException w:name="heading 2" w:uiPriority="9" w:qFormat="1"/>
-    <w:lsdException w:name="heading 3" w:uiPriority="9" w:qFormat="1"/>
-    <w:lsdException w:name="heading 4" w:uiPriority="9" w:qFormat="1"/>
-    <w:lsdException w:name="heading 5" w:uiPriority="9" w:qFormat="1"/>
-    <w:lsdException w:name="heading 6" w:uiPriority="9" w:qFormat="1"/>
-    <w:lsdException w:name="heading 7" w:uiPriority="9" w:qFormat="1"/>
-    <w:lsdException w:name="heading 8" w:uiPriority="9" w:qFormat="1"/>
-    <w:lsdException w:name="heading 9" w:uiPriority="9" w:qFormat="1"/>
-    <w:lsdException w:name="toc 1" w:uiPriority="39"/>
-    <w:lsdException w:name="toc 2" w:uiPriority="39"/>
-    <w:lsdException w:name="toc 3" w:uiPriority="39"/>
-    <w:lsdException w:name="toc 4" w:uiPriority="39"/>
-    <w:lsdException w:name="toc 5" w:uiPriority="39"/>
-    <w:lsdException w:name="toc 6" w:uiPriority="39"/>
-    <w:lsdException w:name="toc 7" w:uiPriority="39"/>
-    <w:lsdException w:name="toc 8" w:uiPriority="39"/>
-    <w:lsdException w:name="toc 9" w:uiPriority="39"/>
-    <w:lsdException w:name="caption" w:uiPriority="35" w:qFormat="1"/>
-    <w:lsdException w:name="List Bullet" w:uiPriority="12" w:qFormat="1"/>
-    <w:lsdException w:name="Title" w:semiHidden="0" w:uiPriority="10" w:unhideWhenUsed="0" w:qFormat="1"/>
-    <w:lsdException w:name="Default Paragraph Font" w:uiPriority="1"/>
-    <w:lsdException w:name="Subtitle" w:semiHidden="0" w:uiPriority="11" w:unhideWhenUsed="0" w:qFormat="1"/>
-    <w:lsdException w:name="Strong" w:semiHidden="0" w:uiPriority="22" w:unhideWhenUsed="0" w:qFormat="1"/>
-    <w:lsdException w:name="Emphasis" w:semiHidden="0" w:uiPriority="10" w:unhideWhenUsed="0" w:qFormat="1"/>
-    <w:lsdException w:name="Table Grid" w:semiHidden="0" w:uiPriority="39" w:unhideWhenUsed="0"/>
-    <w:lsdException w:name="Placeholder Text" w:unhideWhenUsed="0"/>
-    <w:lsdException w:name="No Spacing" w:semiHidden="0" w:uiPriority="1" w:unhideWhenUsed="0" w:qFormat="1"/>
-    <w:lsdException w:name="Light Shading" w:semiHidden="0" w:uiPriority="60" w:unhideWhenUsed="0"/>
-    <w:lsdException w:name="Light List" w:semiHidden="0" w:uiPriority="61" w:unhideWhenUsed="0"/>
-    <w:lsdException w:name="Light Grid" w:semiHidden="0" w:uiPriority="62" w:unhideWhenUsed="0"/>
-    <w:lsdException w:name="Medium Shading 1" w:semiHidden="0" w:uiPriority="63" w:unhideWhenUsed="0"/>
-    <w:lsdException w:name="Medium Shading 2" w:semiHidden="0" w:uiPriority="64" w:unhideWhenUsed="0"/>
-    <w:lsdException w:name="Medium List 1" w:semiHidden="0" w:uiPriority="65" w:unhideWhenUsed="0"/>
-    <w:lsdException w:name="Medium List 2" w:semiHidden="0" w:uiPriority="66" w:unhideWhenUsed="0"/>
-    <w:lsdException w:name="Medium Grid 1" w:semiHidden="0" w:uiPriority="67" w:unhideWhenUsed="0"/>
-    <w:lsdException w:name="Medium Grid 2" w:semiHidden="0" w:uiPriority="68" w:unhideWhenUsed="0"/>
-    <w:lsdException w:name="Medium Grid 3" w:semiHidden="0" w:uiPriority="69" w:unhideWhenUsed="0"/>
-    <w:lsdException w:name="Dark List" w:semiHidden="0" w:uiPriority="70" w:unhideWhenUsed="0"/>
-    <w:lsdException w:name="Colorful Shading" w:semiHidden="0" w:uiPriority="71" w:unhideWhenUsed="0"/>
-    <w:lsdException w:name="Colorful List" w:semiHidden="0" w:uiPriority="72" w:unhideWhenUsed="0"/>
-    <w:lsdException w:name="Colorful Grid" w:semiHidden="0" w:uiPriority="73" w:unhideWhenUsed="0"/>
-    <w:lsdException w:name="Light Shading Accent 1" w:semiHidden="0" w:uiPriority="60" w:unhideWhenUsed="0"/>
-    <w:lsdException w:name="Light List Accent 1" w:semiHidden="0" w:uiPriority="61" w:unhideWhenUsed="0"/>
-    <w:lsdException w:name="Light Grid Accent 1" w:semiHidden="0" w:uiPriority="62" w:unhideWhenUsed="0"/>
-    <w:lsdException w:name="Medium Shading 1 Accent 1" w:semiHidden="0" w:uiPriority="63" w:unhideWhenUsed="0"/>
-    <w:lsdException w:name="Medium Shading 2 Accent 1" w:semiHidden="0" w:uiPriority="64" w:unhideWhenUsed="0"/>
-    <w:lsdException w:name="Medium List 1 Accent 1" w:semiHidden="0" w:uiPriority="65" w:unhideWhenUsed="0"/>
-    <w:lsdException w:name="Revision" w:unhideWhenUsed="0"/>
-    <w:lsdException w:name="List Paragraph" w:semiHidden="0" w:uiPriority="34" w:unhideWhenUsed="0" w:qFormat="1"/>
-    <w:lsdException w:name="Quote" w:semiHidden="0" w:uiPriority="29" w:unhideWhenUsed="0" w:qFormat="1"/>
-    <w:lsdException w:name="Intense Quote" w:semiHidden="0" w:uiPriority="30" w:unhideWhenUsed="0" w:qFormat="1"/>
-    <w:lsdException w:name="Medium List 2 Accent 1" w:semiHidden="0" w:uiPriority="66" w:unhideWhenUsed="0"/>
-    <w:lsdException w:name="Medium Grid 1 Accent 1" w:semiHidden="0" w:uiPriority="67" w:unhideWhenUsed="0"/>
-    <w:lsdException w:name="Medium Grid 2 Accent 1" w:semiHidden="0" w:uiPriority="68" w:unhideWhenUsed="0"/>
-    <w:lsdException w:name="Medium Grid 3 Accent 1" w:semiHidden="0" w:uiPriority="69" w:unhideWhenUsed="0"/>
-    <w:lsdException w:name="Dark List Accent 1" w:semiHidden="0" w:uiPriority="70" w:unhideWhenUsed="0"/>
-    <w:lsdException w:name="Colorful Shading Accent 1" w:semiHidden="0" w:uiPriority="71" w:unhideWhenUsed="0"/>
-    <w:lsdException w:name="Colorful List Accent 1" w:semiHidden="0" w:uiPriority="72" w:unhideWhenUsed="0"/>
-    <w:lsdException w:name="Colorful Grid Accent 1" w:semiHidden="0" w:uiPriority="73" w:unhideWhenUsed="0"/>
-    <w:lsdException w:name="Light Shading Accent 2" w:semiHidden="0" w:uiPriority="60" w:unhideWhenUsed="0"/>
-    <w:lsdException w:name="Light List Accent 2" w:semiHidden="0" w:uiPriority="61" w:unhideWhenUsed="0"/>
-    <w:lsdException w:name="Light Grid Accent 2" w:semiHidden="0" w:uiPriority="62" w:unhideWhenUsed="0"/>
-    <w:lsdException w:name="Medium Shading 1 Accent 2" w:semiHidden="0" w:uiPriority="63" w:unhideWhenUsed="0"/>
-    <w:lsdException w:name="Medium Shading 2 Accent 2" w:semiHidden="0" w:uiPriority="64" w:unhideWhenUsed="0"/>
-    <w:lsdException w:name="Medium List 1 Accent 2" w:semiHidden="0" w:uiPriority="65" w:unhideWhenUsed="0"/>
-    <w:lsdException w:name="Medium List 2 Accent 2" w:semiHidden="0" w:uiPriority="66" w:unhideWhenUsed="0"/>
-    <w:lsdException w:name="Medium Grid 1 Accent 2" w:semiHidden="0" w:uiPriority="67" w:unhideWhenUsed="0"/>
-    <w:lsdException w:name="Medium Grid 2 Accent 2" w:semiHidden="0" w:uiPriority="68" w:unhideWhenUsed="0"/>
-    <w:lsdException w:name="Medium Grid 3 Accent 2" w:semiHidden="0" w:uiPriority="69" w:unhideWhenUsed="0"/>
-    <w:lsdException w:name="Dark List Accent 2" w:semiHidden="0" w:uiPriority="70" w:unhideWhenUsed="0"/>
-    <w:lsdException w:name="Colorful Shading Accent 2" w:semiHidden="0" w:uiPriority="71" w:unhideWhenUsed="0"/>
-    <w:lsdException w:name="Colorful List Accent 2" w:semiHidden="0" w:uiPriority="72" w:unhideWhenUsed="0"/>
-    <w:lsdException w:name="Colorful Grid Accent 2" w:semiHidden="0" w:uiPriority="73" w:unhideWhenUsed="0"/>
-    <w:lsdException w:name="Light Shading Accent 3" w:semiHidden="0" w:uiPriority="60" w:unhideWhenUsed="0"/>
-    <w:lsdException w:name="Light List Accent 3" w:semiHidden="0" w:uiPriority="61" w:unhideWhenUsed="0"/>
-    <w:lsdException w:name="Light Grid Accent 3" w:semiHidden="0" w:uiPriority="62" w:unhideWhenUsed="0"/>
-    <w:lsdException w:name="Medium Shading 1 Accent 3" w:semiHidden="0" w:uiPriority="63" w:unhideWhenUsed="0"/>
-    <w:lsdException w:name="Medium Shading 2 Accent 3" w:semiHidden="0" w:uiPriority="64" w:unhideWhenUsed="0"/>
-    <w:lsdException w:name="Medium List 1 Accent 3" w:semiHidden="0" w:uiPriority="65" w:unhideWhenUsed="0"/>
-    <w:lsdException w:name="Medium List 2 Accent 3" w:semiHidden="0" w:uiPriority="66" w:unhideWhenUsed="0"/>
-    <w:lsdException w:name="Medium Grid 1 Accent 3" w:semiHidden="0" w:uiPriority="67" w:unhideWhenUsed="0"/>
-    <w:lsdException w:name="Medium Grid 2 Accent 3" w:semiHidden="0" w:uiPriority="68" w:unhideWhenUsed="0"/>
-    <w:lsdException w:name="Medium Grid 3 Accent 3" w:semiHidden="0" w:uiPriority="69" w:unhideWhenUsed="0"/>
-    <w:lsdException w:name="Dark List Accent 3" w:semiHidden="0" w:uiPriority="70" w:unhideWhenUsed="0"/>
-    <w:lsdException w:name="Colorful Shading Accent 3" w:semiHidden="0" w:uiPriority="71" w:unhideWhenUsed="0"/>
-    <w:lsdException w:name="Colorful List Accent 3" w:semiHidden="0" w:uiPriority="72" w:unhideWhenUsed="0"/>
-    <w:lsdException w:name="Colorful Grid Accent 3" w:semiHidden="0" w:uiPriority="73" w:unhideWhenUsed="0"/>
-    <w:lsdException w:name="Light Shading Accent 4" w:semiHidden="0" w:uiPriority="60" w:unhideWhenUsed="0"/>
-    <w:lsdException w:name="Light List Accent 4" w:semiHidden="0" w:uiPriority="61" w:unhideWhenUsed="0"/>
-    <w:lsdException w:name="Light Grid Accent 4" w:semiHidden="0" w:uiPriority="62" w:unhideWhenUsed="0"/>
-    <w:lsdException w:name="Medium Shading 1 Accent 4" w:semiHidden="0" w:uiPriority="63" w:unhideWhenUsed="0"/>
-    <w:lsdException w:name="Medium Shading 2 Accent 4" w:semiHidden="0" w:uiPriority="64" w:unhideWhenUsed="0"/>
-    <w:lsdException w:name="Medium List 1 Accent 4" w:semiHidden="0" w:uiPriority="65" w:unhideWhenUsed="0"/>
-    <w:lsdException w:name="Medium List 2 Accent 4" w:semiHidden="0" w:uiPriority="66" w:unhideWhenUsed="0"/>
-    <w:lsdException w:name="Medium Grid 1 Accent 4" w:semiHidden="0" w:uiPriority="67" w:unhideWhenUsed="0"/>
-    <w:lsdException w:name="Medium Grid 2 Accent 4" w:semiHidden="0" w:uiPriority="68" w:unhideWhenUsed="0"/>
-    <w:lsdException w:name="Medium Grid 3 Accent 4" w:semiHidden="0" w:uiPriority="69" w:unhideWhenUsed="0"/>
-    <w:lsdException w:name="Dark List Accent 4" w:semiHidden="0" w:uiPriority="70" w:unhideWhenUsed="0"/>
-    <w:lsdException w:name="Colorful Shading Accent 4" w:semiHidden="0" w:uiPriority="71" w:unhideWhenUsed="0"/>
-    <w:lsdException w:name="Colorful List Accent 4" w:semiHidden="0" w:uiPriority="72" w:unhideWhenUsed="0"/>
-    <w:lsdException w:name="Colorful Grid Accent 4" w:semiHidden="0" w:uiPriority="73" w:unhideWhenUsed="0"/>
-    <w:lsdException w:name="Light Shading Accent 5" w:semiHidden="0" w:uiPriority="60" w:unhideWhenUsed="0"/>
-    <w:lsdException w:name="Light List Accent 5" w:semiHidden="0" w:uiPriority="61" w:unhideWhenUsed="0"/>
-    <w:lsdException w:name="Light Grid Accent 5" w:semiHidden="0" w:uiPriority="62" w:unhideWhenUsed="0"/>
-    <w:lsdException w:name="Medium Shading 1 Accent 5" w:semiHidden="0" w:uiPriority="63" w:unhideWhenUsed="0"/>
-    <w:lsdException w:name="Medium Shading 2 Accent 5" w:semiHidden="0" w:uiPriority="64" w:unhideWhenUsed="0"/>
-    <w:lsdException w:name="Medium List 1 Accent 5" w:semiHidden="0" w:uiPriority="65" w:unhideWhenUsed="0"/>
-    <w:lsdException w:name="Medium List 2 Accent 5" w:semiHidden="0" w:uiPriority="66" w:unhideWhenUsed="0"/>
-    <w:lsdException w:name="Medium Grid 1 Accent 5" w:semiHidden="0" w:uiPriority="67" w:unhideWhenUsed="0"/>
-    <w:lsdException w:name="Medium Grid 2 Accent 5" w:semiHidden="0" w:uiPriority="68" w:unhideWhenUsed="0"/>
-    <w:lsdException w:name="Medium Grid 3 Accent 5" w:semiHidden="0" w:uiPriority="69" w:unhideWhenUsed="0"/>
-    <w:lsdException w:name="Dark List Accent 5" w:semiHidden="0" w:uiPriority="70" w:unhideWhenUsed="0"/>
-    <w:lsdException w:name="Colorful Shading Accent 5" w:semiHidden="0" w:uiPriority="71" w:unhideWhenUsed="0"/>
-    <w:lsdException w:name="Colorful List Accent 5" w:semiHidden="0" w:uiPriority="72" w:unhideWhenUsed="0"/>
-    <w:lsdException w:name="Colorful Grid Accent 5" w:semiHidden="0" w:uiPriority="73" w:unhideWhenUsed="0"/>
-    <w:lsdException w:name="Light Shading Accent 6" w:semiHidden="0" w:uiPriority="60" w:unhideWhenUsed="0"/>
-    <w:lsdException w:name="Light List Accent 6" w:semiHidden="0" w:uiPriority="61" w:unhideWhenUsed="0"/>
-    <w:lsdException w:name="Light Grid Accent 6" w:semiHidden="0" w:uiPriority="62" w:unhideWhenUsed="0"/>
-    <w:lsdException w:name="Medium Shading 1 Accent 6" w:semiHidden="0" w:uiPriority="63" w:unhideWhenUsed="0"/>
-    <w:lsdException w:name="Medium Shading 2 Accent 6" w:semiHidden="0" w:uiPriority="64" w:unhideWhenUsed="0"/>
-    <w:lsdException w:name="Medium List 1 Accent 6" w:semiHidden="0" w:uiPriority="65" w:unhideWhenUsed="0"/>
-    <w:lsdException w:name="Medium List 2 Accent 6" w:semiHidden="0" w:uiPriority="66" w:unhideWhenUsed="0"/>
-    <w:lsdException w:name="Medium Grid 1 Accent 6" w:semiHidden="0" w:uiPriority="67" w:unhideWhenUsed="0"/>
-    <w:lsdException w:name="Medium Grid 2 Accent 6" w:semiHidden="0" w:uiPriority="68" w:unhideWhenUsed="0"/>
-    <w:lsdException w:name="Medium Grid 3 Accent 6" w:semiHidden="0" w:uiPriority="69" w:unhideWhenUsed="0"/>
-    <w:lsdException w:name="Dark List Accent 6" w:semiHidden="0" w:uiPriority="70" w:unhideWhenUsed="0"/>
-    <w:lsdException w:name="Colorful Shading Accent 6" w:semiHidden="0" w:uiPriority="71" w:unhideWhenUsed="0"/>
-    <w:lsdException w:name="Colorful List Accent 6" w:semiHidden="0" w:uiPriority="72" w:unhideWhenUsed="0"/>
-    <w:lsdException w:name="Colorful Grid Accent 6" w:semiHidden="0" w:uiPriority="73" w:unhideWhenUsed="0"/>
-    <w:lsdException w:name="Subtle Emphasis" w:semiHidden="0" w:uiPriority="19" w:unhideWhenUsed="0" w:qFormat="1"/>
-    <w:lsdException w:name="Intense Emphasis" w:semiHidden="0" w:uiPriority="21" w:unhideWhenUsed="0" w:qFormat="1"/>
-    <w:lsdException w:name="Subtle Reference" w:semiHidden="0" w:uiPriority="31" w:unhideWhenUsed="0" w:qFormat="1"/>
-    <w:lsdException w:name="Intense Reference" w:semiHidden="0" w:uiPriority="32" w:unhideWhenUsed="0" w:qFormat="1"/>
-    <w:lsdException w:name="Book Title" w:semiHidden="0" w:uiPriority="33" w:unhideWhenUsed="0" w:qFormat="1"/>
-    <w:lsdException w:name="Bibliography" w:uiPriority="37"/>
-    <w:lsdException w:name="TOC Heading" w:uiPriority="39" w:qFormat="1"/>
+  <w:latentStyles w:defLockedState="0" w:defUIPriority="99" w:defSemiHidden="0" w:defUnhideWhenUsed="0" w:defQFormat="0" w:count="376">
+    <w:lsdException w:name="Normal" w:uiPriority="0" w:qFormat="1"/>
+    <w:lsdException w:name="heading 1" w:uiPriority="9" w:qFormat="1"/>
+    <w:lsdException w:name="heading 2" w:semiHidden="1" w:uiPriority="9" w:unhideWhenUsed="1" w:qFormat="1"/>
+    <w:lsdException w:name="heading 3" w:semiHidden="1" w:uiPriority="9" w:unhideWhenUsed="1" w:qFormat="1"/>
+    <w:lsdException w:name="heading 4" w:semiHidden="1" w:uiPriority="9" w:unhideWhenUsed="1" w:qFormat="1"/>
+    <w:lsdException w:name="heading 5" w:semiHidden="1" w:uiPriority="9" w:unhideWhenUsed="1" w:qFormat="1"/>
+    <w:lsdException w:name="heading 6" w:semiHidden="1" w:uiPriority="9" w:unhideWhenUsed="1" w:qFormat="1"/>
+    <w:lsdException w:name="heading 7" w:semiHidden="1" w:uiPriority="9" w:unhideWhenUsed="1" w:qFormat="1"/>
+    <w:lsdException w:name="heading 8" w:semiHidden="1" w:uiPriority="9" w:unhideWhenUsed="1" w:qFormat="1"/>
+    <w:lsdException w:name="heading 9" w:semiHidden="1" w:uiPriority="9" w:unhideWhenUsed="1" w:qFormat="1"/>
+    <w:lsdException w:name="index 1" w:semiHidden="1" w:unhideWhenUsed="1"/>
+    <w:lsdException w:name="index 2" w:semiHidden="1" w:unhideWhenUsed="1"/>
+    <w:lsdException w:name="index 3" w:semiHidden="1" w:unhideWhenUsed="1"/>
+    <w:lsdException w:name="index 4" w:semiHidden="1" w:unhideWhenUsed="1"/>
+    <w:lsdException w:name="index 5" w:semiHidden="1" w:unhideWhenUsed="1"/>
+    <w:lsdException w:name="index 6" w:semiHidden="1" w:unhideWhenUsed="1"/>
+    <w:lsdException w:name="index 7" w:semiHidden="1" w:unhideWhenUsed="1"/>
+    <w:lsdException w:name="index 8" w:semiHidden="1" w:unhideWhenUsed="1"/>
+    <w:lsdException w:name="index 9" w:semiHidden="1" w:unhideWhenUsed="1"/>
+    <w:lsdException w:name="toc 1" w:semiHidden="1" w:uiPriority="39" w:unhideWhenUsed="1"/>
+    <w:lsdException w:name="toc 2" w:semiHidden="1" w:uiPriority="39" w:unhideWhenUsed="1"/>
+    <w:lsdException w:name="toc 3" w:semiHidden="1" w:uiPriority="39" w:unhideWhenUsed="1"/>
+    <w:lsdException w:name="toc 4" w:semiHidden="1" w:uiPriority="39" w:unhideWhenUsed="1"/>
+    <w:lsdException w:name="toc 5" w:semiHidden="1" w:uiPriority="39" w:unhideWhenUsed="1"/>
+    <w:lsdException w:name="toc 6" w:semiHidden="1" w:uiPriority="39" w:unhideWhenUsed="1"/>
+    <w:lsdException w:name="toc 7" w:semiHidden="1" w:uiPriority="39" w:unhideWhenUsed="1"/>
+    <w:lsdException w:name="toc 8" w:semiHidden="1" w:uiPriority="39" w:unhideWhenUsed="1"/>
+    <w:lsdException w:name="toc 9" w:semiHidden="1" w:uiPriority="39" w:unhideWhenUsed="1"/>
+    <w:lsdException w:name="Normal Indent" w:semiHidden="1" w:unhideWhenUsed="1"/>
+    <w:lsdException w:name="footnote text" w:semiHidden="1" w:unhideWhenUsed="1"/>
+    <w:lsdException w:name="annotation text" w:semiHidden="1" w:unhideWhenUsed="1"/>
+    <w:lsdException w:name="header" w:semiHidden="1" w:unhideWhenUsed="1"/>
+    <w:lsdException w:name="footer" w:semiHidden="1" w:unhideWhenUsed="1"/>
+    <w:lsdException w:name="index heading" w:semiHidden="1" w:unhideWhenUsed="1"/>
+    <w:lsdException w:name="caption" w:semiHidden="1" w:uiPriority="35" w:unhideWhenUsed="1" w:qFormat="1"/>
+    <w:lsdException w:name="table of figures" w:semiHidden="1" w:unhideWhenUsed="1"/>
+    <w:lsdException w:name="envelope address" w:semiHidden="1" w:unhideWhenUsed="1"/>
+    <w:lsdException w:name="envelope return" w:semiHidden="1" w:unhideWhenUsed="1"/>
+    <w:lsdException w:name="footnote reference" w:semiHidden="1" w:unhideWhenUsed="1"/>
+    <w:lsdException w:name="annotation reference" w:semiHidden="1" w:unhideWhenUsed="1"/>
+    <w:lsdException w:name="line number" w:semiHidden="1" w:unhideWhenUsed="1"/>
+    <w:lsdException w:name="page number" w:semiHidden="1" w:unhideWhenUsed="1"/>
+    <w:lsdException w:name="endnote reference" w:semiHidden="1" w:unhideWhenUsed="1"/>
+    <w:lsdException w:name="endnote text" w:semiHidden="1" w:unhideWhenUsed="1"/>
+    <w:lsdException w:name="table of authorities" w:semiHidden="1" w:unhideWhenUsed="1"/>
+    <w:lsdException w:name="macro" w:semiHidden="1" w:unhideWhenUsed="1"/>
+    <w:lsdException w:name="toa heading" w:semiHidden="1" w:unhideWhenUsed="1"/>
+    <w:lsdException w:name="List" w:semiHidden="1" w:unhideWhenUsed="1"/>
+    <w:lsdException w:name="List Bullet" w:semiHidden="1" w:uiPriority="12" w:unhideWhenUsed="1" w:qFormat="1"/>
+    <w:lsdException w:name="List Number" w:semiHidden="1" w:unhideWhenUsed="1"/>
+    <w:lsdException w:name="List 2" w:semiHidden="1" w:unhideWhenUsed="1"/>
+    <w:lsdException w:name="List 3" w:semiHidden="1" w:unhideWhenUsed="1"/>
+    <w:lsdException w:name="List 4" w:semiHidden="1" w:unhideWhenUsed="1"/>
+    <w:lsdException w:name="List 5" w:semiHidden="1" w:unhideWhenUsed="1"/>
+    <w:lsdException w:name="List Bullet 2" w:semiHidden="1" w:unhideWhenUsed="1"/>
+    <w:lsdException w:name="List Bullet 3" w:semiHidden="1" w:unhideWhenUsed="1"/>
+    <w:lsdException w:name="List Bullet 4" w:semiHidden="1" w:unhideWhenUsed="1"/>
+    <w:lsdException w:name="List Bullet 5" w:semiHidden="1" w:unhideWhenUsed="1"/>
+    <w:lsdException w:name="List Number 2" w:semiHidden="1" w:unhideWhenUsed="1"/>
+    <w:lsdException w:name="List Number 3" w:semiHidden="1" w:unhideWhenUsed="1"/>
+    <w:lsdException w:name="List Number 4" w:semiHidden="1" w:unhideWhenUsed="1"/>
+    <w:lsdException w:name="List Number 5" w:semiHidden="1" w:unhideWhenUsed="1"/>
+    <w:lsdException w:name="Title" w:uiPriority="10" w:qFormat="1"/>
+    <w:lsdException w:name="Closing" w:semiHidden="1" w:unhideWhenUsed="1"/>
+    <w:lsdException w:name="Signature" w:semiHidden="1" w:unhideWhenUsed="1"/>
+    <w:lsdException w:name="Default Paragraph Font" w:semiHidden="1" w:uiPriority="1" w:unhideWhenUsed="1"/>
+    <w:lsdException w:name="Body Text" w:semiHidden="1" w:unhideWhenUsed="1"/>
+    <w:lsdException w:name="Body Text Indent" w:semiHidden="1" w:unhideWhenUsed="1"/>
+    <w:lsdException w:name="List Continue" w:semiHidden="1" w:unhideWhenUsed="1"/>
+    <w:lsdException w:name="List Continue 2" w:semiHidden="1" w:unhideWhenUsed="1"/>
+    <w:lsdException w:name="List Continue 3" w:semiHidden="1" w:unhideWhenUsed="1"/>
+    <w:lsdException w:name="List Continue 4" w:semiHidden="1" w:unhideWhenUsed="1"/>
+    <w:lsdException w:name="List Continue 5" w:semiHidden="1" w:unhideWhenUsed="1"/>
+    <w:lsdException w:name="Message Header" w:semiHidden="1" w:unhideWhenUsed="1"/>
+    <w:lsdException w:name="Subtitle" w:uiPriority="11" w:qFormat="1"/>
+    <w:lsdException w:name="Salutation" w:semiHidden="1" w:unhideWhenUsed="1"/>
+    <w:lsdException w:name="Date" w:semiHidden="1" w:unhideWhenUsed="1"/>
+    <w:lsdException w:name="Body Text First Indent" w:semiHidden="1" w:unhideWhenUsed="1"/>
+    <w:lsdException w:name="Body Text First Indent 2" w:semiHidden="1" w:unhideWhenUsed="1"/>
+    <w:lsdException w:name="Note Heading" w:semiHidden="1" w:unhideWhenUsed="1"/>
+    <w:lsdException w:name="Body Text 2" w:semiHidden="1" w:unhideWhenUsed="1"/>
+    <w:lsdException w:name="Body Text 3" w:semiHidden="1" w:unhideWhenUsed="1"/>
+    <w:lsdException w:name="Body Text Indent 2" w:semiHidden="1" w:unhideWhenUsed="1"/>
+    <w:lsdException w:name="Body Text Indent 3" w:semiHidden="1" w:unhideWhenUsed="1"/>
+    <w:lsdException w:name="Block Text" w:semiHidden="1" w:unhideWhenUsed="1"/>
+    <w:lsdException w:name="Hyperlink" w:semiHidden="1" w:unhideWhenUsed="1"/>
+    <w:lsdException w:name="FollowedHyperlink" w:semiHidden="1" w:unhideWhenUsed="1"/>
+    <w:lsdException w:name="Strong" w:uiPriority="22" w:qFormat="1"/>
+    <w:lsdException w:name="Emphasis" w:uiPriority="10" w:qFormat="1"/>
+    <w:lsdException w:name="Document Map" w:semiHidden="1" w:unhideWhenUsed="1"/>
+    <w:lsdException w:name="Plain Text" w:semiHidden="1" w:unhideWhenUsed="1"/>
+    <w:lsdException w:name="E-mail Signature" w:semiHidden="1" w:unhideWhenUsed="1"/>
+    <w:lsdException w:name="HTML Top of Form" w:semiHidden="1" w:unhideWhenUsed="1"/>
+    <w:lsdException w:name="HTML Bottom of Form" w:semiHidden="1" w:unhideWhenUsed="1"/>
+    <w:lsdException w:name="Normal (Web)" w:semiHidden="1" w:unhideWhenUsed="1"/>
+    <w:lsdException w:name="HTML Acronym" w:semiHidden="1" w:unhideWhenUsed="1"/>
+    <w:lsdException w:name="HTML Address" w:semiHidden="1" w:unhideWhenUsed="1"/>
+    <w:lsdException w:name="HTML Cite" w:semiHidden="1" w:unhideWhenUsed="1"/>
+    <w:lsdException w:name="HTML Code" w:semiHidden="1" w:unhideWhenUsed="1"/>
+    <w:lsdException w:name="HTML Definition" w:semiHidden="1" w:unhideWhenUsed="1"/>
+    <w:lsdException w:name="HTML Keyboard" w:semiHidden="1" w:unhideWhenUsed="1"/>
+    <w:lsdException w:name="HTML Preformatted" w:semiHidden="1" w:unhideWhenUsed="1"/>
+    <w:lsdException w:name="HTML Sample" w:semiHidden="1" w:unhideWhenUsed="1"/>
+    <w:lsdException w:name="HTML Typewriter" w:semiHidden="1" w:unhideWhenUsed="1"/>
+    <w:lsdException w:name="HTML Variable" w:semiHidden="1" w:unhideWhenUsed="1"/>
+    <w:lsdException w:name="Normal Table" w:semiHidden="1" w:unhideWhenUsed="1"/>
+    <w:lsdException w:name="annotation subject" w:semiHidden="1" w:unhideWhenUsed="1"/>
+    <w:lsdException w:name="No List" w:semiHidden="1" w:unhideWhenUsed="1"/>
+    <w:lsdException w:name="Outline List 1" w:semiHidden="1" w:unhideWhenUsed="1"/>
+    <w:lsdException w:name="Outline List 2" w:semiHidden="1" w:unhideWhenUsed="1"/>
+    <w:lsdException w:name="Outline List 3" w:semiHidden="1" w:unhideWhenUsed="1"/>
+    <w:lsdException w:name="Table Simple 1" w:semiHidden="1" w:unhideWhenUsed="1"/>
+    <w:lsdException w:name="Table Simple 2" w:semiHidden="1" w:unhideWhenUsed="1"/>
+    <w:lsdException w:name="Table Simple 3" w:semiHidden="1" w:unhideWhenUsed="1"/>
+    <w:lsdException w:name="Table Classic 1" w:semiHidden="1" w:unhideWhenUsed="1"/>
+    <w:lsdException w:name="Table Classic 2" w:semiHidden="1" w:unhideWhenUsed="1"/>
+    <w:lsdException w:name="Table Classic 3" w:semiHidden="1" w:unhideWhenUsed="1"/>
+    <w:lsdException w:name="Table Classic 4" w:semiHidden="1" w:unhideWhenUsed="1"/>
+    <w:lsdException w:name="Table Colorful 1" w:semiHidden="1" w:unhideWhenUsed="1"/>
+    <w:lsdException w:name="Table Colorful 2" w:semiHidden="1" w:unhideWhenUsed="1"/>
+    <w:lsdException w:name="Table Colorful 3" w:semiHidden="1" w:unhideWhenUsed="1"/>
+    <w:lsdException w:name="Table Columns 1" w:semiHidden="1" w:unhideWhenUsed="1"/>
+    <w:lsdException w:name="Table Columns 2" w:semiHidden="1" w:unhideWhenUsed="1"/>
+    <w:lsdException w:name="Table Columns 3" w:semiHidden="1" w:unhideWhenUsed="1"/>
+    <w:lsdException w:name="Table Columns 4" w:semiHidden="1" w:unhideWhenUsed="1"/>
+    <w:lsdException w:name="Table Columns 5" w:semiHidden="1" w:unhideWhenUsed="1"/>
+    <w:lsdException w:name="Table Grid 1" w:semiHidden="1" w:unhideWhenUsed="1"/>
+    <w:lsdException w:name="Table Grid 2" w:semiHidden="1" w:unhideWhenUsed="1"/>
+    <w:lsdException w:name="Table Grid 3" w:semiHidden="1" w:unhideWhenUsed="1"/>
+    <w:lsdException w:name="Table Grid 4" w:semiHidden="1" w:unhideWhenUsed="1"/>
+    <w:lsdException w:name="Table Grid 5" w:semiHidden="1" w:unhideWhenUsed="1"/>
+    <w:lsdException w:name="Table Grid 6" w:semiHidden="1" w:unhideWhenUsed="1"/>
+    <w:lsdException w:name="Table Grid 7" w:semiHidden="1" w:unhideWhenUsed="1"/>
+    <w:lsdException w:name="Table Grid 8" w:semiHidden="1" w:unhideWhenUsed="1"/>
+    <w:lsdException w:name="Table List 1" w:semiHidden="1" w:unhideWhenUsed="1"/>
+    <w:lsdException w:name="Table List 2" w:semiHidden="1" w:unhideWhenUsed="1"/>
+    <w:lsdException w:name="Table List 3" w:semiHidden="1" w:unhideWhenUsed="1"/>
+    <w:lsdException w:name="Table List 4" w:semiHidden="1" w:unhideWhenUsed="1"/>
+    <w:lsdException w:name="Table List 5" w:semiHidden="1" w:unhideWhenUsed="1"/>
+    <w:lsdException w:name="Table List 6" w:semiHidden="1" w:unhideWhenUsed="1"/>
+    <w:lsdException w:name="Table List 7" w:semiHidden="1" w:unhideWhenUsed="1"/>
+    <w:lsdException w:name="Table List 8" w:semiHidden="1" w:unhideWhenUsed="1"/>
+    <w:lsdException w:name="Table 3D effects 1" w:semiHidden="1" w:unhideWhenUsed="1"/>
+    <w:lsdException w:name="Table 3D effects 2" w:semiHidden="1" w:unhideWhenUsed="1"/>
+    <w:lsdException w:name="Table 3D effects 3" w:semiHidden="1" w:unhideWhenUsed="1"/>
+    <w:lsdException w:name="Table Contemporary" w:semiHidden="1" w:unhideWhenUsed="1"/>
+    <w:lsdException w:name="Table Elegant" w:semiHidden="1" w:unhideWhenUsed="1"/>
+    <w:lsdException w:name="Table Professional" w:semiHidden="1" w:unhideWhenUsed="1"/>
+    <w:lsdException w:name="Table Subtle 1" w:semiHidden="1" w:unhideWhenUsed="1"/>
+    <w:lsdException w:name="Table Subtle 2" w:semiHidden="1" w:unhideWhenUsed="1"/>
+    <w:lsdException w:name="Table Web 1" w:semiHidden="1" w:unhideWhenUsed="1"/>
+    <w:lsdException w:name="Table Web 2" w:semiHidden="1" w:unhideWhenUsed="1"/>
+    <w:lsdException w:name="Table Web 3" w:semiHidden="1" w:unhideWhenUsed="1"/>
+    <w:lsdException w:name="Balloon Text" w:semiHidden="1" w:unhideWhenUsed="1"/>
+    <w:lsdException w:name="Table Grid" w:uiPriority="39"/>
+    <w:lsdException w:name="Table Theme" w:semiHidden="1" w:unhideWhenUsed="1"/>
+    <w:lsdException w:name="Placeholder Text" w:semiHidden="1"/>
+    <w:lsdException w:name="No Spacing" w:uiPriority="1" w:qFormat="1"/>
+    <w:lsdException w:name="Light Shading" w:uiPriority="60"/>
+    <w:lsdException w:name="Light List" w:uiPriority="61"/>
+    <w:lsdException w:name="Light Grid" w:uiPriority="62"/>
+    <w:lsdException w:name="Medium Shading 1" w:uiPriority="63"/>
+    <w:lsdException w:name="Medium Shading 2" w:uiPriority="64"/>
+    <w:lsdException w:name="Medium List 1" w:uiPriority="65"/>
+    <w:lsdException w:name="Medium List 2" w:uiPriority="66"/>
+    <w:lsdException w:name="Medium Grid 1" w:uiPriority="67"/>
+    <w:lsdException w:name="Medium Grid 2" w:uiPriority="68"/>
+    <w:lsdException w:name="Medium Grid 3" w:uiPriority="69"/>
+    <w:lsdException w:name="Dark List" w:uiPriority="70"/>
+    <w:lsdException w:name="Colorful Shading" w:uiPriority="71"/>
+    <w:lsdException w:name="Colorful List" w:uiPriority="72"/>
+    <w:lsdException w:name="Colorful Grid" w:uiPriority="73"/>
+    <w:lsdException w:name="Light Shading Accent 1" w:uiPriority="60"/>
+    <w:lsdException w:name="Light List Accent 1" w:uiPriority="61"/>
+    <w:lsdException w:name="Light Grid Accent 1" w:uiPriority="62"/>
+    <w:lsdException w:name="Medium Shading 1 Accent 1" w:uiPriority="63"/>
+    <w:lsdException w:name="Medium Shading 2 Accent 1" w:uiPriority="64"/>
+    <w:lsdException w:name="Medium List 1 Accent 1" w:uiPriority="65"/>
+    <w:lsdException w:name="Revision" w:semiHidden="1"/>
+    <w:lsdException w:name="List Paragraph" w:uiPriority="34" w:qFormat="1"/>
+    <w:lsdException w:name="Quote" w:uiPriority="29" w:qFormat="1"/>
+    <w:lsdException w:name="Intense Quote" w:uiPriority="30" w:qFormat="1"/>
+    <w:lsdException w:name="Medium List 2 Accent 1" w:uiPriority="66"/>
+    <w:lsdException w:name="Medium Grid 1 Accent 1" w:uiPriority="67"/>
+    <w:lsdException w:name="Medium Grid 2 Accent 1" w:uiPriority="68"/>
+    <w:lsdException w:name="Medium Grid 3 Accent 1" w:uiPriority="69"/>
+    <w:lsdException w:name="Dark List Accent 1" w:uiPriority="70"/>
+    <w:lsdException w:name="Colorful Shading Accent 1" w:uiPriority="71"/>
+    <w:lsdException w:name="Colorful List Accent 1" w:uiPriority="72"/>
+    <w:lsdException w:name="Colorful Grid Accent 1" w:uiPriority="73"/>
+    <w:lsdException w:name="Light Shading Accent 2" w:uiPriority="60"/>
+    <w:lsdException w:name="Light List Accent 2" w:uiPriority="61"/>
+    <w:lsdException w:name="Light Grid Accent 2" w:uiPriority="62"/>
+    <w:lsdException w:name="Medium Shading 1 Accent 2" w:uiPriority="63"/>
+    <w:lsdException w:name="Medium Shading 2 Accent 2" w:uiPriority="64"/>
+    <w:lsdException w:name="Medium List 1 Accent 2" w:uiPriority="65"/>
+    <w:lsdException w:name="Medium List 2 Accent 2" w:uiPriority="66"/>
+    <w:lsdException w:name="Medium Grid 1 Accent 2" w:uiPriority="67"/>
+    <w:lsdException w:name="Medium Grid 2 Accent 2" w:uiPriority="68"/>
+    <w:lsdException w:name="Medium Grid 3 Accent 2" w:uiPriority="69"/>
+    <w:lsdException w:name="Dark List Accent 2" w:uiPriority="70"/>
+    <w:lsdException w:name="Colorful Shading Accent 2" w:uiPriority="71"/>
+    <w:lsdException w:name="Colorful List Accent 2" w:uiPriority="72"/>
+    <w:lsdException w:name="Colorful Grid Accent 2" w:uiPriority="73"/>
+    <w:lsdException w:name="Light Shading Accent 3" w:uiPriority="60"/>
+    <w:lsdException w:name="Light List Accent 3" w:uiPriority="61"/>
+    <w:lsdException w:name="Light Grid Accent 3" w:uiPriority="62"/>
+    <w:lsdException w:name="Medium Shading 1 Accent 3" w:uiPriority="63"/>
+    <w:lsdException w:name="Medium Shading 2 Accent 3" w:uiPriority="64"/>
+    <w:lsdException w:name="Medium List 1 Accent 3" w:uiPriority="65"/>
+    <w:lsdException w:name="Medium List 2 Accent 3" w:uiPriority="66"/>
+    <w:lsdException w:name="Medium Grid 1 Accent 3" w:uiPriority="67"/>
+    <w:lsdException w:name="Medium Grid 2 Accent 3" w:uiPriority="68"/>
+    <w:lsdException w:name="Medium Grid 3 Accent 3" w:uiPriority="69"/>
+    <w:lsdException w:name="Dark List Accent 3" w:uiPriority="70"/>
+    <w:lsdException w:name="Colorful Shading Accent 3" w:uiPriority="71"/>
+    <w:lsdException w:name="Colorful List Accent 3" w:uiPriority="72"/>
+    <w:lsdException w:name="Colorful Grid Accent 3" w:uiPriority="73"/>
+    <w:lsdException w:name="Light Shading Accent 4" w:uiPriority="60"/>
+    <w:lsdException w:name="Light List Accent 4" w:uiPriority="61"/>
+    <w:lsdException w:name="Light Grid Accent 4" w:uiPriority="62"/>
+    <w:lsdException w:name="Medium Shading 1 Accent 4" w:uiPriority="63"/>
+    <w:lsdException w:name="Medium Shading 2 Accent 4" w:uiPriority="64"/>
+    <w:lsdException w:name="Medium List 1 Accent 4" w:uiPriority="65"/>
+    <w:lsdException w:name="Medium List 2 Accent 4" w:uiPriority="66"/>
+    <w:lsdException w:name="Medium Grid 1 Accent 4" w:uiPriority="67"/>
+    <w:lsdException w:name="Medium Grid 2 Accent 4" w:uiPriority="68"/>
+    <w:lsdException w:name="Medium Grid 3 Accent 4" w:uiPriority="69"/>
+    <w:lsdException w:name="Dark List Accent 4" w:uiPriority="70"/>
+    <w:lsdException w:name="Colorful Shading Accent 4" w:uiPriority="71"/>
+    <w:lsdException w:name="Colorful List Accent 4" w:uiPriority="72"/>
+    <w:lsdException w:name="Colorful Grid Accent 4" w:uiPriority="73"/>
+    <w:lsdException w:name="Light Shading Accent 5" w:uiPriority="60"/>
+    <w:lsdException w:name="Light List Accent 5" w:uiPriority="61"/>
+    <w:lsdException w:name="Light Grid Accent 5" w:uiPriority="62"/>
+    <w:lsdException w:name="Medium Shading 1 Accent 5" w:uiPriority="63"/>
+    <w:lsdException w:name="Medium Shading 2 Accent 5" w:uiPriority="64"/>
+    <w:lsdException w:name="Medium List 1 Accent 5" w:uiPriority="65"/>
+    <w:lsdException w:name="Medium List 2 Accent 5" w:uiPriority="66"/>
+    <w:lsdException w:name="Medium Grid 1 Accent 5" w:uiPriority="67"/>
+    <w:lsdException w:name="Medium Grid 2 Accent 5" w:uiPriority="68"/>
+    <w:lsdException w:name="Medium Grid 3 Accent 5" w:uiPriority="69"/>
+    <w:lsdException w:name="Dark List Accent 5" w:uiPriority="70"/>
+    <w:lsdException w:name="Colorful Shading Accent 5" w:uiPriority="71"/>
+    <w:lsdException w:name="Colorful List Accent 5" w:uiPriority="72"/>
+    <w:lsdException w:name="Colorful Grid Accent 5" w:uiPriority="73"/>
+    <w:lsdException w:name="Light Shading Accent 6" w:uiPriority="60"/>
+    <w:lsdException w:name="Light List Accent 6" w:uiPriority="61"/>
+    <w:lsdException w:name="Light Grid Accent 6" w:uiPriority="62"/>
+    <w:lsdException w:name="Medium Shading 1 Accent 6" w:uiPriority="63"/>
+    <w:lsdException w:name="Medium Shading 2 Accent 6" w:uiPriority="64"/>
+    <w:lsdException w:name="Medium List 1 Accent 6" w:uiPriority="65"/>
+    <w:lsdException w:name="Medium List 2 Accent 6" w:uiPriority="66"/>
+    <w:lsdException w:name="Medium Grid 1 Accent 6" w:uiPriority="67"/>
+    <w:lsdException w:name="Medium Grid 2 Accent 6" w:uiPriority="68"/>
+    <w:lsdException w:name="Medium Grid 3 Accent 6" w:uiPriority="69"/>
+    <w:lsdException w:name="Dark List Accent 6" w:uiPriority="70"/>
+    <w:lsdException w:name="Colorful Shading Accent 6" w:uiPriority="71"/>
+    <w:lsdException w:name="Colorful List Accent 6" w:uiPriority="72"/>
+    <w:lsdException w:name="Colorful Grid Accent 6" w:uiPriority="73"/>
+    <w:lsdException w:name="Subtle Emphasis" w:uiPriority="19" w:qFormat="1"/>
+    <w:lsdException w:name="Intense Emphasis" w:uiPriority="21" w:qFormat="1"/>
+    <w:lsdException w:name="Subtle Reference" w:uiPriority="31" w:qFormat="1"/>
+    <w:lsdException w:name="Intense Reference" w:uiPriority="32" w:qFormat="1"/>
+    <w:lsdException w:name="Book Title" w:uiPriority="33" w:qFormat="1"/>
+    <w:lsdException w:name="Bibliography" w:semiHidden="1" w:uiPriority="37" w:unhideWhenUsed="1"/>
+    <w:lsdException w:name="TOC Heading" w:semiHidden="1" w:uiPriority="39" w:unhideWhenUsed="1" w:qFormat="1"/>
+    <w:lsdException w:name="Plain Table 1" w:uiPriority="41"/>
+    <w:lsdException w:name="Plain Table 2" w:uiPriority="42"/>
+    <w:lsdException w:name="Plain Table 3" w:uiPriority="43"/>
+    <w:lsdException w:name="Plain Table 4" w:uiPriority="44"/>
+    <w:lsdException w:name="Plain Table 5" w:uiPriority="45"/>
+    <w:lsdException w:name="Grid Table Light" w:uiPriority="40"/>
+    <w:lsdException w:name="Grid Table 1 Light" w:uiPriority="46"/>
+    <w:lsdException w:name="Grid Table 2" w:uiPriority="47"/>
+    <w:lsdException w:name="Grid Table 3" w:uiPriority="48"/>
+    <w:lsdException w:name="Grid Table 4" w:uiPriority="49"/>
+    <w:lsdException w:name="Grid Table 5 Dark" w:uiPriority="50"/>
+    <w:lsdException w:name="Grid Table 6 Colorful" w:uiPriority="51"/>
+    <w:lsdException w:name="Grid Table 7 Colorful" w:uiPriority="52"/>
+    <w:lsdException w:name="Grid Table 1 Light Accent 1" w:uiPriority="46"/>
+    <w:lsdException w:name="Grid Table 2 Accent 1" w:uiPriority="47"/>
+    <w:lsdException w:name="Grid Table 3 Accent 1" w:uiPriority="48"/>
+    <w:lsdException w:name="Grid Table 4 Accent 1" w:uiPriority="49"/>
+    <w:lsdException w:name="Grid Table 5 Dark Accent 1" w:uiPriority="50"/>
+    <w:lsdException w:name="Grid Table 6 Colorful Accent 1" w:uiPriority="51"/>
+    <w:lsdException w:name="Grid Table 7 Colorful Accent 1" w:uiPriority="52"/>
+    <w:lsdException w:name="Grid Table 1 Light Accent 2" w:uiPriority="46"/>
+    <w:lsdException w:name="Grid Table 2 Accent 2" w:uiPriority="47"/>
+    <w:lsdException w:name="Grid Table 3 Accent 2" w:uiPriority="48"/>
+    <w:lsdException w:name="Grid Table 4 Accent 2" w:uiPriority="49"/>
+    <w:lsdException w:name="Grid Table 5 Dark Accent 2" w:uiPriority="50"/>
+    <w:lsdException w:name="Grid Table 6 Colorful Accent 2" w:uiPriority="51"/>
+    <w:lsdException w:name="Grid Table 7 Colorful Accent 2" w:uiPriority="52"/>
+    <w:lsdException w:name="Grid Table 1 Light Accent 3" w:uiPriority="46"/>
+    <w:lsdException w:name="Grid Table 2 Accent 3" w:uiPriority="47"/>
+    <w:lsdException w:name="Grid Table 3 Accent 3" w:uiPriority="48"/>
+    <w:lsdException w:name="Grid Table 4 Accent 3" w:uiPriority="49"/>
+    <w:lsdException w:name="Grid Table 5 Dark Accent 3" w:uiPriority="50"/>
+    <w:lsdException w:name="Grid Table 6 Colorful Accent 3" w:uiPriority="51"/>
+    <w:lsdException w:name="Grid Table 7 Colorful Accent 3" w:uiPriority="52"/>
+    <w:lsdException w:name="Grid Table 1 Light Accent 4" w:uiPriority="46"/>
+    <w:lsdException w:name="Grid Table 2 Accent 4" w:uiPriority="47"/>
+    <w:lsdException w:name="Grid Table 3 Accent 4" w:uiPriority="48"/>
+    <w:lsdException w:name="Grid Table 4 Accent 4" w:uiPriority="49"/>
+    <w:lsdException w:name="Grid Table 5 Dark Accent 4" w:uiPriority="50"/>
+    <w:lsdException w:name="Grid Table 6 Colorful Accent 4" w:uiPriority="51"/>
+    <w:lsdException w:name="Grid Table 7 Colorful Accent 4" w:uiPriority="52"/>
+    <w:lsdException w:name="Grid Table 1 Light Accent 5" w:uiPriority="46"/>
+    <w:lsdException w:name="Grid Table 2 Accent 5" w:uiPriority="47"/>
+    <w:lsdException w:name="Grid Table 3 Accent 5" w:uiPriority="48"/>
+    <w:lsdException w:name="Grid Table 4 Accent 5" w:uiPriority="49"/>
+    <w:lsdException w:name="Grid Table 5 Dark Accent 5" w:uiPriority="50"/>
+    <w:lsdException w:name="Grid Table 6 Colorful Accent 5" w:uiPriority="51"/>
+    <w:lsdException w:name="Grid Table 7 Colorful Accent 5" w:uiPriority="52"/>
+    <w:lsdException w:name="Grid Table 1 Light Accent 6" w:uiPriority="46"/>
+    <w:lsdException w:name="Grid Table 2 Accent 6" w:uiPriority="47"/>
+    <w:lsdException w:name="Grid Table 3 Accent 6" w:uiPriority="48"/>
+    <w:lsdException w:name="Grid Table 4 Accent 6" w:uiPriority="49"/>
+    <w:lsdException w:name="Grid Table 5 Dark Accent 6" w:uiPriority="50"/>
+    <w:lsdException w:name="Grid Table 6 Colorful Accent 6" w:uiPriority="51"/>
+    <w:lsdException w:name="Grid Table 7 Colorful Accent 6" w:uiPriority="52"/>
+    <w:lsdException w:name="List Table 1 Light" w:uiPriority="46"/>
+    <w:lsdException w:name="List Table 2" w:uiPriority="47"/>
+    <w:lsdException w:name="List Table 3" w:uiPriority="48"/>
+    <w:lsdException w:name="List Table 4" w:uiPriority="49"/>
+    <w:lsdException w:name="List Table 5 Dark" w:uiPriority="50"/>
+    <w:lsdException w:name="List Table 6 Colorful" w:uiPriority="51"/>
+    <w:lsdException w:name="List Table 7 Colorful" w:uiPriority="52"/>
+    <w:lsdException w:name="List Table 1 Light Accent 1" w:uiPriority="46"/>
+    <w:lsdException w:name="List Table 2 Accent 1" w:uiPriority="47"/>
+    <w:lsdException w:name="List Table 3 Accent 1" w:uiPriority="48"/>
+    <w:lsdException w:name="List Table 4 Accent 1" w:uiPriority="49"/>
+    <w:lsdException w:name="List Table 5 Dark Accent 1" w:uiPriority="50"/>
+    <w:lsdException w:name="List Table 6 Colorful Accent 1" w:uiPriority="51"/>
+    <w:lsdException w:name="List Table 7 Colorful Accent 1" w:uiPriority="52"/>
+    <w:lsdException w:name="List Table 1 Light Accent 2" w:uiPriority="46"/>
+    <w:lsdException w:name="List Table 2 Accent 2" w:uiPriority="47"/>
+    <w:lsdException w:name="List Table 3 Accent 2" w:uiPriority="48"/>
+    <w:lsdException w:name="List Table 4 Accent 2" w:uiPriority="49"/>
+    <w:lsdException w:name="List Table 5 Dark Accent 2" w:uiPriority="50"/>
+    <w:lsdException w:name="List Table 6 Colorful Accent 2" w:uiPriority="51"/>
+    <w:lsdException w:name="List Table 7 Colorful Accent 2" w:uiPriority="52"/>
+    <w:lsdException w:name="List Table 1 Light Accent 3" w:uiPriority="46"/>
+    <w:lsdException w:name="List Table 2 Accent 3" w:uiPriority="47"/>
+    <w:lsdException w:name="List Table 3 Accent 3" w:uiPriority="48"/>
+    <w:lsdException w:name="List Table 4 Accent 3" w:uiPriority="49"/>
+    <w:lsdException w:name="List Table 5 Dark Accent 3" w:uiPriority="50"/>
+    <w:lsdException w:name="List Table 6 Colorful Accent 3" w:uiPriority="51"/>
+    <w:lsdException w:name="List Table 7 Colorful Accent 3" w:uiPriority="52"/>
+    <w:lsdException w:name="List Table 1 Light Accent 4" w:uiPriority="46"/>
+    <w:lsdException w:name="List Table 2 Accent 4" w:uiPriority="47"/>
+    <w:lsdException w:name="List Table 3 Accent 4" w:uiPriority="48"/>
+    <w:lsdException w:name="List Table 4 Accent 4" w:uiPriority="49"/>
+    <w:lsdException w:name="List Table 5 Dark Accent 4" w:uiPriority="50"/>
+    <w:lsdException w:name="List Table 6 Colorful Accent 4" w:uiPriority="51"/>
+    <w:lsdException w:name="List Table 7 Colorful Accent 4" w:uiPriority="52"/>
+    <w:lsdException w:name="List Table 1 Light Accent 5" w:uiPriority="46"/>
+    <w:lsdException w:name="List Table 2 Accent 5" w:uiPriority="47"/>
+    <w:lsdException w:name="List Table 3 Accent 5" w:uiPriority="48"/>
+    <w:lsdException w:name="List Table 4 Accent 5" w:uiPriority="49"/>
+    <w:lsdException w:name="List Table 5 Dark Accent 5" w:uiPriority="50"/>
+    <w:lsdException w:name="List Table 6 Colorful Accent 5" w:uiPriority="51"/>
+    <w:lsdException w:name="List Table 7 Colorful Accent 5" w:uiPriority="52"/>
+    <w:lsdException w:name="List Table 1 Light Accent 6" w:uiPriority="46"/>
+    <w:lsdException w:name="List Table 2 Accent 6" w:uiPriority="47"/>
+    <w:lsdException w:name="List Table 3 Accent 6" w:uiPriority="48"/>
+    <w:lsdException w:name="List Table 4 Accent 6" w:uiPriority="49"/>
+    <w:lsdException w:name="List Table 5 Dark Accent 6" w:uiPriority="50"/>
+    <w:lsdException w:name="List Table 6 Colorful Accent 6" w:uiPriority="51"/>
+    <w:lsdException w:name="List Table 7 Colorful Accent 6" w:uiPriority="52"/>
+    <w:lsdException w:name="Mention" w:semiHidden="1" w:unhideWhenUsed="1"/>
+    <w:lsdException w:name="Smart Hyperlink" w:semiHidden="1" w:unhideWhenUsed="1"/>
+    <w:lsdException w:name="Hashtag" w:semiHidden="1" w:unhideWhenUsed="1"/>
+    <w:lsdException w:name="Unresolved Mention" w:semiHidden="1" w:unhideWhenUsed="1"/>
+    <w:lsdException w:name="Smart Link" w:semiHidden="1" w:unhideWhenUsed="1"/>
   </w:latentStyles>
   <w:style w:type="paragraph" w:default="1" w:styleId="Normal">
     <w:name w:val="Normal"/>
@@ -3694,7 +5115,6 @@
     <w:uiPriority w:val="99"/>
     <w:semiHidden/>
     <w:unhideWhenUsed/>
-    <w:qFormat/>
     <w:tblPr>
       <w:tblInd w:w="0" w:type="dxa"/>
       <w:tblCellMar>
@@ -3711,14 +5131,6 @@
     <w:semiHidden/>
     <w:unhideWhenUsed/>
   </w:style>
-  <w:style w:type="paragraph" w:customStyle="1" w:styleId="B8ABE1CDB71D504E8A1554DD72AC8124">
-    <w:name w:val="B8ABE1CDB71D504E8A1554DD72AC8124"/>
-    <w:rsid w:val="00F63671"/>
-  </w:style>
-  <w:style w:type="paragraph" w:customStyle="1" w:styleId="123F6B8F2A3C8842996EB3D7FEA31184">
-    <w:name w:val="123F6B8F2A3C8842996EB3D7FEA31184"/>
-    <w:rsid w:val="00F63671"/>
-  </w:style>
   <w:style w:type="paragraph" w:customStyle="1" w:styleId="B7BAFC62A30A1E4D9AAE873ECE6406BF">
     <w:name w:val="B7BAFC62A30A1E4D9AAE873ECE6406BF"/>
     <w:rsid w:val="00F63671"/>
@@ -3733,40 +5145,8 @@
       <w:b w:val="0"/>
       <w:i w:val="0"/>
       <w:iCs/>
-      <w:color w:val="4F81BD" w:themeColor="accent1"/>
+      <w:color w:val="156082" w:themeColor="accent1"/>
     </w:rPr>
-  </w:style>
-  <w:style w:type="paragraph" w:customStyle="1" w:styleId="EB589FE43EA8A84EBC57959AFA327877">
-    <w:name w:val="EB589FE43EA8A84EBC57959AFA327877"/>
-    <w:rsid w:val="00F63671"/>
-  </w:style>
-  <w:style w:type="paragraph" w:customStyle="1" w:styleId="19691559D532374E9AEA3236A6AA6B4D">
-    <w:name w:val="19691559D532374E9AEA3236A6AA6B4D"/>
-    <w:rsid w:val="00F63671"/>
-  </w:style>
-  <w:style w:type="paragraph" w:customStyle="1" w:styleId="D087AFBBC594E745B552E089ACAE60DE">
-    <w:name w:val="D087AFBBC594E745B552E089ACAE60DE"/>
-    <w:rsid w:val="00F63671"/>
-  </w:style>
-  <w:style w:type="paragraph" w:customStyle="1" w:styleId="A2D3C36A76673E4A9FB18F9559AA5A40">
-    <w:name w:val="A2D3C36A76673E4A9FB18F9559AA5A40"/>
-    <w:rsid w:val="00F63671"/>
-  </w:style>
-  <w:style w:type="paragraph" w:customStyle="1" w:styleId="CF78B416008E1443B3DB9C329DA43140">
-    <w:name w:val="CF78B416008E1443B3DB9C329DA43140"/>
-    <w:rsid w:val="00F63671"/>
-  </w:style>
-  <w:style w:type="paragraph" w:customStyle="1" w:styleId="94E730CBFBEDF84196877A339F3B6661">
-    <w:name w:val="94E730CBFBEDF84196877A339F3B6661"/>
-    <w:rsid w:val="00F63671"/>
-  </w:style>
-  <w:style w:type="paragraph" w:customStyle="1" w:styleId="06EC0A8ADBDAB84F8E3D94E9EC2587E7">
-    <w:name w:val="06EC0A8ADBDAB84F8E3D94E9EC2587E7"/>
-    <w:rsid w:val="00F63671"/>
-  </w:style>
-  <w:style w:type="paragraph" w:customStyle="1" w:styleId="06269992168BFB4792105EF2B2AD80CD">
-    <w:name w:val="06269992168BFB4792105EF2B2AD80CD"/>
-    <w:rsid w:val="00F63671"/>
   </w:style>
   <w:style w:type="paragraph" w:styleId="ListBullet">
     <w:name w:val="List Bullet"/>
@@ -3784,52 +5164,16 @@
     <w:rPr>
       <w:rFonts w:eastAsiaTheme="minorHAnsi"/>
       <w:i/>
-      <w:color w:val="3071C3" w:themeColor="text2" w:themeTint="BF"/>
+      <w:color w:val="215E99" w:themeColor="text2" w:themeTint="BF"/>
       <w:szCs w:val="20"/>
       <w:lang w:val="en-US" w:eastAsia="ja-JP"/>
     </w:rPr>
-  </w:style>
-  <w:style w:type="paragraph" w:customStyle="1" w:styleId="4D942F08D1EFBF49A4BF4996C6BEDA51">
-    <w:name w:val="4D942F08D1EFBF49A4BF4996C6BEDA51"/>
-    <w:rsid w:val="00F63671"/>
-  </w:style>
-  <w:style w:type="paragraph" w:customStyle="1" w:styleId="21D75DAC85C69241872B7466B85B5B93">
-    <w:name w:val="21D75DAC85C69241872B7466B85B5B93"/>
-    <w:rsid w:val="00F63671"/>
-  </w:style>
-  <w:style w:type="paragraph" w:customStyle="1" w:styleId="BE1B1A8653D308428878F787D914501D">
-    <w:name w:val="BE1B1A8653D308428878F787D914501D"/>
-    <w:rsid w:val="00F63671"/>
-  </w:style>
-  <w:style w:type="paragraph" w:customStyle="1" w:styleId="4CB9DEC8C2F8FA4B8AE5E3D13737FFF4">
-    <w:name w:val="4CB9DEC8C2F8FA4B8AE5E3D13737FFF4"/>
-    <w:rsid w:val="00F63671"/>
-  </w:style>
-  <w:style w:type="paragraph" w:customStyle="1" w:styleId="7F44A4FF51D7054199178C1A56C7C382">
-    <w:name w:val="7F44A4FF51D7054199178C1A56C7C382"/>
-    <w:rsid w:val="00F63671"/>
-  </w:style>
-  <w:style w:type="paragraph" w:customStyle="1" w:styleId="C3615354808DD84F99E381E2CA113016">
-    <w:name w:val="C3615354808DD84F99E381E2CA113016"/>
-    <w:rsid w:val="00F63671"/>
-  </w:style>
-  <w:style w:type="paragraph" w:customStyle="1" w:styleId="22F362CFFD58C945A8940C2854ECB12F">
-    <w:name w:val="22F362CFFD58C945A8940C2854ECB12F"/>
-    <w:rsid w:val="00F63671"/>
-  </w:style>
-  <w:style w:type="paragraph" w:customStyle="1" w:styleId="6B3A8B5B5CEE6645BE02D12A7E31CD2C">
-    <w:name w:val="6B3A8B5B5CEE6645BE02D12A7E31CD2C"/>
-    <w:rsid w:val="00F63671"/>
-  </w:style>
-  <w:style w:type="paragraph" w:customStyle="1" w:styleId="467D465CD26FEB41B94D05CC4CCBF8F6">
-    <w:name w:val="467D465CD26FEB41B94D05CC4CCBF8F6"/>
-    <w:rsid w:val="00F63671"/>
   </w:style>
 </w:styles>
 </file>
 
 <file path=word/glossary/webSettings.xml><?xml version="1.0" encoding="utf-8"?>
-<w:webSettings xmlns:r="http://schemas.openxmlformats.org/officeDocument/2006/relationships" xmlns:w="http://schemas.openxmlformats.org/wordprocessingml/2006/main">
+<w:webSettings xmlns:mc="http://schemas.openxmlformats.org/markup-compatibility/2006" xmlns:r="http://schemas.openxmlformats.org/officeDocument/2006/relationships" xmlns:w="http://schemas.openxmlformats.org/wordprocessingml/2006/main" xmlns:w14="http://schemas.microsoft.com/office/word/2010/wordml" xmlns:w15="http://schemas.microsoft.com/office/word/2012/wordml" xmlns:w16cex="http://schemas.microsoft.com/office/word/2018/wordml/cex" xmlns:w16cid="http://schemas.microsoft.com/office/word/2016/wordml/cid" xmlns:w16="http://schemas.microsoft.com/office/word/2018/wordml" xmlns:w16du="http://schemas.microsoft.com/office/word/2023/wordml/word16du" xmlns:w16sdtdh="http://schemas.microsoft.com/office/word/2020/wordml/sdtdatahash" xmlns:w16sdtfl="http://schemas.microsoft.com/office/word/2024/wordml/sdtformatlock" xmlns:w16se="http://schemas.microsoft.com/office/word/2015/wordml/symex" mc:Ignorable="w14 w15 w16se w16cid w16 w16cex w16sdtdh w16sdtfl w16du">
   <w:optimizeForBrowser/>
   <w:allowPNG/>
 </w:webSettings>
@@ -4090,13 +5434,17 @@
   <a:extraClrSchemeLst/>
   <a:extLst>
     <a:ext uri="{05A4C25C-085E-4340-85A3-A5531E510DB2}">
-      <thm15:themeFamily xmlns:thm15="http://schemas.microsoft.com/office/thememl/2012/main" xmlns="" name="Office Theme" id="{62F939B6-93AF-4DB8-9C6B-D6C7DFDC589F}" vid="{4A3C46E8-61CC-4603-A589-7422A47A8E4A}"/>
+      <thm15:themeFamily xmlns:thm15="http://schemas.microsoft.com/office/thememl/2012/main" name="Office Theme" id="{62F939B6-93AF-4DB8-9C6B-D6C7DFDC589F}" vid="{4A3C46E8-61CC-4603-A589-7422A47A8E4A}"/>
     </a:ext>
   </a:extLst>
 </a:theme>
 </file>
 
 <file path=customXml/item1.xml><?xml version="1.0" encoding="utf-8"?>
+<b:Sources xmlns:b="http://schemas.openxmlformats.org/officeDocument/2006/bibliography" xmlns="http://schemas.openxmlformats.org/officeDocument/2006/bibliography" SelectedStyle="\apasixtheditionofficeonline.xsl" StyleName="APA" Version="6"/>
+</file>
+
+<file path=customXml/item2.xml><?xml version="1.0" encoding="utf-8"?>
 <?mso-contentType ?>
 <FormTemplates xmlns="http://schemas.microsoft.com/sharepoint/v3/contenttype/forms">
   <Display>DocumentLibraryForm</Display>
@@ -4105,211 +5453,7 @@
 </FormTemplates>
 </file>
 
-<file path=customXml/item2.xml><?xml version="1.0" encoding="utf-8"?>
-<b:Sources xmlns:b="http://schemas.openxmlformats.org/officeDocument/2006/bibliography" xmlns="http://schemas.openxmlformats.org/officeDocument/2006/bibliography" SelectedStyle="\apasixtheditionofficeonline.xsl" StyleName="APA" Version="6"/>
-</file>
-
 <file path=customXml/item3.xml><?xml version="1.0" encoding="utf-8"?>
-<p:properties xmlns:p="http://schemas.microsoft.com/office/2006/metadata/properties" xmlns:xsi="http://www.w3.org/2001/XMLSchema-instance" xmlns:pc="http://schemas.microsoft.com/office/infopath/2007/PartnerControls">
-  <documentManagement>
-    <SharedWithDetails xmlns="f2ac1b4d-83fc-4cb3-b151-4d3c9cb2ec7e">{}</SharedWithDetails>
-    <SharedWithUsers xmlns="f2ac1b4d-83fc-4cb3-b151-4d3c9cb2ec7e">
-      <UserInfo>
-        <DisplayName/>
-        <AccountId xsi:nil="true"/>
-        <AccountType/>
-      </UserInfo>
-    </SharedWithUsers>
-    <TaxCatchAll xmlns="f2ac1b4d-83fc-4cb3-b151-4d3c9cb2ec7e" xsi:nil="true"/>
-    <_Flow_SignoffStatus xmlns="da2c63ee-a697-4dd7-a0ef-49cae2590798" xsi:nil="true"/>
-    <Status xmlns="da2c63ee-a697-4dd7-a0ef-49cae2590798">Editing</Status>
-    <lcf76f155ced4ddcb4097134ff3c332f xmlns="da2c63ee-a697-4dd7-a0ef-49cae2590798">
-      <Terms xmlns="http://schemas.microsoft.com/office/infopath/2007/PartnerControls"/>
-    </lcf76f155ced4ddcb4097134ff3c332f>
-  </documentManagement>
-</p:properties>
-</file>
-
-<file path=customXml/item4.xml><?xml version="1.0" encoding="utf-8"?>
-<ct:contentTypeSchema xmlns:ct="http://schemas.microsoft.com/office/2006/metadata/contentType" xmlns:ma="http://schemas.microsoft.com/office/2006/metadata/properties/metaAttributes" ct:_="" ma:_="" ma:contentTypeName="Document" ma:contentTypeID="0x010100012E2E405031D74DB051ADDB3D34E572" ma:contentTypeVersion="5" ma:contentTypeDescription="Create a new document." ma:contentTypeScope="" ma:versionID="e0009f9404bcb9590f313d2c358460f1">
-  <xsd:schema xmlns:xsd="http://www.w3.org/2001/XMLSchema" xmlns:xs="http://www.w3.org/2001/XMLSchema" xmlns:p="http://schemas.microsoft.com/office/2006/metadata/properties" xmlns:ns2="498267d4-2a5a-4c72-99d3-cf7236a95ce8" targetNamespace="http://schemas.microsoft.com/office/2006/metadata/properties" ma:root="true" ma:fieldsID="06e76fce95f74677884cb27b0c6533f2" ns2:_="">
-    <xsd:import namespace="498267d4-2a5a-4c72-99d3-cf7236a95ce8"/>
-    <xsd:element name="properties">
-      <xsd:complexType>
-        <xsd:sequence>
-          <xsd:element name="documentManagement">
-            <xsd:complexType>
-              <xsd:all>
-                <xsd:element ref="ns2:_dlc_DocId" minOccurs="0"/>
-                <xsd:element ref="ns2:_dlc_DocIdUrl" minOccurs="0"/>
-                <xsd:element ref="ns2:_dlc_DocIdPersistId" minOccurs="0"/>
-                <xsd:element ref="ns2:SharedWithUsers" minOccurs="0"/>
-                <xsd:element ref="ns2:SharingHintHash" minOccurs="0"/>
-                <xsd:element ref="ns2:SharedWithDetails" minOccurs="0"/>
-              </xsd:all>
-            </xsd:complexType>
-          </xsd:element>
-        </xsd:sequence>
-      </xsd:complexType>
-    </xsd:element>
-  </xsd:schema>
-  <xsd:schema xmlns:xsd="http://www.w3.org/2001/XMLSchema" xmlns:xs="http://www.w3.org/2001/XMLSchema" xmlns:dms="http://schemas.microsoft.com/office/2006/documentManagement/types" xmlns:pc="http://schemas.microsoft.com/office/infopath/2007/PartnerControls" targetNamespace="498267d4-2a5a-4c72-99d3-cf7236a95ce8" elementFormDefault="qualified">
-    <xsd:import namespace="http://schemas.microsoft.com/office/2006/documentManagement/types"/>
-    <xsd:import namespace="http://schemas.microsoft.com/office/infopath/2007/PartnerControls"/>
-    <xsd:element name="_dlc_DocId" ma:index="8" nillable="true" ma:displayName="Document ID Value" ma:description="The value of the document ID assigned to this item." ma:internalName="_dlc_DocId" ma:readOnly="true">
-      <xsd:simpleType>
-        <xsd:restriction base="dms:Text"/>
-      </xsd:simpleType>
-    </xsd:element>
-    <xsd:element name="_dlc_DocIdUrl" ma:index="9" nillable="true" ma:displayName="Document ID" ma:description="Permanent link to this document." ma:hidden="true" ma:internalName="_dlc_DocIdUrl" ma:readOnly="true">
-      <xsd:complexType>
-        <xsd:complexContent>
-          <xsd:extension base="dms:URL">
-            <xsd:sequence>
-              <xsd:element name="Url" type="dms:ValidUrl" minOccurs="0" nillable="true"/>
-              <xsd:element name="Description" type="xsd:string" nillable="true"/>
-            </xsd:sequence>
-          </xsd:extension>
-        </xsd:complexContent>
-      </xsd:complexType>
-    </xsd:element>
-    <xsd:element name="_dlc_DocIdPersistId" ma:index="10" nillable="true" ma:displayName="Persist ID" ma:description="Keep ID on add." ma:hidden="true" ma:internalName="_dlc_DocIdPersistId" ma:readOnly="true">
-      <xsd:simpleType>
-        <xsd:restriction base="dms:Boolean"/>
-      </xsd:simpleType>
-    </xsd:element>
-    <xsd:element name="SharedWithUsers" ma:index="11" nillable="true" ma:displayName="Shared With" ma:internalName="SharedWithUsers" ma:readOnly="true">
-      <xsd:complexType>
-        <xsd:complexContent>
-          <xsd:extension base="dms:UserMulti">
-            <xsd:sequence>
-              <xsd:element name="UserInfo" minOccurs="0" maxOccurs="unbounded">
-                <xsd:complexType>
-                  <xsd:sequence>
-                    <xsd:element name="DisplayName" type="xsd:string" minOccurs="0"/>
-                    <xsd:element name="AccountId" type="dms:UserId" minOccurs="0" nillable="true"/>
-                    <xsd:element name="AccountType" type="xsd:string" minOccurs="0"/>
-                  </xsd:sequence>
-                </xsd:complexType>
-              </xsd:element>
-            </xsd:sequence>
-          </xsd:extension>
-        </xsd:complexContent>
-      </xsd:complexType>
-    </xsd:element>
-    <xsd:element name="SharingHintHash" ma:index="12" nillable="true" ma:displayName="Sharing Hint Hash" ma:internalName="SharingHintHash" ma:readOnly="true">
-      <xsd:simpleType>
-        <xsd:restriction base="dms:Text"/>
-      </xsd:simpleType>
-    </xsd:element>
-    <xsd:element name="SharedWithDetails" ma:index="13" nillable="true" ma:displayName="Shared With Details" ma:internalName="SharedWithDetails" ma:readOnly="true">
-      <xsd:simpleType>
-        <xsd:restriction base="dms:Note">
-          <xsd:maxLength value="255"/>
-        </xsd:restriction>
-      </xsd:simpleType>
-    </xsd:element>
-  </xsd:schema>
-  <xsd:schema xmlns="http://schemas.openxmlformats.org/package/2006/metadata/core-properties" xmlns:xsd="http://www.w3.org/2001/XMLSchema" xmlns:xsi="http://www.w3.org/2001/XMLSchema-instance" xmlns:dc="http://purl.org/dc/elements/1.1/" xmlns:dcterms="http://purl.org/dc/terms/" xmlns:odoc="http://schemas.microsoft.com/internal/obd" targetNamespace="http://schemas.openxmlformats.org/package/2006/metadata/core-properties" elementFormDefault="qualified" attributeFormDefault="unqualified" blockDefault="#all">
-    <xsd:import namespace="http://purl.org/dc/elements/1.1/" schemaLocation="http://dublincore.org/schemas/xmls/qdc/2003/04/02/dc.xsd"/>
-    <xsd:import namespace="http://purl.org/dc/terms/" schemaLocation="http://dublincore.org/schemas/xmls/qdc/2003/04/02/dcterms.xsd"/>
-    <xsd:element name="coreProperties" type="CT_coreProperties"/>
-    <xsd:complexType name="CT_coreProperties">
-      <xsd:all>
-        <xsd:element ref="dc:creator" minOccurs="0" maxOccurs="1"/>
-        <xsd:element ref="dcterms:created" minOccurs="0" maxOccurs="1"/>
-        <xsd:element ref="dc:identifier" minOccurs="0" maxOccurs="1"/>
-        <xsd:element name="contentType" minOccurs="0" maxOccurs="1" type="xsd:string" ma:index="0" ma:displayName="Content Type"/>
-        <xsd:element ref="dc:title" minOccurs="0" maxOccurs="1" ma:index="4" ma:displayName="Title"/>
-        <xsd:element ref="dc:subject" minOccurs="0" maxOccurs="1"/>
-        <xsd:element ref="dc:description" minOccurs="0" maxOccurs="1"/>
-        <xsd:element name="keywords" minOccurs="0" maxOccurs="1" type="xsd:string"/>
-        <xsd:element ref="dc:language" minOccurs="0" maxOccurs="1"/>
-        <xsd:element name="category" minOccurs="0" maxOccurs="1" type="xsd:string"/>
-        <xsd:element name="version" minOccurs="0" maxOccurs="1" type="xsd:string"/>
-        <xsd:element name="revision" minOccurs="0" maxOccurs="1" type="xsd:string">
-          <xsd:annotation>
-            <xsd:documentation>
-                        This value indicates the number of saves or revisions. The application is responsible for updating this value after each revision.
-                    </xsd:documentation>
-          </xsd:annotation>
-        </xsd:element>
-        <xsd:element name="lastModifiedBy" minOccurs="0" maxOccurs="1" type="xsd:string"/>
-        <xsd:element ref="dcterms:modified" minOccurs="0" maxOccurs="1"/>
-        <xsd:element name="contentStatus" minOccurs="0" maxOccurs="1" type="xsd:string"/>
-      </xsd:all>
-    </xsd:complexType>
-  </xsd:schema>
-  <xs:schema xmlns:pc="http://schemas.microsoft.com/office/infopath/2007/PartnerControls" xmlns:xs="http://www.w3.org/2001/XMLSchema" targetNamespace="http://schemas.microsoft.com/office/infopath/2007/PartnerControls" elementFormDefault="qualified" attributeFormDefault="unqualified">
-    <xs:element name="Person">
-      <xs:complexType>
-        <xs:sequence>
-          <xs:element ref="pc:DisplayName" minOccurs="0"/>
-          <xs:element ref="pc:AccountId" minOccurs="0"/>
-          <xs:element ref="pc:AccountType" minOccurs="0"/>
-        </xs:sequence>
-      </xs:complexType>
-    </xs:element>
-    <xs:element name="DisplayName" type="xs:string"/>
-    <xs:element name="AccountId" type="xs:string"/>
-    <xs:element name="AccountType" type="xs:string"/>
-    <xs:element name="BDCAssociatedEntity">
-      <xs:complexType>
-        <xs:sequence>
-          <xs:element ref="pc:BDCEntity" minOccurs="0" maxOccurs="unbounded"/>
-        </xs:sequence>
-        <xs:attribute ref="pc:EntityNamespace"/>
-        <xs:attribute ref="pc:EntityName"/>
-        <xs:attribute ref="pc:SystemInstanceName"/>
-        <xs:attribute ref="pc:AssociationName"/>
-      </xs:complexType>
-    </xs:element>
-    <xs:attribute name="EntityNamespace" type="xs:string"/>
-    <xs:attribute name="EntityName" type="xs:string"/>
-    <xs:attribute name="SystemInstanceName" type="xs:string"/>
-    <xs:attribute name="AssociationName" type="xs:string"/>
-    <xs:element name="BDCEntity">
-      <xs:complexType>
-        <xs:sequence>
-          <xs:element ref="pc:EntityDisplayName" minOccurs="0"/>
-          <xs:element ref="pc:EntityInstanceReference" minOccurs="0"/>
-          <xs:element ref="pc:EntityId1" minOccurs="0"/>
-          <xs:element ref="pc:EntityId2" minOccurs="0"/>
-          <xs:element ref="pc:EntityId3" minOccurs="0"/>
-          <xs:element ref="pc:EntityId4" minOccurs="0"/>
-          <xs:element ref="pc:EntityId5" minOccurs="0"/>
-        </xs:sequence>
-      </xs:complexType>
-    </xs:element>
-    <xs:element name="EntityDisplayName" type="xs:string"/>
-    <xs:element name="EntityInstanceReference" type="xs:string"/>
-    <xs:element name="EntityId1" type="xs:string"/>
-    <xs:element name="EntityId2" type="xs:string"/>
-    <xs:element name="EntityId3" type="xs:string"/>
-    <xs:element name="EntityId4" type="xs:string"/>
-    <xs:element name="EntityId5" type="xs:string"/>
-    <xs:element name="Terms">
-      <xs:complexType>
-        <xs:sequence>
-          <xs:element ref="pc:TermInfo" minOccurs="0" maxOccurs="unbounded"/>
-        </xs:sequence>
-      </xs:complexType>
-    </xs:element>
-    <xs:element name="TermInfo">
-      <xs:complexType>
-        <xs:sequence>
-          <xs:element ref="pc:TermName" minOccurs="0"/>
-          <xs:element ref="pc:TermId" minOccurs="0"/>
-        </xs:sequence>
-      </xs:complexType>
-    </xs:element>
-    <xs:element name="TermName" type="xs:string"/>
-    <xs:element name="TermId" type="xs:string"/>
-  </xs:schema>
-</ct:contentTypeSchema>
-</file>
-
-<file path=customXml/item5.xml><?xml version="1.0" encoding="utf-8"?>
 <ct:contentTypeSchema xmlns:ct="http://schemas.microsoft.com/office/2006/metadata/contentType" xmlns:ma="http://schemas.microsoft.com/office/2006/metadata/properties/metaAttributes" ct:_="" ma:_="" ma:contentTypeName="Document" ma:contentTypeID="0x0101007C216C6EE36E914196E3C806C90482CC" ma:contentTypeVersion="21" ma:contentTypeDescription="Create a new document." ma:contentTypeScope="" ma:versionID="b0c2cabde4032ae2fa9305e3782be18a">
   <xsd:schema xmlns:xsd="http://www.w3.org/2001/XMLSchema" xmlns:xs="http://www.w3.org/2001/XMLSchema" xmlns:p="http://schemas.microsoft.com/office/2006/metadata/properties" xmlns:ns2="da2c63ee-a697-4dd7-a0ef-49cae2590798" xmlns:ns3="f2ac1b4d-83fc-4cb3-b151-4d3c9cb2ec7e" targetNamespace="http://schemas.microsoft.com/office/2006/metadata/properties" ma:root="true" ma:fieldsID="f625df4330937b41fd72c3d2d1434806" ns2:_="" ns3:_="">
     <xsd:import namespace="da2c63ee-a697-4dd7-a0ef-49cae2590798"/>
@@ -4586,7 +5730,36 @@
 </ct:contentTypeSchema>
 </file>
 
+<file path=customXml/item4.xml><?xml version="1.0" encoding="utf-8"?>
+<p:properties xmlns:p="http://schemas.microsoft.com/office/2006/metadata/properties" xmlns:xsi="http://www.w3.org/2001/XMLSchema-instance" xmlns:pc="http://schemas.microsoft.com/office/infopath/2007/PartnerControls">
+  <documentManagement>
+    <SharedWithDetails xmlns="f2ac1b4d-83fc-4cb3-b151-4d3c9cb2ec7e">{}</SharedWithDetails>
+    <SharedWithUsers xmlns="f2ac1b4d-83fc-4cb3-b151-4d3c9cb2ec7e">
+      <UserInfo>
+        <DisplayName/>
+        <AccountId xsi:nil="true"/>
+        <AccountType/>
+      </UserInfo>
+    </SharedWithUsers>
+    <TaxCatchAll xmlns="f2ac1b4d-83fc-4cb3-b151-4d3c9cb2ec7e" xsi:nil="true"/>
+    <_Flow_SignoffStatus xmlns="da2c63ee-a697-4dd7-a0ef-49cae2590798" xsi:nil="true"/>
+    <Status xmlns="da2c63ee-a697-4dd7-a0ef-49cae2590798">Editing</Status>
+    <lcf76f155ced4ddcb4097134ff3c332f xmlns="da2c63ee-a697-4dd7-a0ef-49cae2590798">
+      <Terms xmlns="http://schemas.microsoft.com/office/infopath/2007/PartnerControls"/>
+    </lcf76f155ced4ddcb4097134ff3c332f>
+  </documentManagement>
+</p:properties>
+</file>
+
 <file path=customXml/itemProps1.xml><?xml version="1.0" encoding="utf-8"?>
+<ds:datastoreItem xmlns:ds="http://schemas.openxmlformats.org/officeDocument/2006/customXml" ds:itemID="{57B539C9-F23F-498D-8FB5-26EC05F8DFD4}">
+  <ds:schemaRefs>
+    <ds:schemaRef ds:uri="http://schemas.openxmlformats.org/officeDocument/2006/bibliography"/>
+  </ds:schemaRefs>
+</ds:datastoreItem>
+</file>
+
+<file path=customXml/itemProps2.xml><?xml version="1.0" encoding="utf-8"?>
 <ds:datastoreItem xmlns:ds="http://schemas.openxmlformats.org/officeDocument/2006/customXml" ds:itemID="{B79E6113-9D61-48C6-AB23-FE0124366565}">
   <ds:schemaRefs>
     <ds:schemaRef ds:uri="http://schemas.microsoft.com/sharepoint/v3/contenttype/forms"/>
@@ -4594,32 +5767,15 @@
 </ds:datastoreItem>
 </file>
 
-<file path=customXml/itemProps2.xml><?xml version="1.0" encoding="utf-8"?>
-<ds:datastoreItem xmlns:ds="http://schemas.openxmlformats.org/officeDocument/2006/customXml" ds:itemID="{57B539C9-F23F-498D-8FB5-26EC05F8DFD4}">
-  <ds:schemaRefs>
-    <ds:schemaRef ds:uri="http://schemas.openxmlformats.org/officeDocument/2006/bibliography"/>
-  </ds:schemaRefs>
-</ds:datastoreItem>
-</file>
-
 <file path=customXml/itemProps3.xml><?xml version="1.0" encoding="utf-8"?>
-<ds:datastoreItem xmlns:ds="http://schemas.openxmlformats.org/officeDocument/2006/customXml" ds:itemID="{4A3CED26-0910-4819-874B-D8E2CCD421FE}">
-  <ds:schemaRefs>
-    <ds:schemaRef ds:uri="http://schemas.microsoft.com/office/2006/metadata/properties"/>
-    <ds:schemaRef ds:uri="http://schemas.microsoft.com/office/infopath/2007/PartnerControls"/>
-    <ds:schemaRef ds:uri="498267d4-2a5a-4c72-99d3-cf7236a95ce8"/>
-  </ds:schemaRefs>
-</ds:datastoreItem>
-</file>
-
-<file path=customXml/itemProps4.xml><?xml version="1.0" encoding="utf-8"?>
-<ds:datastoreItem xmlns:ds="http://schemas.openxmlformats.org/officeDocument/2006/customXml" ds:itemID="{400DB6FE-DF17-4741-ACCE-BDED9F9E13D9}">
+<ds:datastoreItem xmlns:ds="http://schemas.openxmlformats.org/officeDocument/2006/customXml" ds:itemID="{B3B70C79-59DC-43CE-A082-2D2904C66C1F}">
   <ds:schemaRefs>
     <ds:schemaRef ds:uri="http://schemas.microsoft.com/office/2006/metadata/contentType"/>
     <ds:schemaRef ds:uri="http://schemas.microsoft.com/office/2006/metadata/properties/metaAttributes"/>
     <ds:schemaRef ds:uri="http://www.w3.org/2001/XMLSchema"/>
     <ds:schemaRef ds:uri="http://schemas.microsoft.com/office/2006/metadata/properties"/>
-    <ds:schemaRef ds:uri="498267d4-2a5a-4c72-99d3-cf7236a95ce8"/>
+    <ds:schemaRef ds:uri="da2c63ee-a697-4dd7-a0ef-49cae2590798"/>
+    <ds:schemaRef ds:uri="f2ac1b4d-83fc-4cb3-b151-4d3c9cb2ec7e"/>
     <ds:schemaRef ds:uri="http://schemas.microsoft.com/office/2006/documentManagement/types"/>
     <ds:schemaRef ds:uri="http://schemas.microsoft.com/office/infopath/2007/PartnerControls"/>
     <ds:schemaRef ds:uri="http://schemas.openxmlformats.org/package/2006/metadata/core-properties"/>
@@ -4630,6 +5786,13 @@
 </ds:datastoreItem>
 </file>
 
-<file path=customXml/itemProps5.xml><?xml version="1.0" encoding="utf-8"?>
-<ds:datastoreItem xmlns:ds="http://schemas.openxmlformats.org/officeDocument/2006/customXml" ds:itemID="{B3B70C79-59DC-43CE-A082-2D2904C66C1F}"/>
+<file path=customXml/itemProps4.xml><?xml version="1.0" encoding="utf-8"?>
+<ds:datastoreItem xmlns:ds="http://schemas.openxmlformats.org/officeDocument/2006/customXml" ds:itemID="{4A3CED26-0910-4819-874B-D8E2CCD421FE}">
+  <ds:schemaRefs>
+    <ds:schemaRef ds:uri="http://schemas.microsoft.com/office/2006/metadata/properties"/>
+    <ds:schemaRef ds:uri="http://schemas.microsoft.com/office/infopath/2007/PartnerControls"/>
+    <ds:schemaRef ds:uri="f2ac1b4d-83fc-4cb3-b151-4d3c9cb2ec7e"/>
+    <ds:schemaRef ds:uri="da2c63ee-a697-4dd7-a0ef-49cae2590798"/>
+  </ds:schemaRefs>
+</ds:datastoreItem>
 </file>
</xml_diff>